<commit_message>
docs: updated authority manager doc
</commit_message>
<xml_diff>
--- a/docs/AI-Role-Specification/Authority_Manager_Agent_Specification.docx
+++ b/docs/AI-Role-Specification/Authority_Manager_Agent_Specification.docx
@@ -425,7 +425,7 @@
         <w:t>2. Role Definition</w:t>
       </w:r>
     </w:p>
-    <w:p xmlns:wp14="http://schemas.microsoft.com/office/word/2010/wordml" wp14:paraId="7EAEFAE4" wp14:textId="67F09405">
+    <w:p xmlns:wp14="http://schemas.microsoft.com/office/word/2010/wordml" wp14:paraId="7EAEFAE4" wp14:textId="6391E0A6">
       <w:pPr>
         <w:pStyle w:val="Normal"/>
         <w:spacing w:before="240" w:beforeAutospacing="off" w:after="240" w:afterAutospacing="off"/>
@@ -470,7 +470,18 @@
           <w:szCs w:val="24"/>
           <w:lang w:val="en-US"/>
         </w:rPr>
-        <w:t>ApsisVR’s</w:t>
+        <w:t>Viri</w:t>
+      </w:r>
+      <w:r>
+        <w:rPr>
+          <w:rFonts w:ascii="Aptos" w:hAnsi="Aptos" w:eastAsia="Aptos" w:cs="Aptos"/>
+          <w:noProof w:val="0"/>
+          <w:color w:val="000000" w:themeColor="text1" w:themeTint="FF" w:themeShade="FF"/>
+          <w:sz w:val="24"/>
+          <w:szCs w:val="24"/>
+          <w:lang w:val="en-US"/>
+        </w:rPr>
+        <w:t>VR’s</w:t>
       </w:r>
       <w:r>
         <w:rPr>
@@ -536,7 +547,18 @@
           <w:szCs w:val="24"/>
           <w:lang w:val="en-US"/>
         </w:rPr>
-        <w:t>ApsisVR’s</w:t>
+        <w:t>Viri</w:t>
+      </w:r>
+      <w:r>
+        <w:rPr>
+          <w:rFonts w:ascii="Aptos" w:hAnsi="Aptos" w:eastAsia="Aptos" w:cs="Aptos"/>
+          <w:noProof w:val="0"/>
+          <w:color w:val="000000" w:themeColor="text1" w:themeTint="FF" w:themeShade="FF"/>
+          <w:sz w:val="24"/>
+          <w:szCs w:val="24"/>
+          <w:lang w:val="en-US"/>
+        </w:rPr>
+        <w:t>VR’s</w:t>
       </w:r>
       <w:r>
         <w:rPr>
@@ -612,8 +634,9 @@
         <w:t xml:space="preserve">The Authority Manager is a human role that is responsible for overseeing, managing and coordinating its AI agents; the Digital PR Specialist, the Backlink Auditor and the Brand Authority Builder. The Authority Manager will then review, escalate issues and exceptions, and where appropriate, approve completed deliverables generated by the AI agents. </w:t>
       </w:r>
     </w:p>
-    <w:p xmlns:wp14="http://schemas.microsoft.com/office/word/2010/wordml" wp14:paraId="61A4FA2D" wp14:textId="46CE0ECD">
-      <w:pPr>
+    <w:p xmlns:wp14="http://schemas.microsoft.com/office/word/2010/wordml" wp14:paraId="61A4FA2D" wp14:textId="08F9A612">
+      <w:pPr>
+        <w:pStyle w:val="Normal"/>
         <w:tabs>
           <w:tab w:val="left" w:leader="none" w:pos="7948"/>
         </w:tabs>
@@ -683,7 +706,7 @@
           <w:szCs w:val="24"/>
           <w:lang w:val="en-US"/>
         </w:rPr>
-        <w:t>ApsisVR</w:t>
+        <w:t>ViriVR</w:t>
       </w:r>
       <w:r>
         <w:rPr>
@@ -749,18 +772,29 @@
           <w:szCs w:val="24"/>
           <w:lang w:val="en-US"/>
         </w:rPr>
-        <w:t>ApsisVR’s</w:t>
-      </w:r>
-      <w:r>
-        <w:rPr>
-          <w:rFonts w:ascii="Aptos" w:hAnsi="Aptos" w:eastAsia="Aptos" w:cs="Aptos"/>
-          <w:noProof w:val="0"/>
-          <w:color w:val="000000" w:themeColor="text1" w:themeTint="FF" w:themeShade="FF"/>
-          <w:sz w:val="24"/>
-          <w:szCs w:val="24"/>
-          <w:lang w:val="en-US"/>
-        </w:rPr>
-        <w:t xml:space="preserve"> visibility, credibility, brand </w:t>
+        <w:t>ViriVR’s</w:t>
+      </w:r>
+      <w:r>
+        <w:rPr>
+          <w:rFonts w:ascii="Aptos" w:hAnsi="Aptos" w:eastAsia="Aptos" w:cs="Aptos"/>
+          <w:noProof w:val="0"/>
+          <w:color w:val="000000" w:themeColor="text1" w:themeTint="FF" w:themeShade="FF"/>
+          <w:sz w:val="24"/>
+          <w:szCs w:val="24"/>
+          <w:lang w:val="en-US"/>
+        </w:rPr>
+        <w:t xml:space="preserve"> </w:t>
+      </w:r>
+      <w:r>
+        <w:rPr>
+          <w:rFonts w:ascii="Aptos" w:hAnsi="Aptos" w:eastAsia="Aptos" w:cs="Aptos"/>
+          <w:noProof w:val="0"/>
+          <w:color w:val="000000" w:themeColor="text1" w:themeTint="FF" w:themeShade="FF"/>
+          <w:sz w:val="24"/>
+          <w:szCs w:val="24"/>
+          <w:lang w:val="en-US"/>
+        </w:rPr>
+        <w:t xml:space="preserve">visibility, credibility, brand </w:t>
       </w:r>
       <w:r>
         <w:rPr>
@@ -1750,18 +1784,29 @@
             <w:r>
               <w:rPr>
                 <w:rFonts w:ascii="Aptos" w:hAnsi="Aptos" w:eastAsia="Aptos" w:cs="Aptos"/>
-                <w:sz w:val="24"/>
-                <w:szCs w:val="24"/>
-              </w:rPr>
-              <w:t>ApsisVR’s</w:t>
-            </w:r>
-            <w:r>
-              <w:rPr>
-                <w:rFonts w:ascii="Aptos" w:hAnsi="Aptos" w:eastAsia="Aptos" w:cs="Aptos"/>
-                <w:sz w:val="24"/>
-                <w:szCs w:val="24"/>
-              </w:rPr>
-              <w:t xml:space="preserve"> domain authority, </w:t>
+                <w:noProof w:val="0"/>
+                <w:color w:val="000000" w:themeColor="text1" w:themeTint="FF" w:themeShade="FF"/>
+                <w:sz w:val="24"/>
+                <w:szCs w:val="24"/>
+                <w:lang w:val="en-US"/>
+              </w:rPr>
+              <w:t>ViriVR</w:t>
+            </w:r>
+            <w:r>
+              <w:rPr>
+                <w:rFonts w:ascii="Aptos" w:hAnsi="Aptos" w:eastAsia="Aptos" w:cs="Aptos"/>
+                <w:sz w:val="24"/>
+                <w:szCs w:val="24"/>
+              </w:rPr>
+              <w:t xml:space="preserve">‘s </w:t>
+            </w:r>
+            <w:r>
+              <w:rPr>
+                <w:rFonts w:ascii="Aptos" w:hAnsi="Aptos" w:eastAsia="Aptos" w:cs="Aptos"/>
+                <w:sz w:val="24"/>
+                <w:szCs w:val="24"/>
+              </w:rPr>
+              <w:t xml:space="preserve">domain authority, </w:t>
             </w:r>
             <w:r>
               <w:rPr>
@@ -2474,6 +2519,7 @@
           </w:tcPr>
           <w:p>
             <w:pPr>
+              <w:pStyle w:val="Normal"/>
               <w:bidi w:val="0"/>
               <w:spacing w:before="0" w:beforeAutospacing="off" w:after="160" w:afterAutospacing="off" w:line="278" w:lineRule="auto"/>
             </w:pPr>
@@ -2488,18 +2534,37 @@
             <w:r>
               <w:rPr>
                 <w:rFonts w:ascii="Aptos" w:hAnsi="Aptos" w:eastAsia="Aptos" w:cs="Aptos"/>
-                <w:sz w:val="24"/>
-                <w:szCs w:val="24"/>
-              </w:rPr>
-              <w:t>ApsisVR’s</w:t>
-            </w:r>
-            <w:r>
-              <w:rPr>
-                <w:rFonts w:ascii="Aptos" w:hAnsi="Aptos" w:eastAsia="Aptos" w:cs="Aptos"/>
-                <w:sz w:val="24"/>
-                <w:szCs w:val="24"/>
-              </w:rPr>
-              <w:t xml:space="preserve"> strategic goals and wider business and marketing objectives. They must be able to develop and identify </w:t>
+                <w:noProof w:val="0"/>
+                <w:color w:val="000000" w:themeColor="text1" w:themeTint="FF" w:themeShade="FF"/>
+                <w:sz w:val="24"/>
+                <w:szCs w:val="24"/>
+                <w:lang w:val="en-US"/>
+              </w:rPr>
+              <w:t xml:space="preserve">ViriVR’s </w:t>
+            </w:r>
+            <w:r>
+              <w:rPr>
+                <w:rFonts w:ascii="Aptos" w:hAnsi="Aptos" w:eastAsia="Aptos" w:cs="Aptos"/>
+                <w:sz w:val="24"/>
+                <w:szCs w:val="24"/>
+              </w:rPr>
+              <w:t xml:space="preserve">strategic goals and wider business and marketing </w:t>
+            </w:r>
+            <w:r>
+              <w:rPr>
+                <w:rFonts w:ascii="Aptos" w:hAnsi="Aptos" w:eastAsia="Aptos" w:cs="Aptos"/>
+                <w:sz w:val="24"/>
+                <w:szCs w:val="24"/>
+              </w:rPr>
+              <w:t>objectives</w:t>
+            </w:r>
+            <w:r>
+              <w:rPr>
+                <w:rFonts w:ascii="Aptos" w:hAnsi="Aptos" w:eastAsia="Aptos" w:cs="Aptos"/>
+                <w:sz w:val="24"/>
+                <w:szCs w:val="24"/>
+              </w:rPr>
+              <w:t xml:space="preserve">. They must be able to develop and identify </w:t>
             </w:r>
             <w:r>
               <w:rPr>
@@ -2531,7 +2596,23 @@
                 <w:sz w:val="24"/>
                 <w:szCs w:val="24"/>
               </w:rPr>
-              <w:t xml:space="preserve"> which outputs will improve the businesses domain authority and digital brand presence.</w:t>
+              <w:t xml:space="preserve"> which outputs will improve the </w:t>
+            </w:r>
+            <w:r>
+              <w:rPr>
+                <w:rFonts w:ascii="Aptos" w:hAnsi="Aptos" w:eastAsia="Aptos" w:cs="Aptos"/>
+                <w:sz w:val="24"/>
+                <w:szCs w:val="24"/>
+              </w:rPr>
+              <w:t>businesses</w:t>
+            </w:r>
+            <w:r>
+              <w:rPr>
+                <w:rFonts w:ascii="Aptos" w:hAnsi="Aptos" w:eastAsia="Aptos" w:cs="Aptos"/>
+                <w:sz w:val="24"/>
+                <w:szCs w:val="24"/>
+              </w:rPr>
+              <w:t xml:space="preserve"> domain authority and digital brand presence.</w:t>
             </w:r>
           </w:p>
         </w:tc>
@@ -3791,7 +3872,7 @@
         <w:t xml:space="preserve"> the Authority Manager’s approval or attention.</w:t>
       </w:r>
     </w:p>
-    <w:p xmlns:wp14="http://schemas.microsoft.com/office/word/2010/wordml" wp14:paraId="541BCD21" wp14:textId="6BF8C759">
+    <w:p xmlns:wp14="http://schemas.microsoft.com/office/word/2010/wordml" wp14:paraId="541BCD21" wp14:textId="67807E1A">
       <w:pPr>
         <w:pStyle w:val="Normal"/>
         <w:keepNext w:val="1"/>
@@ -3974,15 +4055,13 @@
       <w:r>
         <w:rPr>
           <w:rFonts w:ascii="Aptos" w:hAnsi="Aptos" w:eastAsia="Aptos" w:cs="Aptos"/>
-          <w:b w:val="0"/>
-          <w:bCs w:val="0"/>
-          <w:noProof w:val="0"/>
-          <w:color w:val="000000" w:themeColor="text1" w:themeTint="FF" w:themeShade="FF"/>
-          <w:sz w:val="24"/>
-          <w:szCs w:val="24"/>
-          <w:lang w:val="en-US"/>
-        </w:rPr>
-        <w:t>ApsisVR</w:t>
+          <w:noProof w:val="0"/>
+          <w:color w:val="000000" w:themeColor="text1" w:themeTint="FF" w:themeShade="FF"/>
+          <w:sz w:val="24"/>
+          <w:szCs w:val="24"/>
+          <w:lang w:val="en-US"/>
+        </w:rPr>
+        <w:t>ViriVR</w:t>
       </w:r>
       <w:r>
         <w:rPr>
@@ -4363,6 +4442,7 @@
           </w:tcPr>
           <w:p>
             <w:pPr>
+              <w:pStyle w:val="Normal"/>
               <w:bidi w:val="0"/>
             </w:pPr>
             <w:r>
@@ -4380,6 +4460,17 @@
             <w:r>
               <w:rPr>
                 <w:rFonts w:ascii="Aptos" w:hAnsi="Aptos" w:eastAsia="Aptos" w:cs="Aptos"/>
+                <w:noProof w:val="0"/>
+                <w:color w:val="000000" w:themeColor="text1" w:themeTint="FF" w:themeShade="FF"/>
+                <w:sz w:val="24"/>
+                <w:szCs w:val="24"/>
+                <w:lang w:val="en-US"/>
+              </w:rPr>
+              <w:t xml:space="preserve">ViriVR’s </w:t>
+            </w:r>
+            <w:r>
+              <w:rPr>
+                <w:rFonts w:ascii="Aptos" w:hAnsi="Aptos" w:eastAsia="Aptos" w:cs="Aptos"/>
                 <w:b w:val="0"/>
                 <w:bCs w:val="0"/>
                 <w:i w:val="0"/>
@@ -4387,19 +4478,7 @@
                 <w:sz w:val="24"/>
                 <w:szCs w:val="24"/>
               </w:rPr>
-              <w:t>ApsisVR’s</w:t>
-            </w:r>
-            <w:r>
-              <w:rPr>
-                <w:rFonts w:ascii="Aptos" w:hAnsi="Aptos" w:eastAsia="Aptos" w:cs="Aptos"/>
-                <w:b w:val="0"/>
-                <w:bCs w:val="0"/>
-                <w:i w:val="0"/>
-                <w:iCs w:val="0"/>
-                <w:sz w:val="24"/>
-                <w:szCs w:val="24"/>
-              </w:rPr>
-              <w:t xml:space="preserve"> website traffic, </w:t>
+              <w:t xml:space="preserve">website traffic, </w:t>
             </w:r>
             <w:r>
               <w:rPr>
@@ -4606,6 +4685,17 @@
             <w:r>
               <w:rPr>
                 <w:rFonts w:ascii="Aptos" w:hAnsi="Aptos" w:eastAsia="Aptos" w:cs="Aptos"/>
+                <w:noProof w:val="0"/>
+                <w:color w:val="000000" w:themeColor="text1" w:themeTint="FF" w:themeShade="FF"/>
+                <w:sz w:val="24"/>
+                <w:szCs w:val="24"/>
+                <w:lang w:val="en-US"/>
+              </w:rPr>
+              <w:t xml:space="preserve">ViriVR’s </w:t>
+            </w:r>
+            <w:r>
+              <w:rPr>
+                <w:rFonts w:ascii="Aptos" w:hAnsi="Aptos" w:eastAsia="Aptos" w:cs="Aptos"/>
                 <w:b w:val="0"/>
                 <w:bCs w:val="0"/>
                 <w:i w:val="0"/>
@@ -4613,19 +4703,7 @@
                 <w:sz w:val="24"/>
                 <w:szCs w:val="24"/>
               </w:rPr>
-              <w:t>ApsisVR’s</w:t>
-            </w:r>
-            <w:r>
-              <w:rPr>
-                <w:rFonts w:ascii="Aptos" w:hAnsi="Aptos" w:eastAsia="Aptos" w:cs="Aptos"/>
-                <w:b w:val="0"/>
-                <w:bCs w:val="0"/>
-                <w:i w:val="0"/>
-                <w:iCs w:val="0"/>
-                <w:sz w:val="24"/>
-                <w:szCs w:val="24"/>
-              </w:rPr>
-              <w:t xml:space="preserve"> backlinks and website authority.</w:t>
+              <w:t>backlinks and website authority.</w:t>
             </w:r>
           </w:p>
         </w:tc>
@@ -4691,13 +4769,15 @@
         </w:rPr>
       </w:pPr>
     </w:p>
-    <w:p xmlns:wp14="http://schemas.microsoft.com/office/word/2010/wordml" wp14:paraId="47A85BF3" wp14:textId="34F697F9">
+    <w:p xmlns:wp14="http://schemas.microsoft.com/office/word/2010/wordml" wp14:paraId="47A85BF3" wp14:textId="3CA9C0AD">
       <w:pPr>
         <w:pStyle w:val="Heading3"/>
         <w:keepNext w:val="1"/>
         <w:keepLines w:val="1"/>
         <w:bidi w:val="0"/>
         <w:spacing w:before="281" w:beforeAutospacing="off" w:after="281" w:afterAutospacing="off"/>
+      </w:pPr>
+      <w:r>
         <w:rPr>
           <w:rFonts w:ascii="Aptos" w:hAnsi="Aptos" w:eastAsia="Aptos" w:cs="Aptos"/>
           <w:b w:val="1"/>
@@ -4712,6 +4792,951 @@
           <w:szCs w:val="28"/>
           <w:lang w:val="en-US"/>
         </w:rPr>
+        <w:t xml:space="preserve">7. </w:t>
+      </w:r>
+      <w:r>
+        <w:rPr>
+          <w:rFonts w:ascii="Aptos" w:hAnsi="Aptos" w:eastAsia="Aptos" w:cs="Aptos"/>
+          <w:b w:val="1"/>
+          <w:bCs w:val="1"/>
+          <w:i w:val="0"/>
+          <w:iCs w:val="0"/>
+          <w:caps w:val="0"/>
+          <w:smallCaps w:val="0"/>
+          <w:noProof w:val="0"/>
+          <w:color w:val="0F4761" w:themeColor="accent1" w:themeTint="FF" w:themeShade="BF"/>
+          <w:sz w:val="28"/>
+          <w:szCs w:val="28"/>
+          <w:lang w:val="en-US"/>
+        </w:rPr>
+        <w:t>Constraints and Governance Requirements</w:t>
+      </w:r>
+    </w:p>
+    <w:p>
+      <w:pPr>
+        <w:pStyle w:val="Normal"/>
+        <w:keepNext w:val="1"/>
+        <w:keepLines w:val="1"/>
+        <w:bidi w:val="0"/>
+      </w:pPr>
+      <w:r>
+        <w:rPr>
+          <w:noProof w:val="0"/>
+          <w:lang w:val="en-US"/>
+        </w:rPr>
+        <w:t xml:space="preserve">*These will </w:t>
+      </w:r>
+      <w:r>
+        <w:rPr>
+          <w:noProof w:val="0"/>
+          <w:lang w:val="en-US"/>
+        </w:rPr>
+        <w:t>most likely be</w:t>
+      </w:r>
+      <w:r>
+        <w:rPr>
+          <w:noProof w:val="0"/>
+          <w:lang w:val="en-US"/>
+        </w:rPr>
+        <w:t xml:space="preserve"> subjected to changes in the future*</w:t>
+      </w:r>
+    </w:p>
+    <w:p>
+      <w:pPr>
+        <w:pStyle w:val="Normal"/>
+        <w:keepNext w:val="1"/>
+        <w:keepLines w:val="1"/>
+        <w:bidi w:val="0"/>
+        <w:rPr>
+          <w:noProof w:val="0"/>
+          <w:lang w:val="en-US"/>
+        </w:rPr>
+      </w:pPr>
+    </w:p>
+    <w:p>
+      <w:pPr>
+        <w:pStyle w:val="Normal"/>
+        <w:keepNext w:val="1"/>
+        <w:keepLines w:val="1"/>
+        <w:bidi w:val="0"/>
+        <w:ind w:firstLine="720"/>
+      </w:pPr>
+      <w:r>
+        <w:rPr>
+          <w:b w:val="1"/>
+          <w:bCs w:val="1"/>
+          <w:noProof w:val="0"/>
+          <w:lang w:val="en-US"/>
+        </w:rPr>
+        <w:t>Constraint</w:t>
+      </w:r>
+      <w:r>
+        <w:rPr>
+          <w:b w:val="1"/>
+          <w:bCs w:val="1"/>
+          <w:noProof w:val="0"/>
+          <w:lang w:val="en-US"/>
+        </w:rPr>
+        <w:t xml:space="preserve"> Requirements</w:t>
+      </w:r>
+      <w:r>
+        <w:rPr>
+          <w:b w:val="1"/>
+          <w:bCs w:val="1"/>
+          <w:noProof w:val="0"/>
+          <w:lang w:val="en-US"/>
+        </w:rPr>
+        <w:t>:</w:t>
+      </w:r>
+      <w:r>
+        <w:br/>
+      </w:r>
+      <w:r>
+        <w:rPr>
+          <w:noProof w:val="0"/>
+          <w:lang w:val="en-US"/>
+        </w:rPr>
+        <w:t xml:space="preserve">1. The agent must not create </w:t>
+      </w:r>
+      <w:r>
+        <w:rPr>
+          <w:noProof w:val="0"/>
+          <w:lang w:val="en-US"/>
+        </w:rPr>
+        <w:t>or</w:t>
+      </w:r>
+      <w:r>
+        <w:rPr>
+          <w:noProof w:val="0"/>
+          <w:lang w:val="en-US"/>
+        </w:rPr>
+        <w:t xml:space="preserve"> invent </w:t>
+      </w:r>
+      <w:r>
+        <w:rPr>
+          <w:noProof w:val="0"/>
+          <w:lang w:val="en-US"/>
+        </w:rPr>
+        <w:t xml:space="preserve">research, facts, evidence, KPI results </w:t>
+      </w:r>
+      <w:r>
+        <w:rPr>
+          <w:noProof w:val="0"/>
+          <w:lang w:val="en-US"/>
+        </w:rPr>
+        <w:t xml:space="preserve">or </w:t>
+      </w:r>
+      <w:r>
+        <w:rPr>
+          <w:noProof w:val="0"/>
+          <w:lang w:val="en-US"/>
+        </w:rPr>
+        <w:t xml:space="preserve">any information that </w:t>
+      </w:r>
+      <w:r>
+        <w:rPr>
+          <w:noProof w:val="0"/>
+          <w:lang w:val="en-US"/>
+        </w:rPr>
+        <w:t>hasn’t</w:t>
+      </w:r>
+      <w:r>
+        <w:rPr>
+          <w:noProof w:val="0"/>
+          <w:lang w:val="en-US"/>
+        </w:rPr>
+        <w:t xml:space="preserve"> been verified </w:t>
+      </w:r>
+      <w:r>
+        <w:rPr>
+          <w:noProof w:val="0"/>
+          <w:lang w:val="en-US"/>
+        </w:rPr>
+        <w:t xml:space="preserve">by approved sources or </w:t>
+      </w:r>
+      <w:r>
+        <w:rPr>
+          <w:noProof w:val="0"/>
+          <w:lang w:val="en-US"/>
+        </w:rPr>
+        <w:t>authorised</w:t>
+      </w:r>
+      <w:r>
+        <w:rPr>
+          <w:noProof w:val="0"/>
+          <w:lang w:val="en-US"/>
+        </w:rPr>
+        <w:t xml:space="preserve"> by the human Authority Manager. </w:t>
+      </w:r>
+    </w:p>
+    <w:p>
+      <w:pPr>
+        <w:pStyle w:val="Normal"/>
+        <w:keepNext w:val="1"/>
+        <w:keepLines w:val="1"/>
+        <w:bidi w:val="0"/>
+        <w:rPr>
+          <w:noProof w:val="0"/>
+          <w:lang w:val="en-US"/>
+        </w:rPr>
+      </w:pPr>
+      <w:r>
+        <w:rPr>
+          <w:noProof w:val="0"/>
+          <w:lang w:val="en-US"/>
+        </w:rPr>
+        <w:t xml:space="preserve">2. If there is any information that it </w:t>
+      </w:r>
+      <w:r>
+        <w:rPr>
+          <w:noProof w:val="0"/>
+          <w:lang w:val="en-US"/>
+        </w:rPr>
+        <w:t>doesn't</w:t>
+      </w:r>
+      <w:r>
+        <w:rPr>
+          <w:noProof w:val="0"/>
+          <w:lang w:val="en-US"/>
+        </w:rPr>
+        <w:t xml:space="preserve"> understand or needs clarification, it must i</w:t>
+      </w:r>
+      <w:r>
+        <w:rPr>
+          <w:noProof w:val="0"/>
+          <w:lang w:val="en-US"/>
+        </w:rPr>
+        <w:t xml:space="preserve">dentify </w:t>
+      </w:r>
+      <w:r>
+        <w:rPr>
+          <w:noProof w:val="0"/>
+          <w:lang w:val="en-US"/>
+        </w:rPr>
+        <w:t xml:space="preserve">and </w:t>
+      </w:r>
+      <w:r>
+        <w:rPr>
+          <w:noProof w:val="0"/>
+          <w:lang w:val="en-US"/>
+        </w:rPr>
+        <w:t>outline</w:t>
+      </w:r>
+      <w:r>
+        <w:rPr>
+          <w:noProof w:val="0"/>
+          <w:lang w:val="en-US"/>
+        </w:rPr>
+        <w:t xml:space="preserve"> the complication or issue so it can be </w:t>
+      </w:r>
+      <w:r>
+        <w:rPr>
+          <w:noProof w:val="0"/>
+          <w:lang w:val="en-US"/>
+        </w:rPr>
+        <w:t xml:space="preserve">given human approval and </w:t>
+      </w:r>
+      <w:r>
+        <w:rPr>
+          <w:noProof w:val="0"/>
+          <w:lang w:val="en-US"/>
+        </w:rPr>
+        <w:t>authorisation</w:t>
+      </w:r>
+      <w:r>
+        <w:rPr>
+          <w:noProof w:val="0"/>
+          <w:lang w:val="en-US"/>
+        </w:rPr>
+        <w:t xml:space="preserve">. </w:t>
+      </w:r>
+    </w:p>
+    <w:p>
+      <w:pPr>
+        <w:pStyle w:val="Normal"/>
+        <w:keepNext w:val="1"/>
+        <w:keepLines w:val="1"/>
+        <w:bidi w:val="0"/>
+        <w:rPr>
+          <w:noProof w:val="0"/>
+          <w:lang w:val="en-US"/>
+        </w:rPr>
+      </w:pPr>
+      <w:r>
+        <w:rPr>
+          <w:noProof w:val="0"/>
+          <w:lang w:val="en-US"/>
+        </w:rPr>
+        <w:t>3</w:t>
+      </w:r>
+      <w:r>
+        <w:rPr>
+          <w:noProof w:val="0"/>
+          <w:lang w:val="en-US"/>
+        </w:rPr>
+        <w:t xml:space="preserve">. </w:t>
+      </w:r>
+      <w:r>
+        <w:rPr>
+          <w:noProof w:val="0"/>
+          <w:lang w:val="en-US"/>
+        </w:rPr>
+        <w:t xml:space="preserve">The </w:t>
+      </w:r>
+      <w:r>
+        <w:rPr>
+          <w:noProof w:val="0"/>
+          <w:lang w:val="en-US"/>
+        </w:rPr>
+        <w:t xml:space="preserve">AI </w:t>
+      </w:r>
+      <w:r>
+        <w:rPr>
+          <w:noProof w:val="0"/>
+          <w:lang w:val="en-US"/>
+        </w:rPr>
+        <w:t>agent</w:t>
+      </w:r>
+      <w:r>
+        <w:rPr>
+          <w:noProof w:val="0"/>
+          <w:lang w:val="en-US"/>
+        </w:rPr>
+        <w:t xml:space="preserve"> will not bypass </w:t>
+      </w:r>
+      <w:r>
+        <w:rPr>
+          <w:noProof w:val="0"/>
+          <w:lang w:val="en-US"/>
+        </w:rPr>
+        <w:t xml:space="preserve">or override any </w:t>
+      </w:r>
+      <w:r>
+        <w:rPr>
+          <w:noProof w:val="0"/>
+          <w:lang w:val="en-US"/>
+        </w:rPr>
+        <w:t>areas that require human approval or sections that have been escalated</w:t>
+      </w:r>
+      <w:r>
+        <w:rPr>
+          <w:noProof w:val="0"/>
+          <w:lang w:val="en-US"/>
+        </w:rPr>
+        <w:t>.</w:t>
+      </w:r>
+    </w:p>
+    <w:p>
+      <w:pPr>
+        <w:pStyle w:val="Normal"/>
+        <w:keepNext w:val="1"/>
+        <w:keepLines w:val="1"/>
+        <w:bidi w:val="0"/>
+        <w:rPr>
+          <w:noProof w:val="0"/>
+          <w:lang w:val="en-US"/>
+        </w:rPr>
+      </w:pPr>
+      <w:r>
+        <w:rPr>
+          <w:noProof w:val="0"/>
+          <w:lang w:val="en-US"/>
+        </w:rPr>
+        <w:t>4</w:t>
+      </w:r>
+      <w:r>
+        <w:rPr>
+          <w:noProof w:val="0"/>
+          <w:lang w:val="en-US"/>
+        </w:rPr>
+        <w:t>.</w:t>
+      </w:r>
+      <w:r>
+        <w:rPr>
+          <w:noProof w:val="0"/>
+          <w:lang w:val="en-US"/>
+        </w:rPr>
+        <w:t xml:space="preserve"> </w:t>
+      </w:r>
+      <w:r>
+        <w:rPr>
+          <w:noProof w:val="0"/>
+          <w:lang w:val="en-US"/>
+        </w:rPr>
+        <w:t xml:space="preserve">It must remain in </w:t>
+      </w:r>
+      <w:r>
+        <w:rPr>
+          <w:noProof w:val="0"/>
+          <w:lang w:val="en-US"/>
+        </w:rPr>
+        <w:t>the defined</w:t>
+      </w:r>
+      <w:r>
+        <w:rPr>
+          <w:noProof w:val="0"/>
+          <w:lang w:val="en-US"/>
+        </w:rPr>
+        <w:t xml:space="preserve"> </w:t>
+      </w:r>
+      <w:r>
+        <w:rPr>
+          <w:noProof w:val="0"/>
+          <w:lang w:val="en-US"/>
+        </w:rPr>
+        <w:t xml:space="preserve">scope </w:t>
+      </w:r>
+      <w:r>
+        <w:rPr>
+          <w:noProof w:val="0"/>
+          <w:lang w:val="en-US"/>
+        </w:rPr>
+        <w:t>of</w:t>
+      </w:r>
+      <w:r>
+        <w:rPr>
+          <w:noProof w:val="0"/>
+          <w:lang w:val="en-US"/>
+        </w:rPr>
+        <w:t xml:space="preserve"> the Authority Manager and must not </w:t>
+      </w:r>
+      <w:r>
+        <w:rPr>
+          <w:noProof w:val="0"/>
+          <w:lang w:val="en-US"/>
+        </w:rPr>
+        <w:t xml:space="preserve">take on </w:t>
+      </w:r>
+      <w:r>
+        <w:rPr>
+          <w:noProof w:val="0"/>
+          <w:lang w:val="en-US"/>
+        </w:rPr>
+        <w:t xml:space="preserve">or assume the role </w:t>
+      </w:r>
+      <w:r>
+        <w:rPr>
+          <w:noProof w:val="0"/>
+          <w:lang w:val="en-US"/>
+        </w:rPr>
+        <w:t xml:space="preserve">or responsibilities </w:t>
+      </w:r>
+      <w:r>
+        <w:rPr>
+          <w:noProof w:val="0"/>
+          <w:lang w:val="en-US"/>
+        </w:rPr>
+        <w:t xml:space="preserve">of other </w:t>
+      </w:r>
+      <w:r>
+        <w:rPr>
+          <w:noProof w:val="0"/>
+          <w:lang w:val="en-US"/>
+        </w:rPr>
+        <w:t xml:space="preserve">AI </w:t>
+      </w:r>
+      <w:r>
+        <w:rPr>
+          <w:noProof w:val="0"/>
+          <w:lang w:val="en-US"/>
+        </w:rPr>
+        <w:t xml:space="preserve">agents. </w:t>
+      </w:r>
+      <w:r>
+        <w:br/>
+      </w:r>
+    </w:p>
+    <w:p>
+      <w:pPr>
+        <w:pStyle w:val="Normal"/>
+        <w:keepNext w:val="1"/>
+        <w:keepLines w:val="1"/>
+        <w:bidi w:val="0"/>
+        <w:ind w:firstLine="720"/>
+      </w:pPr>
+      <w:r>
+        <w:rPr>
+          <w:b w:val="1"/>
+          <w:bCs w:val="1"/>
+          <w:noProof w:val="0"/>
+          <w:lang w:val="en-US"/>
+        </w:rPr>
+        <w:t xml:space="preserve">Governance </w:t>
+      </w:r>
+      <w:r>
+        <w:rPr>
+          <w:b w:val="1"/>
+          <w:bCs w:val="1"/>
+          <w:noProof w:val="0"/>
+          <w:lang w:val="en-US"/>
+        </w:rPr>
+        <w:t>Requirement</w:t>
+      </w:r>
+      <w:r>
+        <w:rPr>
+          <w:b w:val="1"/>
+          <w:bCs w:val="1"/>
+          <w:noProof w:val="0"/>
+          <w:lang w:val="en-US"/>
+        </w:rPr>
+        <w:t>s</w:t>
+      </w:r>
+    </w:p>
+    <w:p>
+      <w:pPr>
+        <w:pStyle w:val="Normal"/>
+        <w:keepNext w:val="1"/>
+        <w:keepLines w:val="1"/>
+        <w:bidi w:val="0"/>
+        <w:rPr>
+          <w:noProof w:val="0"/>
+          <w:lang w:val="en-US"/>
+        </w:rPr>
+      </w:pPr>
+      <w:r>
+        <w:rPr>
+          <w:noProof w:val="0"/>
+          <w:lang w:val="en-US"/>
+        </w:rPr>
+        <w:t>1</w:t>
+      </w:r>
+      <w:r>
+        <w:rPr>
+          <w:noProof w:val="0"/>
+          <w:lang w:val="en-US"/>
+        </w:rPr>
+        <w:t xml:space="preserve">. </w:t>
+      </w:r>
+      <w:r>
+        <w:rPr>
+          <w:noProof w:val="0"/>
+          <w:lang w:val="en-US"/>
+        </w:rPr>
+        <w:t>A</w:t>
+      </w:r>
+      <w:r>
+        <w:rPr>
+          <w:noProof w:val="0"/>
+          <w:lang w:val="en-US"/>
+        </w:rPr>
+        <w:t xml:space="preserve">ny </w:t>
+      </w:r>
+      <w:r>
+        <w:rPr>
+          <w:noProof w:val="0"/>
+          <w:lang w:val="en-US"/>
+        </w:rPr>
+        <w:t xml:space="preserve">work </w:t>
+      </w:r>
+      <w:r>
+        <w:rPr>
+          <w:noProof w:val="0"/>
+          <w:lang w:val="en-US"/>
+        </w:rPr>
+        <w:t xml:space="preserve">that requires, relies </w:t>
+      </w:r>
+      <w:r>
+        <w:rPr>
+          <w:noProof w:val="0"/>
+          <w:lang w:val="en-US"/>
+        </w:rPr>
+        <w:t>on</w:t>
+      </w:r>
+      <w:r>
+        <w:rPr>
+          <w:noProof w:val="0"/>
+          <w:lang w:val="en-US"/>
+        </w:rPr>
+        <w:t xml:space="preserve"> or is referred to as </w:t>
+      </w:r>
+      <w:r>
+        <w:rPr>
+          <w:noProof w:val="0"/>
+          <w:lang w:val="en-US"/>
+        </w:rPr>
+        <w:t>factual information</w:t>
+      </w:r>
+      <w:r>
+        <w:rPr>
+          <w:noProof w:val="0"/>
+          <w:lang w:val="en-US"/>
+        </w:rPr>
+        <w:t xml:space="preserve"> </w:t>
+      </w:r>
+      <w:r>
+        <w:rPr>
+          <w:noProof w:val="0"/>
+          <w:lang w:val="en-US"/>
+        </w:rPr>
+        <w:t xml:space="preserve">must be backed by sound </w:t>
+      </w:r>
+      <w:r>
+        <w:rPr>
+          <w:noProof w:val="0"/>
+          <w:lang w:val="en-US"/>
+        </w:rPr>
+        <w:t>evidence;</w:t>
+      </w:r>
+      <w:r>
+        <w:rPr>
+          <w:noProof w:val="0"/>
+          <w:lang w:val="en-US"/>
+        </w:rPr>
+        <w:t xml:space="preserve"> </w:t>
+      </w:r>
+      <w:r>
+        <w:rPr>
+          <w:noProof w:val="0"/>
+          <w:lang w:val="en-US"/>
+        </w:rPr>
+        <w:t xml:space="preserve">research </w:t>
+      </w:r>
+      <w:r>
+        <w:rPr>
+          <w:noProof w:val="0"/>
+          <w:lang w:val="en-US"/>
+        </w:rPr>
+        <w:t>and sources must</w:t>
+      </w:r>
+      <w:r>
+        <w:rPr>
+          <w:noProof w:val="0"/>
+          <w:lang w:val="en-US"/>
+        </w:rPr>
+        <w:t xml:space="preserve"> be provided </w:t>
+      </w:r>
+      <w:r>
+        <w:rPr>
+          <w:noProof w:val="0"/>
+          <w:lang w:val="en-US"/>
+        </w:rPr>
+        <w:t>wherever possible for human verification and evaluation</w:t>
+      </w:r>
+      <w:r>
+        <w:rPr>
+          <w:noProof w:val="0"/>
+          <w:lang w:val="en-US"/>
+        </w:rPr>
+        <w:t xml:space="preserve">. </w:t>
+      </w:r>
+    </w:p>
+    <w:p>
+      <w:pPr>
+        <w:pStyle w:val="Normal"/>
+        <w:keepNext w:val="1"/>
+        <w:keepLines w:val="1"/>
+        <w:bidi w:val="0"/>
+      </w:pPr>
+      <w:r>
+        <w:rPr>
+          <w:noProof w:val="0"/>
+          <w:lang w:val="en-US"/>
+        </w:rPr>
+        <w:t>2</w:t>
+      </w:r>
+      <w:r>
+        <w:rPr>
+          <w:noProof w:val="0"/>
+          <w:lang w:val="en-US"/>
+        </w:rPr>
+        <w:t xml:space="preserve">. Any unresolved, </w:t>
+      </w:r>
+      <w:r>
+        <w:rPr>
+          <w:noProof w:val="0"/>
+          <w:lang w:val="en-US"/>
+        </w:rPr>
+        <w:t>conflicting</w:t>
+      </w:r>
+      <w:r>
+        <w:rPr>
+          <w:noProof w:val="0"/>
+          <w:lang w:val="en-US"/>
+        </w:rPr>
+        <w:t xml:space="preserve"> or uncertain information and exceptions must be escalated for human approval and review before </w:t>
+      </w:r>
+      <w:r>
+        <w:rPr>
+          <w:noProof w:val="0"/>
+          <w:lang w:val="en-US"/>
+        </w:rPr>
+        <w:t>proceeding</w:t>
+      </w:r>
+      <w:r>
+        <w:rPr>
+          <w:noProof w:val="0"/>
+          <w:lang w:val="en-US"/>
+        </w:rPr>
+        <w:t xml:space="preserve">. </w:t>
+      </w:r>
+    </w:p>
+    <w:p>
+      <w:pPr>
+        <w:pStyle w:val="Normal"/>
+        <w:keepNext w:val="1"/>
+        <w:keepLines w:val="1"/>
+        <w:bidi w:val="0"/>
+        <w:rPr>
+          <w:noProof w:val="0"/>
+          <w:lang w:val="en-US"/>
+        </w:rPr>
+      </w:pPr>
+      <w:r>
+        <w:rPr>
+          <w:noProof w:val="0"/>
+          <w:lang w:val="en-US"/>
+        </w:rPr>
+        <w:t xml:space="preserve">3. </w:t>
+      </w:r>
+      <w:r>
+        <w:rPr>
+          <w:noProof w:val="0"/>
+          <w:lang w:val="en-US"/>
+        </w:rPr>
+        <w:t>W</w:t>
+      </w:r>
+      <w:r>
+        <w:rPr>
+          <w:noProof w:val="0"/>
+          <w:lang w:val="en-US"/>
+        </w:rPr>
+        <w:t>ork must be checked against the Definition of Ready and the Acceptance Criteria</w:t>
+      </w:r>
+      <w:r>
+        <w:rPr>
+          <w:noProof w:val="0"/>
+          <w:lang w:val="en-US"/>
+        </w:rPr>
+        <w:t xml:space="preserve"> before </w:t>
+      </w:r>
+      <w:r>
+        <w:rPr>
+          <w:noProof w:val="0"/>
+          <w:lang w:val="en-US"/>
+        </w:rPr>
+        <w:t>proceeding</w:t>
+      </w:r>
+      <w:r>
+        <w:rPr>
+          <w:noProof w:val="0"/>
+          <w:lang w:val="en-US"/>
+        </w:rPr>
+        <w:t>.</w:t>
+      </w:r>
+      <w:r>
+        <w:rPr>
+          <w:noProof w:val="0"/>
+          <w:lang w:val="en-US"/>
+        </w:rPr>
+        <w:t xml:space="preserve"> Any uncertainties must be escalated and notified for human approval.</w:t>
+      </w:r>
+      <w:r>
+        <w:rPr>
+          <w:noProof w:val="0"/>
+          <w:lang w:val="en-US"/>
+        </w:rPr>
+        <w:t xml:space="preserve"> </w:t>
+      </w:r>
+    </w:p>
+    <w:p>
+      <w:pPr>
+        <w:pStyle w:val="Normal"/>
+        <w:keepNext w:val="1"/>
+        <w:keepLines w:val="1"/>
+        <w:bidi w:val="0"/>
+      </w:pPr>
+      <w:r>
+        <w:rPr>
+          <w:noProof w:val="0"/>
+          <w:lang w:val="en-US"/>
+        </w:rPr>
+        <w:t xml:space="preserve">4. </w:t>
+      </w:r>
+      <w:r>
+        <w:rPr>
+          <w:noProof w:val="0"/>
+          <w:lang w:val="en-US"/>
+        </w:rPr>
+        <w:t>C</w:t>
+      </w:r>
+      <w:r>
+        <w:rPr>
+          <w:noProof w:val="0"/>
+          <w:lang w:val="en-US"/>
+        </w:rPr>
+        <w:t xml:space="preserve">hanges to the workflow, research </w:t>
+      </w:r>
+      <w:r>
+        <w:rPr>
+          <w:noProof w:val="0"/>
+          <w:lang w:val="en-US"/>
+        </w:rPr>
+        <w:t xml:space="preserve">requirements </w:t>
+      </w:r>
+      <w:r>
+        <w:rPr>
+          <w:noProof w:val="0"/>
+          <w:lang w:val="en-US"/>
+        </w:rPr>
+        <w:t xml:space="preserve">must be </w:t>
+      </w:r>
+      <w:r>
+        <w:rPr>
+          <w:noProof w:val="0"/>
+          <w:lang w:val="en-US"/>
+        </w:rPr>
+        <w:t>identified</w:t>
+      </w:r>
+      <w:r>
+        <w:rPr>
+          <w:noProof w:val="0"/>
+          <w:lang w:val="en-US"/>
+        </w:rPr>
+        <w:t xml:space="preserve"> and referred to </w:t>
+      </w:r>
+      <w:r>
+        <w:rPr>
+          <w:noProof w:val="0"/>
+          <w:lang w:val="en-US"/>
+        </w:rPr>
+        <w:t xml:space="preserve">for human approval before continuation. </w:t>
+      </w:r>
+    </w:p>
+    <w:p>
+      <w:pPr>
+        <w:pStyle w:val="Normal"/>
+        <w:keepNext w:val="1"/>
+        <w:keepLines w:val="1"/>
+        <w:bidi w:val="0"/>
+        <w:rPr>
+          <w:noProof w:val="0"/>
+          <w:lang w:val="en-US"/>
+        </w:rPr>
+      </w:pPr>
+      <w:r>
+        <w:rPr>
+          <w:noProof w:val="0"/>
+          <w:lang w:val="en-US"/>
+        </w:rPr>
+        <w:t>5</w:t>
+      </w:r>
+      <w:r>
+        <w:rPr>
+          <w:noProof w:val="0"/>
+          <w:lang w:val="en-US"/>
+        </w:rPr>
+        <w:t>. When</w:t>
+      </w:r>
+      <w:r>
+        <w:rPr>
+          <w:noProof w:val="0"/>
+          <w:lang w:val="en-US"/>
+        </w:rPr>
+        <w:t xml:space="preserve"> </w:t>
+      </w:r>
+      <w:r>
+        <w:rPr>
+          <w:noProof w:val="0"/>
+          <w:lang w:val="en-US"/>
+        </w:rPr>
+        <w:t>approvals, rejections and e</w:t>
+      </w:r>
+      <w:r>
+        <w:rPr>
+          <w:noProof w:val="0"/>
+          <w:lang w:val="en-US"/>
+        </w:rPr>
+        <w:t xml:space="preserve">scalations </w:t>
+      </w:r>
+      <w:r>
+        <w:rPr>
+          <w:noProof w:val="0"/>
+          <w:lang w:val="en-US"/>
+        </w:rPr>
+        <w:t>are being conducted, t</w:t>
+      </w:r>
+      <w:r>
+        <w:rPr>
+          <w:noProof w:val="0"/>
+          <w:lang w:val="en-US"/>
+        </w:rPr>
+        <w:t>here must be clear,</w:t>
+      </w:r>
+      <w:r>
+        <w:rPr>
+          <w:noProof w:val="0"/>
+          <w:lang w:val="en-US"/>
+        </w:rPr>
+        <w:t xml:space="preserve"> </w:t>
+      </w:r>
+      <w:r>
+        <w:rPr>
+          <w:noProof w:val="0"/>
+          <w:lang w:val="en-US"/>
+        </w:rPr>
+        <w:t>detailed,</w:t>
+      </w:r>
+      <w:r>
+        <w:rPr>
+          <w:noProof w:val="0"/>
+          <w:lang w:val="en-US"/>
+        </w:rPr>
+        <w:t xml:space="preserve"> and traceable documentation</w:t>
+      </w:r>
+      <w:r>
+        <w:rPr>
+          <w:noProof w:val="0"/>
+          <w:lang w:val="en-US"/>
+        </w:rPr>
+        <w:t xml:space="preserve">. </w:t>
+      </w:r>
+    </w:p>
+    <w:p>
+      <w:pPr>
+        <w:pStyle w:val="Normal"/>
+        <w:keepNext w:val="1"/>
+        <w:keepLines w:val="1"/>
+        <w:bidi w:val="0"/>
+        <w:rPr>
+          <w:noProof w:val="0"/>
+          <w:lang w:val="en-US"/>
+        </w:rPr>
+      </w:pPr>
+    </w:p>
+    <w:p>
+      <w:pPr>
+        <w:pStyle w:val="Normal"/>
+        <w:keepNext w:val="1"/>
+        <w:keepLines w:val="1"/>
+        <w:bidi w:val="0"/>
+        <w:rPr>
+          <w:noProof w:val="0"/>
+          <w:lang w:val="en-US"/>
+        </w:rPr>
+      </w:pPr>
+    </w:p>
+    <w:p>
+      <w:pPr>
+        <w:pStyle w:val="Normal"/>
+        <w:keepNext w:val="1"/>
+        <w:keepLines w:val="1"/>
+        <w:bidi w:val="0"/>
+        <w:rPr>
+          <w:noProof w:val="0"/>
+          <w:lang w:val="en-US"/>
+        </w:rPr>
+      </w:pPr>
+    </w:p>
+    <w:p>
+      <w:pPr>
+        <w:pStyle w:val="Normal"/>
+        <w:keepNext w:val="1"/>
+        <w:keepLines w:val="1"/>
+        <w:bidi w:val="0"/>
+        <w:rPr>
+          <w:noProof w:val="0"/>
+          <w:lang w:val="en-US"/>
+        </w:rPr>
       </w:pPr>
     </w:p>
     <w:p xmlns:wp14="http://schemas.microsoft.com/office/word/2010/wordml" wp14:paraId="678A79BB" wp14:textId="67B5D2A1">
@@ -4719,7 +5744,7 @@
         <w:br w:type="page"/>
       </w:r>
     </w:p>
-    <w:p xmlns:wp14="http://schemas.microsoft.com/office/word/2010/wordml" wp14:paraId="170962BC" wp14:textId="1192CCFF">
+    <w:p xmlns:wp14="http://schemas.microsoft.com/office/word/2010/wordml" wp14:paraId="170962BC" wp14:textId="1EB27C63">
       <w:pPr>
         <w:pStyle w:val="Heading3"/>
         <w:keepNext w:val="1"/>
@@ -4756,7 +5781,24 @@
           <w:szCs w:val="28"/>
           <w:lang w:val="en-US"/>
         </w:rPr>
-        <w:t>7. Research / Sources</w:t>
+        <w:t>8</w:t>
+      </w:r>
+      <w:r>
+        <w:rPr>
+          <w:rFonts w:ascii="Aptos" w:hAnsi="Aptos" w:eastAsia="Aptos" w:cs="Aptos"/>
+          <w:b w:val="1"/>
+          <w:bCs w:val="1"/>
+          <w:i w:val="0"/>
+          <w:iCs w:val="0"/>
+          <w:caps w:val="0"/>
+          <w:smallCaps w:val="0"/>
+          <w:noProof w:val="0"/>
+          <w:color w:val="0F4761" w:themeColor="accent1" w:themeTint="FF" w:themeShade="BF"/>
+          <w:sz w:val="28"/>
+          <w:szCs w:val="28"/>
+          <w:lang w:val="en-US"/>
+        </w:rPr>
+        <w:t>. Research / Sources</w:t>
       </w:r>
     </w:p>
     <w:p xmlns:wp14="http://schemas.microsoft.com/office/word/2010/wordml" wp14:paraId="3473A69E" wp14:textId="58AACFD0">
@@ -5191,7 +6233,24 @@
           <w:szCs w:val="24"/>
           <w:lang w:val="en-US"/>
         </w:rPr>
-        <w:t>ApsisVR</w:t>
+        <w:t>Viri</w:t>
+      </w:r>
+      <w:r>
+        <w:rPr>
+          <w:rFonts w:ascii="Aptos" w:hAnsi="Aptos" w:eastAsia="Aptos" w:cs="Aptos"/>
+          <w:b w:val="0"/>
+          <w:bCs w:val="0"/>
+          <w:i w:val="0"/>
+          <w:iCs w:val="0"/>
+          <w:caps w:val="0"/>
+          <w:smallCaps w:val="0"/>
+          <w:noProof w:val="0"/>
+          <w:color w:val="000000" w:themeColor="text1" w:themeTint="FF" w:themeShade="FF"/>
+          <w:sz w:val="24"/>
+          <w:szCs w:val="24"/>
+          <w:lang w:val="en-US"/>
+        </w:rPr>
+        <w:t>VR</w:t>
       </w:r>
       <w:r>
         <w:rPr>
@@ -5493,7 +6552,7 @@
         <w:br w:type="page"/>
       </w:r>
     </w:p>
-    <w:p xmlns:wp14="http://schemas.microsoft.com/office/word/2010/wordml" wp14:paraId="2FEC7C8C" wp14:textId="004DC956">
+    <w:p xmlns:wp14="http://schemas.microsoft.com/office/word/2010/wordml" wp14:paraId="2FEC7C8C" wp14:textId="542D05E2">
       <w:pPr>
         <w:pStyle w:val="Heading3"/>
         <w:keepNext w:val="1"/>
@@ -5530,7 +6589,24 @@
           <w:szCs w:val="28"/>
           <w:lang w:val="en-US"/>
         </w:rPr>
-        <w:t>8. Questions / Assumptions</w:t>
+        <w:t>9</w:t>
+      </w:r>
+      <w:r>
+        <w:rPr>
+          <w:rFonts w:ascii="Aptos" w:hAnsi="Aptos" w:eastAsia="Aptos" w:cs="Aptos"/>
+          <w:b w:val="1"/>
+          <w:bCs w:val="1"/>
+          <w:i w:val="0"/>
+          <w:iCs w:val="0"/>
+          <w:caps w:val="0"/>
+          <w:smallCaps w:val="0"/>
+          <w:noProof w:val="0"/>
+          <w:color w:val="0F4761" w:themeColor="accent1" w:themeTint="FF" w:themeShade="BF"/>
+          <w:sz w:val="28"/>
+          <w:szCs w:val="28"/>
+          <w:lang w:val="en-US"/>
+        </w:rPr>
+        <w:t>. Questions / Assumptions</w:t>
       </w:r>
     </w:p>
     <w:p xmlns:wp14="http://schemas.microsoft.com/office/word/2010/wordml" wp14:paraId="19D3FC0E" wp14:textId="77BD795F">
@@ -5570,7 +6646,7 @@
         <w:t>Anything that is unclear or needs confirmation from Ajith/client.</w:t>
       </w:r>
     </w:p>
-    <w:p xmlns:wp14="http://schemas.microsoft.com/office/word/2010/wordml" wp14:paraId="2EAAD18C" wp14:textId="2D6A6B35">
+    <w:p xmlns:wp14="http://schemas.microsoft.com/office/word/2010/wordml" wp14:paraId="1A2AD080" wp14:textId="096A7844">
       <w:pPr>
         <w:pStyle w:val="ListParagraph"/>
         <w:numPr>
@@ -5609,78 +6685,44 @@
           <w:szCs w:val="24"/>
           <w:lang w:val="en-US"/>
         </w:rPr>
-        <w:t xml:space="preserve">What </w:t>
-      </w:r>
-      <w:r>
-        <w:rPr>
-          <w:rFonts w:ascii="Aptos" w:hAnsi="Aptos" w:eastAsia="Aptos" w:cs="Aptos"/>
-          <w:b w:val="0"/>
-          <w:bCs w:val="0"/>
-          <w:i w:val="0"/>
-          <w:iCs w:val="0"/>
-          <w:caps w:val="0"/>
-          <w:smallCaps w:val="0"/>
-          <w:noProof w:val="0"/>
-          <w:color w:val="000000" w:themeColor="text1" w:themeTint="FF" w:themeShade="FF"/>
-          <w:sz w:val="24"/>
-          <w:szCs w:val="24"/>
-          <w:lang w:val="en-US"/>
-        </w:rPr>
-        <w:t>additional</w:t>
-      </w:r>
-      <w:r>
-        <w:rPr>
-          <w:rFonts w:ascii="Aptos" w:hAnsi="Aptos" w:eastAsia="Aptos" w:cs="Aptos"/>
-          <w:b w:val="0"/>
-          <w:bCs w:val="0"/>
-          <w:i w:val="0"/>
-          <w:iCs w:val="0"/>
-          <w:caps w:val="0"/>
-          <w:smallCaps w:val="0"/>
-          <w:noProof w:val="0"/>
-          <w:color w:val="000000" w:themeColor="text1" w:themeTint="FF" w:themeShade="FF"/>
-          <w:sz w:val="24"/>
-          <w:szCs w:val="24"/>
-          <w:lang w:val="en-US"/>
-        </w:rPr>
-        <w:t xml:space="preserve"> KPIs </w:t>
-      </w:r>
-      <w:r>
-        <w:rPr>
-          <w:rFonts w:ascii="Aptos" w:hAnsi="Aptos" w:eastAsia="Aptos" w:cs="Aptos"/>
-          <w:b w:val="0"/>
-          <w:bCs w:val="0"/>
-          <w:i w:val="0"/>
-          <w:iCs w:val="0"/>
-          <w:caps w:val="0"/>
-          <w:smallCaps w:val="0"/>
-          <w:noProof w:val="0"/>
-          <w:color w:val="000000" w:themeColor="text1" w:themeTint="FF" w:themeShade="FF"/>
-          <w:sz w:val="24"/>
-          <w:szCs w:val="24"/>
-          <w:lang w:val="en-US"/>
-        </w:rPr>
-        <w:t xml:space="preserve">should </w:t>
-      </w:r>
-      <w:r>
-        <w:rPr>
-          <w:rFonts w:ascii="Aptos" w:hAnsi="Aptos" w:eastAsia="Aptos" w:cs="Aptos"/>
-          <w:b w:val="0"/>
-          <w:bCs w:val="0"/>
-          <w:i w:val="0"/>
-          <w:iCs w:val="0"/>
-          <w:caps w:val="0"/>
-          <w:smallCaps w:val="0"/>
-          <w:noProof w:val="0"/>
-          <w:color w:val="000000" w:themeColor="text1" w:themeTint="FF" w:themeShade="FF"/>
-          <w:sz w:val="24"/>
-          <w:szCs w:val="24"/>
-          <w:lang w:val="en-US"/>
-        </w:rPr>
-        <w:t>be added?</w:t>
-      </w:r>
-    </w:p>
-    <w:p xmlns:wp14="http://schemas.microsoft.com/office/word/2010/wordml" wp14:paraId="1A2AD080" wp14:textId="50401CAF">
+        <w:t xml:space="preserve">What types of changes </w:t>
+      </w:r>
+      <w:r>
+        <w:rPr>
+          <w:rFonts w:ascii="Aptos" w:hAnsi="Aptos" w:eastAsia="Aptos" w:cs="Aptos"/>
+          <w:b w:val="0"/>
+          <w:bCs w:val="0"/>
+          <w:i w:val="0"/>
+          <w:iCs w:val="0"/>
+          <w:caps w:val="0"/>
+          <w:smallCaps w:val="0"/>
+          <w:noProof w:val="0"/>
+          <w:color w:val="000000" w:themeColor="text1" w:themeTint="FF" w:themeShade="FF"/>
+          <w:sz w:val="24"/>
+          <w:szCs w:val="24"/>
+          <w:lang w:val="en-US"/>
+        </w:rPr>
+        <w:t>can be made by the AI Agent</w:t>
+      </w:r>
+      <w:r>
+        <w:rPr>
+          <w:rFonts w:ascii="Aptos" w:hAnsi="Aptos" w:eastAsia="Aptos" w:cs="Aptos"/>
+          <w:b w:val="0"/>
+          <w:bCs w:val="0"/>
+          <w:i w:val="0"/>
+          <w:iCs w:val="0"/>
+          <w:caps w:val="0"/>
+          <w:smallCaps w:val="0"/>
+          <w:noProof w:val="0"/>
+          <w:color w:val="000000" w:themeColor="text1" w:themeTint="FF" w:themeShade="FF"/>
+          <w:sz w:val="24"/>
+          <w:szCs w:val="24"/>
+          <w:lang w:val="en-US"/>
+        </w:rPr>
+        <w:t xml:space="preserve"> without human approval?</w:t>
+      </w:r>
+    </w:p>
+    <w:p>
       <w:pPr>
         <w:pStyle w:val="ListParagraph"/>
         <w:numPr>
@@ -5704,6 +6746,371 @@
           <w:lang w:val="en-US"/>
         </w:rPr>
       </w:pPr>
+      <w:r>
+        <w:rPr>
+          <w:rFonts w:ascii="Aptos" w:hAnsi="Aptos" w:eastAsia="Aptos" w:cs="Aptos"/>
+          <w:b w:val="0"/>
+          <w:bCs w:val="0"/>
+          <w:i w:val="0"/>
+          <w:iCs w:val="0"/>
+          <w:caps w:val="0"/>
+          <w:smallCaps w:val="0"/>
+          <w:noProof w:val="0"/>
+          <w:color w:val="000000" w:themeColor="text1" w:themeTint="FF" w:themeShade="FF"/>
+          <w:sz w:val="24"/>
+          <w:szCs w:val="24"/>
+          <w:lang w:val="en-US"/>
+        </w:rPr>
+        <w:t xml:space="preserve">What would the threshold be to </w:t>
+      </w:r>
+      <w:r>
+        <w:rPr>
+          <w:rFonts w:ascii="Aptos" w:hAnsi="Aptos" w:eastAsia="Aptos" w:cs="Aptos"/>
+          <w:b w:val="0"/>
+          <w:bCs w:val="0"/>
+          <w:i w:val="0"/>
+          <w:iCs w:val="0"/>
+          <w:caps w:val="0"/>
+          <w:smallCaps w:val="0"/>
+          <w:noProof w:val="0"/>
+          <w:color w:val="000000" w:themeColor="text1" w:themeTint="FF" w:themeShade="FF"/>
+          <w:sz w:val="24"/>
+          <w:szCs w:val="24"/>
+          <w:lang w:val="en-US"/>
+        </w:rPr>
+        <w:t>determine</w:t>
+      </w:r>
+      <w:r>
+        <w:rPr>
+          <w:rFonts w:ascii="Aptos" w:hAnsi="Aptos" w:eastAsia="Aptos" w:cs="Aptos"/>
+          <w:b w:val="0"/>
+          <w:bCs w:val="0"/>
+          <w:i w:val="0"/>
+          <w:iCs w:val="0"/>
+          <w:caps w:val="0"/>
+          <w:smallCaps w:val="0"/>
+          <w:noProof w:val="0"/>
+          <w:color w:val="000000" w:themeColor="text1" w:themeTint="FF" w:themeShade="FF"/>
+          <w:sz w:val="24"/>
+          <w:szCs w:val="24"/>
+          <w:lang w:val="en-US"/>
+        </w:rPr>
+        <w:t xml:space="preserve"> if escalation is </w:t>
+      </w:r>
+      <w:r>
+        <w:rPr>
+          <w:rFonts w:ascii="Aptos" w:hAnsi="Aptos" w:eastAsia="Aptos" w:cs="Aptos"/>
+          <w:b w:val="0"/>
+          <w:bCs w:val="0"/>
+          <w:i w:val="0"/>
+          <w:iCs w:val="0"/>
+          <w:caps w:val="0"/>
+          <w:smallCaps w:val="0"/>
+          <w:noProof w:val="0"/>
+          <w:color w:val="000000" w:themeColor="text1" w:themeTint="FF" w:themeShade="FF"/>
+          <w:sz w:val="24"/>
+          <w:szCs w:val="24"/>
+          <w:lang w:val="en-US"/>
+        </w:rPr>
+        <w:t>required</w:t>
+      </w:r>
+      <w:r>
+        <w:rPr>
+          <w:rFonts w:ascii="Aptos" w:hAnsi="Aptos" w:eastAsia="Aptos" w:cs="Aptos"/>
+          <w:b w:val="0"/>
+          <w:bCs w:val="0"/>
+          <w:i w:val="0"/>
+          <w:iCs w:val="0"/>
+          <w:caps w:val="0"/>
+          <w:smallCaps w:val="0"/>
+          <w:noProof w:val="0"/>
+          <w:color w:val="000000" w:themeColor="text1" w:themeTint="FF" w:themeShade="FF"/>
+          <w:sz w:val="24"/>
+          <w:szCs w:val="24"/>
+          <w:lang w:val="en-US"/>
+        </w:rPr>
+        <w:t xml:space="preserve">? Do minor issues get </w:t>
+      </w:r>
+      <w:r>
+        <w:rPr>
+          <w:rFonts w:ascii="Aptos" w:hAnsi="Aptos" w:eastAsia="Aptos" w:cs="Aptos"/>
+          <w:b w:val="0"/>
+          <w:bCs w:val="0"/>
+          <w:i w:val="0"/>
+          <w:iCs w:val="0"/>
+          <w:caps w:val="0"/>
+          <w:smallCaps w:val="0"/>
+          <w:noProof w:val="0"/>
+          <w:color w:val="000000" w:themeColor="text1" w:themeTint="FF" w:themeShade="FF"/>
+          <w:sz w:val="24"/>
+          <w:szCs w:val="24"/>
+          <w:lang w:val="en-US"/>
+        </w:rPr>
+        <w:t>escalated</w:t>
+      </w:r>
+      <w:r>
+        <w:rPr>
+          <w:rFonts w:ascii="Aptos" w:hAnsi="Aptos" w:eastAsia="Aptos" w:cs="Aptos"/>
+          <w:b w:val="0"/>
+          <w:bCs w:val="0"/>
+          <w:i w:val="0"/>
+          <w:iCs w:val="0"/>
+          <w:caps w:val="0"/>
+          <w:smallCaps w:val="0"/>
+          <w:noProof w:val="0"/>
+          <w:color w:val="000000" w:themeColor="text1" w:themeTint="FF" w:themeShade="FF"/>
+          <w:sz w:val="24"/>
+          <w:szCs w:val="24"/>
+          <w:lang w:val="en-US"/>
+        </w:rPr>
+        <w:t xml:space="preserve"> or only </w:t>
+      </w:r>
+      <w:r>
+        <w:rPr>
+          <w:rFonts w:ascii="Aptos" w:hAnsi="Aptos" w:eastAsia="Aptos" w:cs="Aptos"/>
+          <w:b w:val="0"/>
+          <w:bCs w:val="0"/>
+          <w:i w:val="0"/>
+          <w:iCs w:val="0"/>
+          <w:caps w:val="0"/>
+          <w:smallCaps w:val="0"/>
+          <w:noProof w:val="0"/>
+          <w:color w:val="000000" w:themeColor="text1" w:themeTint="FF" w:themeShade="FF"/>
+          <w:sz w:val="24"/>
+          <w:szCs w:val="24"/>
+          <w:lang w:val="en-US"/>
+        </w:rPr>
+        <w:t>sever</w:t>
+      </w:r>
+      <w:r>
+        <w:rPr>
+          <w:rFonts w:ascii="Aptos" w:hAnsi="Aptos" w:eastAsia="Aptos" w:cs="Aptos"/>
+          <w:b w:val="0"/>
+          <w:bCs w:val="0"/>
+          <w:i w:val="0"/>
+          <w:iCs w:val="0"/>
+          <w:caps w:val="0"/>
+          <w:smallCaps w:val="0"/>
+          <w:noProof w:val="0"/>
+          <w:color w:val="000000" w:themeColor="text1" w:themeTint="FF" w:themeShade="FF"/>
+          <w:sz w:val="24"/>
+          <w:szCs w:val="24"/>
+          <w:lang w:val="en-US"/>
+        </w:rPr>
+        <w:t xml:space="preserve"> or critical ones</w:t>
+      </w:r>
+      <w:r>
+        <w:rPr>
+          <w:rFonts w:ascii="Aptos" w:hAnsi="Aptos" w:eastAsia="Aptos" w:cs="Aptos"/>
+          <w:b w:val="0"/>
+          <w:bCs w:val="0"/>
+          <w:i w:val="0"/>
+          <w:iCs w:val="0"/>
+          <w:caps w:val="0"/>
+          <w:smallCaps w:val="0"/>
+          <w:noProof w:val="0"/>
+          <w:color w:val="000000" w:themeColor="text1" w:themeTint="FF" w:themeShade="FF"/>
+          <w:sz w:val="24"/>
+          <w:szCs w:val="24"/>
+          <w:lang w:val="en-US"/>
+        </w:rPr>
+        <w:t xml:space="preserve">? </w:t>
+      </w:r>
+    </w:p>
+    <w:p>
+      <w:pPr>
+        <w:pStyle w:val="ListParagraph"/>
+        <w:numPr>
+          <w:ilvl w:val="0"/>
+          <w:numId w:val="3"/>
+        </w:numPr>
+        <w:bidi w:val="0"/>
+        <w:spacing w:before="240" w:beforeAutospacing="off" w:after="240" w:afterAutospacing="off"/>
+        <w:rPr>
+          <w:rFonts w:ascii="Aptos" w:hAnsi="Aptos" w:eastAsia="Aptos" w:cs="Aptos"/>
+          <w:b w:val="0"/>
+          <w:bCs w:val="0"/>
+          <w:i w:val="0"/>
+          <w:iCs w:val="0"/>
+          <w:caps w:val="0"/>
+          <w:smallCaps w:val="0"/>
+          <w:noProof w:val="0"/>
+          <w:color w:val="000000" w:themeColor="text1" w:themeTint="FF" w:themeShade="FF"/>
+          <w:sz w:val="24"/>
+          <w:szCs w:val="24"/>
+          <w:lang w:val="en-US"/>
+        </w:rPr>
+      </w:pPr>
+      <w:r>
+        <w:rPr>
+          <w:rFonts w:ascii="Aptos" w:hAnsi="Aptos" w:eastAsia="Aptos" w:cs="Aptos"/>
+          <w:b w:val="0"/>
+          <w:bCs w:val="0"/>
+          <w:i w:val="0"/>
+          <w:iCs w:val="0"/>
+          <w:caps w:val="0"/>
+          <w:smallCaps w:val="0"/>
+          <w:noProof w:val="0"/>
+          <w:color w:val="000000" w:themeColor="text1" w:themeTint="FF" w:themeShade="FF"/>
+          <w:sz w:val="24"/>
+          <w:szCs w:val="24"/>
+          <w:lang w:val="en-US"/>
+        </w:rPr>
+        <w:t xml:space="preserve">What </w:t>
+      </w:r>
+      <w:r>
+        <w:rPr>
+          <w:rFonts w:ascii="Aptos" w:hAnsi="Aptos" w:eastAsia="Aptos" w:cs="Aptos"/>
+          <w:b w:val="0"/>
+          <w:bCs w:val="0"/>
+          <w:i w:val="0"/>
+          <w:iCs w:val="0"/>
+          <w:caps w:val="0"/>
+          <w:smallCaps w:val="0"/>
+          <w:noProof w:val="0"/>
+          <w:color w:val="000000" w:themeColor="text1" w:themeTint="FF" w:themeShade="FF"/>
+          <w:sz w:val="24"/>
+          <w:szCs w:val="24"/>
+          <w:lang w:val="en-US"/>
+        </w:rPr>
+        <w:t xml:space="preserve">is </w:t>
+      </w:r>
+      <w:r>
+        <w:rPr>
+          <w:rFonts w:ascii="Aptos" w:hAnsi="Aptos" w:eastAsia="Aptos" w:cs="Aptos"/>
+          <w:b w:val="0"/>
+          <w:bCs w:val="0"/>
+          <w:i w:val="0"/>
+          <w:iCs w:val="0"/>
+          <w:caps w:val="0"/>
+          <w:smallCaps w:val="0"/>
+          <w:noProof w:val="0"/>
+          <w:color w:val="000000" w:themeColor="text1" w:themeTint="FF" w:themeShade="FF"/>
+          <w:sz w:val="24"/>
+          <w:szCs w:val="24"/>
+          <w:lang w:val="en-US"/>
+        </w:rPr>
+        <w:t>an appropriate baseline</w:t>
+      </w:r>
+      <w:r>
+        <w:rPr>
+          <w:rFonts w:ascii="Aptos" w:hAnsi="Aptos" w:eastAsia="Aptos" w:cs="Aptos"/>
+          <w:b w:val="0"/>
+          <w:bCs w:val="0"/>
+          <w:i w:val="0"/>
+          <w:iCs w:val="0"/>
+          <w:caps w:val="0"/>
+          <w:smallCaps w:val="0"/>
+          <w:noProof w:val="0"/>
+          <w:color w:val="000000" w:themeColor="text1" w:themeTint="FF" w:themeShade="FF"/>
+          <w:sz w:val="24"/>
+          <w:szCs w:val="24"/>
+          <w:lang w:val="en-US"/>
+        </w:rPr>
+        <w:t xml:space="preserve"> </w:t>
+      </w:r>
+      <w:r>
+        <w:rPr>
+          <w:rFonts w:ascii="Aptos" w:hAnsi="Aptos" w:eastAsia="Aptos" w:cs="Aptos"/>
+          <w:b w:val="0"/>
+          <w:bCs w:val="0"/>
+          <w:i w:val="0"/>
+          <w:iCs w:val="0"/>
+          <w:caps w:val="0"/>
+          <w:smallCaps w:val="0"/>
+          <w:noProof w:val="0"/>
+          <w:color w:val="000000" w:themeColor="text1" w:themeTint="FF" w:themeShade="FF"/>
+          <w:sz w:val="24"/>
+          <w:szCs w:val="24"/>
+          <w:lang w:val="en-US"/>
+        </w:rPr>
+        <w:t>timeframe</w:t>
+      </w:r>
+      <w:r>
+        <w:rPr>
+          <w:rFonts w:ascii="Aptos" w:hAnsi="Aptos" w:eastAsia="Aptos" w:cs="Aptos"/>
+          <w:b w:val="0"/>
+          <w:bCs w:val="0"/>
+          <w:i w:val="0"/>
+          <w:iCs w:val="0"/>
+          <w:caps w:val="0"/>
+          <w:smallCaps w:val="0"/>
+          <w:noProof w:val="0"/>
+          <w:color w:val="000000" w:themeColor="text1" w:themeTint="FF" w:themeShade="FF"/>
+          <w:sz w:val="24"/>
+          <w:szCs w:val="24"/>
+          <w:lang w:val="en-US"/>
+        </w:rPr>
+        <w:t xml:space="preserve"> to measure the effects of an implemented recommendation? Is it monthly, </w:t>
+      </w:r>
+      <w:r>
+        <w:rPr>
+          <w:rFonts w:ascii="Aptos" w:hAnsi="Aptos" w:eastAsia="Aptos" w:cs="Aptos"/>
+          <w:b w:val="0"/>
+          <w:bCs w:val="0"/>
+          <w:i w:val="0"/>
+          <w:iCs w:val="0"/>
+          <w:caps w:val="0"/>
+          <w:smallCaps w:val="0"/>
+          <w:noProof w:val="0"/>
+          <w:color w:val="000000" w:themeColor="text1" w:themeTint="FF" w:themeShade="FF"/>
+          <w:sz w:val="24"/>
+          <w:szCs w:val="24"/>
+          <w:lang w:val="en-US"/>
+        </w:rPr>
+        <w:t>quarterly,</w:t>
+      </w:r>
+      <w:r>
+        <w:rPr>
+          <w:rFonts w:ascii="Aptos" w:hAnsi="Aptos" w:eastAsia="Aptos" w:cs="Aptos"/>
+          <w:b w:val="0"/>
+          <w:bCs w:val="0"/>
+          <w:i w:val="0"/>
+          <w:iCs w:val="0"/>
+          <w:caps w:val="0"/>
+          <w:smallCaps w:val="0"/>
+          <w:noProof w:val="0"/>
+          <w:color w:val="000000" w:themeColor="text1" w:themeTint="FF" w:themeShade="FF"/>
+          <w:sz w:val="24"/>
+          <w:szCs w:val="24"/>
+          <w:lang w:val="en-US"/>
+        </w:rPr>
+        <w:t xml:space="preserve"> or </w:t>
+      </w:r>
+      <w:r>
+        <w:rPr>
+          <w:rFonts w:ascii="Aptos" w:hAnsi="Aptos" w:eastAsia="Aptos" w:cs="Aptos"/>
+          <w:b w:val="0"/>
+          <w:bCs w:val="0"/>
+          <w:i w:val="0"/>
+          <w:iCs w:val="0"/>
+          <w:caps w:val="0"/>
+          <w:smallCaps w:val="0"/>
+          <w:noProof w:val="0"/>
+          <w:color w:val="000000" w:themeColor="text1" w:themeTint="FF" w:themeShade="FF"/>
+          <w:sz w:val="24"/>
+          <w:szCs w:val="24"/>
+          <w:lang w:val="en-US"/>
+        </w:rPr>
+        <w:t>specific recommendations</w:t>
+      </w:r>
+      <w:r>
+        <w:rPr>
+          <w:rFonts w:ascii="Aptos" w:hAnsi="Aptos" w:eastAsia="Aptos" w:cs="Aptos"/>
+          <w:b w:val="0"/>
+          <w:bCs w:val="0"/>
+          <w:i w:val="0"/>
+          <w:iCs w:val="0"/>
+          <w:caps w:val="0"/>
+          <w:smallCaps w:val="0"/>
+          <w:noProof w:val="0"/>
+          <w:color w:val="000000" w:themeColor="text1" w:themeTint="FF" w:themeShade="FF"/>
+          <w:sz w:val="24"/>
+          <w:szCs w:val="24"/>
+          <w:lang w:val="en-US"/>
+        </w:rPr>
+        <w:t>?</w:t>
+      </w:r>
     </w:p>
     <w:p xmlns:wp14="http://schemas.microsoft.com/office/word/2010/wordml" wp14:paraId="31F54CF3" wp14:textId="1D57D17C">
       <w:pPr>
@@ -5747,6 +7154,447 @@
       </w:pPr>
     </w:p>
     <w:p xmlns:wp14="http://schemas.microsoft.com/office/word/2010/wordml" wp14:paraId="2C078E63" wp14:textId="07463B80"/>
+    <w:p/>
+    <w:p/>
+    <w:p/>
+    <w:p/>
+    <w:p/>
+    <w:p/>
+    <w:p/>
+    <w:p/>
+    <w:p/>
+    <w:p/>
+    <w:p/>
+    <w:p/>
+    <w:p/>
+    <w:p/>
+    <w:p/>
+    <w:p>
+      <w:pPr>
+        <w:pStyle w:val="Normal"/>
+      </w:pPr>
+    </w:p>
+    <w:p>
+      <w:pPr>
+        <w:pStyle w:val="Heading3"/>
+        <w:keepNext w:val="1"/>
+        <w:keepLines w:val="1"/>
+        <w:bidi w:val="0"/>
+        <w:spacing w:before="281" w:beforeAutospacing="off" w:after="281" w:afterAutospacing="off"/>
+      </w:pPr>
+      <w:r>
+        <w:rPr>
+          <w:rFonts w:ascii="Aptos" w:hAnsi="Aptos" w:eastAsia="Aptos" w:cs="Aptos"/>
+          <w:b w:val="1"/>
+          <w:bCs w:val="1"/>
+          <w:i w:val="0"/>
+          <w:iCs w:val="0"/>
+          <w:caps w:val="0"/>
+          <w:smallCaps w:val="0"/>
+          <w:noProof w:val="0"/>
+          <w:color w:val="0F4761" w:themeColor="accent1" w:themeTint="FF" w:themeShade="BF"/>
+          <w:sz w:val="28"/>
+          <w:szCs w:val="28"/>
+          <w:lang w:val="en-US"/>
+        </w:rPr>
+        <w:t>10</w:t>
+      </w:r>
+      <w:r>
+        <w:rPr>
+          <w:rFonts w:ascii="Aptos" w:hAnsi="Aptos" w:eastAsia="Aptos" w:cs="Aptos"/>
+          <w:b w:val="1"/>
+          <w:bCs w:val="1"/>
+          <w:i w:val="0"/>
+          <w:iCs w:val="0"/>
+          <w:caps w:val="0"/>
+          <w:smallCaps w:val="0"/>
+          <w:noProof w:val="0"/>
+          <w:color w:val="0F4761" w:themeColor="accent1" w:themeTint="FF" w:themeShade="BF"/>
+          <w:sz w:val="28"/>
+          <w:szCs w:val="28"/>
+          <w:lang w:val="en-US"/>
+        </w:rPr>
+        <w:t xml:space="preserve">. Updated Specifications </w:t>
+      </w:r>
+    </w:p>
+    <w:p>
+      <w:pPr>
+        <w:pStyle w:val="Normal"/>
+        <w:keepNext w:val="1"/>
+        <w:keepLines w:val="1"/>
+        <w:bidi w:val="0"/>
+      </w:pPr>
+      <w:r>
+        <w:rPr>
+          <w:noProof w:val="0"/>
+          <w:lang w:val="en-US"/>
+        </w:rPr>
+        <w:t>Updated on 30/8/2026</w:t>
+      </w:r>
+    </w:p>
+    <w:p>
+      <w:pPr>
+        <w:pStyle w:val="Normal"/>
+        <w:keepNext w:val="1"/>
+        <w:keepLines w:val="1"/>
+        <w:bidi w:val="0"/>
+        <w:rPr>
+          <w:noProof w:val="0"/>
+          <w:lang w:val="en-US"/>
+        </w:rPr>
+      </w:pPr>
+      <w:r>
+        <w:rPr>
+          <w:noProof w:val="0"/>
+          <w:lang w:val="en-US"/>
+        </w:rPr>
+        <w:t xml:space="preserve">1. </w:t>
+      </w:r>
+      <w:r>
+        <w:rPr>
+          <w:noProof w:val="0"/>
+          <w:lang w:val="en-US"/>
+        </w:rPr>
+        <w:t>Updated</w:t>
+      </w:r>
+      <w:r>
+        <w:rPr>
+          <w:noProof w:val="0"/>
+          <w:lang w:val="en-US"/>
+        </w:rPr>
+        <w:t xml:space="preserve"> </w:t>
+      </w:r>
+      <w:r>
+        <w:rPr>
+          <w:noProof w:val="0"/>
+          <w:lang w:val="en-US"/>
+        </w:rPr>
+        <w:t xml:space="preserve">and changed </w:t>
+      </w:r>
+      <w:r>
+        <w:rPr>
+          <w:noProof w:val="0"/>
+          <w:lang w:val="en-US"/>
+        </w:rPr>
+        <w:t xml:space="preserve">naming </w:t>
+      </w:r>
+      <w:r>
+        <w:rPr>
+          <w:noProof w:val="0"/>
+          <w:lang w:val="en-US"/>
+        </w:rPr>
+        <w:t>in</w:t>
+      </w:r>
+      <w:r>
+        <w:rPr>
+          <w:noProof w:val="0"/>
+          <w:lang w:val="en-US"/>
+        </w:rPr>
+        <w:t>consistency</w:t>
+      </w:r>
+      <w:r>
+        <w:rPr>
+          <w:noProof w:val="0"/>
+          <w:lang w:val="en-US"/>
+        </w:rPr>
+        <w:t xml:space="preserve"> in document</w:t>
+      </w:r>
+      <w:r>
+        <w:rPr>
+          <w:noProof w:val="0"/>
+          <w:lang w:val="en-US"/>
+        </w:rPr>
+        <w:t>. I</w:t>
+      </w:r>
+      <w:r>
+        <w:rPr>
+          <w:noProof w:val="0"/>
+          <w:lang w:val="en-US"/>
+        </w:rPr>
+        <w:t xml:space="preserve">t will now </w:t>
+      </w:r>
+      <w:r>
+        <w:rPr>
+          <w:noProof w:val="0"/>
+          <w:lang w:val="en-US"/>
+        </w:rPr>
+        <w:t>identify</w:t>
+      </w:r>
+      <w:r>
+        <w:rPr>
+          <w:noProof w:val="0"/>
+          <w:lang w:val="en-US"/>
+        </w:rPr>
+        <w:t xml:space="preserve"> the</w:t>
+      </w:r>
+      <w:r>
+        <w:rPr>
+          <w:noProof w:val="0"/>
+          <w:lang w:val="en-US"/>
+        </w:rPr>
+        <w:t xml:space="preserve"> business</w:t>
+      </w:r>
+      <w:r>
+        <w:rPr>
+          <w:noProof w:val="0"/>
+          <w:lang w:val="en-US"/>
+        </w:rPr>
+        <w:t xml:space="preserve"> as</w:t>
+      </w:r>
+      <w:r>
+        <w:rPr>
+          <w:noProof w:val="0"/>
+          <w:lang w:val="en-US"/>
+        </w:rPr>
+        <w:t xml:space="preserve"> </w:t>
+      </w:r>
+      <w:r>
+        <w:rPr>
+          <w:noProof w:val="0"/>
+          <w:lang w:val="en-US"/>
+        </w:rPr>
+        <w:t>ViriVR</w:t>
+      </w:r>
+      <w:r>
+        <w:rPr>
+          <w:noProof w:val="0"/>
+          <w:lang w:val="en-US"/>
+        </w:rPr>
+        <w:t xml:space="preserve"> instead of </w:t>
+      </w:r>
+      <w:r>
+        <w:rPr>
+          <w:noProof w:val="0"/>
+          <w:lang w:val="en-US"/>
+        </w:rPr>
+        <w:t>ApsisVR</w:t>
+      </w:r>
+      <w:r>
+        <w:rPr>
+          <w:noProof w:val="0"/>
+          <w:lang w:val="en-US"/>
+        </w:rPr>
+        <w:t>.</w:t>
+      </w:r>
+    </w:p>
+    <w:p>
+      <w:pPr>
+        <w:pStyle w:val="Normal"/>
+        <w:keepNext w:val="1"/>
+        <w:keepLines w:val="1"/>
+        <w:bidi w:val="0"/>
+      </w:pPr>
+      <w:r>
+        <w:rPr>
+          <w:noProof w:val="0"/>
+          <w:lang w:val="en-US"/>
+        </w:rPr>
+        <w:t xml:space="preserve">2. </w:t>
+      </w:r>
+      <w:r>
+        <w:rPr>
+          <w:noProof w:val="0"/>
+          <w:lang w:val="en-US"/>
+        </w:rPr>
+        <w:t>Added constraints and governance requirements</w:t>
+      </w:r>
+      <w:r>
+        <w:rPr>
+          <w:noProof w:val="0"/>
+          <w:lang w:val="en-US"/>
+        </w:rPr>
+        <w:t xml:space="preserve"> (Page 7) </w:t>
+      </w:r>
+    </w:p>
+    <w:p>
+      <w:pPr>
+        <w:pStyle w:val="Normal"/>
+        <w:keepNext w:val="1"/>
+        <w:keepLines w:val="1"/>
+        <w:bidi w:val="0"/>
+        <w:rPr>
+          <w:noProof w:val="0"/>
+          <w:lang w:val="en-US"/>
+        </w:rPr>
+      </w:pPr>
+      <w:r>
+        <w:rPr>
+          <w:noProof w:val="0"/>
+          <w:lang w:val="en-US"/>
+        </w:rPr>
+        <w:t xml:space="preserve">3. </w:t>
+      </w:r>
+      <w:r>
+        <w:rPr>
+          <w:noProof w:val="0"/>
+          <w:lang w:val="en-US"/>
+        </w:rPr>
+        <w:t>Changed questions and assumptions for Ajith (Page 9)</w:t>
+      </w:r>
+      <w:r>
+        <w:br/>
+      </w:r>
+    </w:p>
+    <w:p>
+      <w:pPr>
+        <w:pStyle w:val="Normal"/>
+        <w:keepNext w:val="1"/>
+        <w:keepLines w:val="1"/>
+        <w:bidi w:val="0"/>
+      </w:pPr>
+      <w:r>
+        <w:br/>
+      </w:r>
+      <w:r>
+        <w:rPr>
+          <w:b w:val="1"/>
+          <w:bCs w:val="1"/>
+          <w:noProof w:val="0"/>
+          <w:lang w:val="en-US"/>
+        </w:rPr>
+        <w:t>Assumptions or Requirements that need clarification:</w:t>
+      </w:r>
+    </w:p>
+    <w:p>
+      <w:pPr>
+        <w:pStyle w:val="Normal"/>
+        <w:keepNext w:val="1"/>
+        <w:keepLines w:val="1"/>
+        <w:bidi w:val="0"/>
+      </w:pPr>
+      <w:r>
+        <w:rPr>
+          <w:noProof w:val="0"/>
+          <w:lang w:val="en-US"/>
+        </w:rPr>
+        <w:t>- A</w:t>
+      </w:r>
+      <w:r>
+        <w:rPr>
+          <w:noProof w:val="0"/>
+          <w:lang w:val="en-US"/>
+        </w:rPr>
+        <w:t>l</w:t>
+      </w:r>
+      <w:r>
+        <w:rPr>
+          <w:noProof w:val="0"/>
+          <w:lang w:val="en-US"/>
+        </w:rPr>
+        <w:t>l of the ones listed in the questions and assumptions for the client, Ajith.</w:t>
+      </w:r>
+    </w:p>
+    <w:p>
+      <w:pPr>
+        <w:pStyle w:val="Normal"/>
+        <w:keepNext w:val="1"/>
+        <w:keepLines w:val="1"/>
+        <w:bidi w:val="0"/>
+      </w:pPr>
+      <w:r>
+        <w:rPr>
+          <w:noProof w:val="0"/>
+          <w:lang w:val="en-US"/>
+        </w:rPr>
+        <w:t xml:space="preserve">- </w:t>
+      </w:r>
+      <w:r>
+        <w:rPr>
+          <w:noProof w:val="0"/>
+          <w:lang w:val="en-US"/>
+        </w:rPr>
+        <w:t xml:space="preserve">Create a distinction between </w:t>
+      </w:r>
+      <w:r>
+        <w:rPr>
+          <w:b w:val="1"/>
+          <w:bCs w:val="1"/>
+          <w:noProof w:val="0"/>
+          <w:lang w:val="en-US"/>
+        </w:rPr>
+        <w:t xml:space="preserve">operational correction </w:t>
+      </w:r>
+      <w:r>
+        <w:rPr>
+          <w:b w:val="0"/>
+          <w:bCs w:val="0"/>
+          <w:noProof w:val="0"/>
+          <w:lang w:val="en-US"/>
+        </w:rPr>
+        <w:t xml:space="preserve">and </w:t>
+      </w:r>
+      <w:r>
+        <w:rPr>
+          <w:b w:val="1"/>
+          <w:bCs w:val="1"/>
+          <w:noProof w:val="0"/>
+          <w:lang w:val="en-US"/>
+        </w:rPr>
+        <w:t>material workflow change</w:t>
+      </w:r>
+    </w:p>
+    <w:p>
+      <w:pPr>
+        <w:pStyle w:val="Normal"/>
+        <w:keepNext w:val="1"/>
+        <w:keepLines w:val="1"/>
+        <w:bidi w:val="0"/>
+      </w:pPr>
+      <w:r>
+        <w:rPr>
+          <w:b w:val="1"/>
+          <w:bCs w:val="1"/>
+          <w:noProof w:val="0"/>
+          <w:lang w:val="en-US"/>
+        </w:rPr>
+        <w:t>-</w:t>
+      </w:r>
+      <w:r>
+        <w:rPr>
+          <w:b w:val="0"/>
+          <w:bCs w:val="0"/>
+          <w:noProof w:val="0"/>
+          <w:lang w:val="en-US"/>
+        </w:rPr>
+        <w:t xml:space="preserve">Threshold for escalation, what would minor, </w:t>
+      </w:r>
+      <w:r>
+        <w:rPr>
+          <w:b w:val="0"/>
+          <w:bCs w:val="0"/>
+          <w:noProof w:val="0"/>
+          <w:lang w:val="en-US"/>
+        </w:rPr>
+        <w:t>major</w:t>
+      </w:r>
+      <w:r>
+        <w:rPr>
+          <w:b w:val="0"/>
+          <w:bCs w:val="0"/>
+          <w:noProof w:val="0"/>
+          <w:lang w:val="en-US"/>
+        </w:rPr>
+        <w:t xml:space="preserve"> or critical be defined as?</w:t>
+      </w:r>
+    </w:p>
+    <w:p>
+      <w:pPr>
+        <w:pStyle w:val="Normal"/>
+        <w:keepNext w:val="1"/>
+        <w:keepLines w:val="1"/>
+        <w:bidi w:val="0"/>
+        <w:rPr>
+          <w:b w:val="1"/>
+          <w:bCs w:val="1"/>
+          <w:noProof w:val="0"/>
+          <w:lang w:val="en-US"/>
+        </w:rPr>
+      </w:pPr>
+    </w:p>
+    <w:p/>
+    <w:p/>
+    <w:p/>
+    <w:p/>
     <w:sectPr>
       <w:pgSz w:w="12240" w:h="15840" w:orient="portrait"/>
       <w:pgMar w:top="1440" w:right="1440" w:bottom="1440" w:left="1440" w:header="720" w:footer="720" w:gutter="0"/>

</xml_diff>

<commit_message>
docs: added new skills and workflows
</commit_message>
<xml_diff>
--- a/docs/AI-Role-Specification/Authority_Manager_Agent_Specification.docx
+++ b/docs/AI-Role-Specification/Authority_Manager_Agent_Specification.docx
@@ -61,7 +61,7 @@
           <w:rFonts w:ascii="Aptos" w:eastAsia="Aptos" w:hAnsi="Aptos" w:cs="Aptos"/>
           <w:color w:val="000000" w:themeColor="text1"/>
         </w:rPr>
-        <w:t>Authority Manager</w:t>
+        <w:t>Authority Manager AI Agent</w:t>
       </w:r>
     </w:p>
     <w:p>
@@ -89,28 +89,7 @@
           <w:rFonts w:ascii="Aptos" w:eastAsia="Aptos" w:hAnsi="Aptos" w:cs="Aptos"/>
           <w:color w:val="000000" w:themeColor="text1"/>
         </w:rPr>
-        <w:t>Antho</w:t>
-      </w:r>
-      <w:r>
-        <w:rPr>
-          <w:rFonts w:ascii="Aptos" w:eastAsia="Aptos" w:hAnsi="Aptos" w:cs="Aptos"/>
-          <w:color w:val="000000" w:themeColor="text1"/>
-        </w:rPr>
-        <w:t xml:space="preserve">ny Dat </w:t>
-      </w:r>
-      <w:r>
-        <w:rPr>
-          <w:rFonts w:ascii="Aptos" w:eastAsia="Aptos" w:hAnsi="Aptos" w:cs="Aptos"/>
-          <w:color w:val="000000" w:themeColor="text1"/>
-        </w:rPr>
-        <w:t>Ph</w:t>
-      </w:r>
-      <w:r>
-        <w:rPr>
-          <w:rFonts w:ascii="Aptos" w:eastAsia="Aptos" w:hAnsi="Aptos" w:cs="Aptos"/>
-          <w:color w:val="000000" w:themeColor="text1"/>
-        </w:rPr>
-        <w:t>an</w:t>
+        <w:t>Anthony Dat Phan</w:t>
       </w:r>
     </w:p>
     <w:p>
@@ -128,7 +107,16 @@
           <w:bCs/>
           <w:color w:val="000000" w:themeColor="text1"/>
         </w:rPr>
-        <w:t>Date:</w:t>
+        <w:t>Created</w:t>
+      </w:r>
+      <w:r>
+        <w:rPr>
+          <w:rFonts w:ascii="Aptos" w:eastAsia="Aptos" w:hAnsi="Aptos" w:cs="Aptos"/>
+          <w:b/>
+          <w:bCs/>
+          <w:color w:val="000000" w:themeColor="text1"/>
+        </w:rPr>
+        <w:t xml:space="preserve"> on:</w:t>
       </w:r>
       <w:r>
         <w:br/>
@@ -145,16 +133,79 @@
           <w:rFonts w:ascii="Aptos" w:eastAsia="Aptos" w:hAnsi="Aptos" w:cs="Aptos"/>
           <w:color w:val="000000" w:themeColor="text1"/>
         </w:rPr>
-        <w:t>23/08/2026</w:t>
-      </w:r>
-    </w:p>
-    <w:p>
-      <w:pPr>
-        <w:rPr>
-          <w:rFonts w:ascii="Aptos" w:eastAsia="Aptos" w:hAnsi="Aptos" w:cs="Aptos"/>
-          <w:color w:val="000000" w:themeColor="text1"/>
-        </w:rPr>
-      </w:pPr>
+        <w:t>23</w:t>
+      </w:r>
+      <w:r>
+        <w:rPr>
+          <w:rFonts w:ascii="Aptos" w:eastAsia="Aptos" w:hAnsi="Aptos" w:cs="Aptos"/>
+          <w:color w:val="000000" w:themeColor="text1"/>
+        </w:rPr>
+        <w:t>/0</w:t>
+      </w:r>
+      <w:r>
+        <w:rPr>
+          <w:rFonts w:ascii="Aptos" w:eastAsia="Aptos" w:hAnsi="Aptos" w:cs="Aptos"/>
+          <w:color w:val="000000" w:themeColor="text1"/>
+        </w:rPr>
+        <w:t>8</w:t>
+      </w:r>
+      <w:r>
+        <w:rPr>
+          <w:rFonts w:ascii="Aptos" w:eastAsia="Aptos" w:hAnsi="Aptos" w:cs="Aptos"/>
+          <w:color w:val="000000" w:themeColor="text1"/>
+        </w:rPr>
+        <w:t>/2026</w:t>
+      </w:r>
+    </w:p>
+    <w:p>
+      <w:pPr>
+        <w:spacing w:before="240" w:after="240"/>
+        <w:rPr>
+          <w:rFonts w:ascii="Aptos" w:eastAsia="Aptos" w:hAnsi="Aptos" w:cs="Aptos"/>
+          <w:b/>
+          <w:bCs/>
+          <w:color w:val="000000" w:themeColor="text1"/>
+          <w:lang w:val="en-AU"/>
+        </w:rPr>
+      </w:pPr>
+      <w:r>
+        <w:rPr>
+          <w:rFonts w:ascii="Aptos" w:eastAsia="Aptos" w:hAnsi="Aptos" w:cs="Aptos"/>
+          <w:b/>
+          <w:bCs/>
+          <w:color w:val="000000" w:themeColor="text1"/>
+        </w:rPr>
+        <w:t>Updated on:</w:t>
+      </w:r>
+      <w:r>
+        <w:rPr>
+          <w:rFonts w:ascii="Aptos" w:eastAsia="Aptos" w:hAnsi="Aptos" w:cs="Aptos"/>
+          <w:b/>
+          <w:bCs/>
+          <w:color w:val="000000" w:themeColor="text1"/>
+        </w:rPr>
+        <w:br/>
+      </w:r>
+      <w:r>
+        <w:rPr>
+          <w:rFonts w:ascii="Aptos" w:eastAsia="Aptos" w:hAnsi="Aptos" w:cs="Aptos"/>
+          <w:color w:val="000000" w:themeColor="text1"/>
+        </w:rPr>
+        <w:t>10/09/2026</w:t>
+      </w:r>
+    </w:p>
+    <w:p>
+      <w:pPr>
+        <w:rPr>
+          <w:rFonts w:ascii="Aptos" w:eastAsia="Aptos" w:hAnsi="Aptos" w:cs="Aptos"/>
+          <w:b/>
+          <w:bCs/>
+          <w:color w:val="000000" w:themeColor="text1"/>
+        </w:rPr>
+      </w:pPr>
+      <w:r>
+        <w:br/>
+      </w:r>
     </w:p>
     <w:p>
       <w:pPr>
@@ -232,21 +283,39 @@
           <w:rFonts w:ascii="Aptos" w:eastAsia="Aptos" w:hAnsi="Aptos" w:cs="Aptos"/>
           <w:color w:val="000000" w:themeColor="text1"/>
         </w:rPr>
-        <w:t xml:space="preserve">The Authority Manager will strengthen ApsisVR’s external trust, citations, links, brand presence, domain authority through the management of its AI agents; the Digital PR Specialist, the Backlink Auditor and the Brand Authority Builder. By overseeing and coordinating </w:t>
-      </w:r>
-      <w:r>
-        <w:rPr>
-          <w:rFonts w:ascii="Aptos" w:eastAsia="Aptos" w:hAnsi="Aptos" w:cs="Aptos"/>
-          <w:color w:val="000000" w:themeColor="text1"/>
-        </w:rPr>
-        <w:t>them,</w:t>
-      </w:r>
-      <w:r>
-        <w:rPr>
-          <w:rFonts w:ascii="Aptos" w:eastAsia="Aptos" w:hAnsi="Aptos" w:cs="Aptos"/>
-          <w:color w:val="000000" w:themeColor="text1"/>
-        </w:rPr>
-        <w:t xml:space="preserve"> the Authority Manager will ensure the AI agents will contribute to ApsisVR’s authority goals and objectives and provide successful business outcomes.</w:t>
+        <w:t xml:space="preserve">The Authority Manager will strengthen </w:t>
+      </w:r>
+      <w:proofErr w:type="spellStart"/>
+      <w:r>
+        <w:rPr>
+          <w:rFonts w:ascii="Aptos" w:eastAsia="Aptos" w:hAnsi="Aptos" w:cs="Aptos"/>
+          <w:color w:val="000000" w:themeColor="text1"/>
+        </w:rPr>
+        <w:t>ViriVR’s</w:t>
+      </w:r>
+      <w:proofErr w:type="spellEnd"/>
+      <w:r>
+        <w:rPr>
+          <w:rFonts w:ascii="Aptos" w:eastAsia="Aptos" w:hAnsi="Aptos" w:cs="Aptos"/>
+          <w:color w:val="000000" w:themeColor="text1"/>
+        </w:rPr>
+        <w:t xml:space="preserve"> external trust, citations, links, brand presence, domain authority through the management of its AI agents; the Digital PR Specialist, the Backlink Auditor and the Brand Authority Builder. By overseeing and coordinating them, the Authority Manager will ensure the AI agents will contribute to </w:t>
+      </w:r>
+      <w:proofErr w:type="spellStart"/>
+      <w:r>
+        <w:rPr>
+          <w:rFonts w:ascii="Aptos" w:eastAsia="Aptos" w:hAnsi="Aptos" w:cs="Aptos"/>
+          <w:color w:val="000000" w:themeColor="text1"/>
+        </w:rPr>
+        <w:t>ViriVR’s</w:t>
+      </w:r>
+      <w:proofErr w:type="spellEnd"/>
+      <w:r>
+        <w:rPr>
+          <w:rFonts w:ascii="Aptos" w:eastAsia="Aptos" w:hAnsi="Aptos" w:cs="Aptos"/>
+          <w:color w:val="000000" w:themeColor="text1"/>
+        </w:rPr>
+        <w:t xml:space="preserve"> authority goals and objectives and provide successful business outcomes.</w:t>
       </w:r>
     </w:p>
     <w:p>
@@ -288,69 +357,40 @@
           <w:rFonts w:ascii="Aptos" w:eastAsia="Aptos" w:hAnsi="Aptos" w:cs="Aptos"/>
           <w:color w:val="000000" w:themeColor="text1"/>
         </w:rPr>
-        <w:t xml:space="preserve">This continuous process of approval, reviewing and </w:t>
-      </w:r>
-      <w:r>
-        <w:rPr>
-          <w:rFonts w:ascii="Aptos" w:eastAsia="Aptos" w:hAnsi="Aptos" w:cs="Aptos"/>
-          <w:color w:val="000000" w:themeColor="text1"/>
-        </w:rPr>
-        <w:t>monitoring of</w:t>
-      </w:r>
-      <w:r>
-        <w:rPr>
-          <w:rFonts w:ascii="Aptos" w:eastAsia="Aptos" w:hAnsi="Aptos" w:cs="Aptos"/>
-          <w:color w:val="000000" w:themeColor="text1"/>
-        </w:rPr>
-        <w:t xml:space="preserve"> the AI agents and its outputs will help ensure their ability to produce quality, </w:t>
-      </w:r>
-      <w:r>
-        <w:rPr>
-          <w:rFonts w:ascii="Aptos" w:eastAsia="Aptos" w:hAnsi="Aptos" w:cs="Aptos"/>
-          <w:color w:val="000000" w:themeColor="text1"/>
-        </w:rPr>
-        <w:t>reliable,</w:t>
-      </w:r>
-      <w:r>
-        <w:rPr>
-          <w:rFonts w:ascii="Aptos" w:eastAsia="Aptos" w:hAnsi="Aptos" w:cs="Aptos"/>
-          <w:color w:val="000000" w:themeColor="text1"/>
-        </w:rPr>
-        <w:t xml:space="preserve"> and research-based outcomes for ApsisVR. This will increase the </w:t>
-      </w:r>
-      <w:r>
-        <w:rPr>
-          <w:rFonts w:ascii="Aptos" w:eastAsia="Aptos" w:hAnsi="Aptos" w:cs="Aptos"/>
-          <w:color w:val="000000" w:themeColor="text1"/>
-        </w:rPr>
-        <w:t>business’s</w:t>
-      </w:r>
-      <w:r>
-        <w:rPr>
-          <w:rFonts w:ascii="Aptos" w:eastAsia="Aptos" w:hAnsi="Aptos" w:cs="Aptos"/>
-          <w:color w:val="000000" w:themeColor="text1"/>
-        </w:rPr>
-        <w:t xml:space="preserve"> external trust, increasing opportunities for the business to be cited or linked to relevant domains and will ultimately result in increasing ApsisVR’s visibility, credibility, brand </w:t>
-      </w:r>
-      <w:r>
-        <w:rPr>
-          <w:rFonts w:ascii="Aptos" w:eastAsia="Aptos" w:hAnsi="Aptos" w:cs="Aptos"/>
-          <w:color w:val="000000" w:themeColor="text1"/>
-        </w:rPr>
-        <w:t>presence,</w:t>
-      </w:r>
-      <w:r>
-        <w:rPr>
-          <w:rFonts w:ascii="Aptos" w:eastAsia="Aptos" w:hAnsi="Aptos" w:cs="Aptos"/>
-          <w:color w:val="000000" w:themeColor="text1"/>
-        </w:rPr>
-        <w:t xml:space="preserve"> and domain authority.</w:t>
-      </w:r>
-    </w:p>
-    <w:p>
-      <w:pPr>
-        <w:spacing w:before="240" w:after="240"/>
-      </w:pPr>
+        <w:t xml:space="preserve">This continuous process of approval, reviewing and monitoring of the AI agents and its outputs will help ensure their ability to produce quality, reliable, and research-based outcomes for </w:t>
+      </w:r>
+      <w:proofErr w:type="spellStart"/>
+      <w:r>
+        <w:rPr>
+          <w:rFonts w:ascii="Aptos" w:eastAsia="Aptos" w:hAnsi="Aptos" w:cs="Aptos"/>
+          <w:color w:val="000000" w:themeColor="text1"/>
+        </w:rPr>
+        <w:t>ViriVR</w:t>
+      </w:r>
+      <w:proofErr w:type="spellEnd"/>
+      <w:r>
+        <w:rPr>
+          <w:rFonts w:ascii="Aptos" w:eastAsia="Aptos" w:hAnsi="Aptos" w:cs="Aptos"/>
+          <w:color w:val="000000" w:themeColor="text1"/>
+        </w:rPr>
+        <w:t xml:space="preserve">. This will increase the business’s external trust, increasing opportunities for the business to be cited or linked to relevant domains and will ultimately result in increasing </w:t>
+      </w:r>
+      <w:proofErr w:type="spellStart"/>
+      <w:r>
+        <w:rPr>
+          <w:rFonts w:ascii="Aptos" w:eastAsia="Aptos" w:hAnsi="Aptos" w:cs="Aptos"/>
+          <w:color w:val="000000" w:themeColor="text1"/>
+        </w:rPr>
+        <w:t>ViriVR’s</w:t>
+      </w:r>
+      <w:proofErr w:type="spellEnd"/>
+      <w:r>
+        <w:rPr>
+          <w:rFonts w:ascii="Aptos" w:eastAsia="Aptos" w:hAnsi="Aptos" w:cs="Aptos"/>
+          <w:color w:val="000000" w:themeColor="text1"/>
+        </w:rPr>
+        <w:t xml:space="preserve"> visibility, credibility, brand presence, and domain authority.</w:t>
+      </w:r>
     </w:p>
     <w:p>
       <w:pPr>
@@ -530,6 +570,18 @@
           <w:ilvl w:val="0"/>
           <w:numId w:val="1"/>
         </w:numPr>
+        <w:spacing w:after="0" w:line="278" w:lineRule="auto"/>
+        <w:rPr>
+          <w:rFonts w:ascii="Aptos" w:eastAsia="Aptos" w:hAnsi="Aptos" w:cs="Aptos"/>
+          <w:color w:val="000000" w:themeColor="text1"/>
+        </w:rPr>
+      </w:pPr>
+    </w:p>
+    <w:p>
+      <w:pPr>
+        <w:pStyle w:val="ListParagraph"/>
+        <w:keepNext/>
+        <w:keepLines/>
         <w:spacing w:after="0" w:line="278" w:lineRule="auto"/>
         <w:rPr>
           <w:rFonts w:ascii="Aptos" w:eastAsia="Aptos" w:hAnsi="Aptos" w:cs="Aptos"/>
@@ -740,19 +792,7 @@
               <w:rPr>
                 <w:rFonts w:ascii="Aptos" w:eastAsia="Aptos" w:hAnsi="Aptos" w:cs="Aptos"/>
               </w:rPr>
-              <w:t xml:space="preserve">Determines if the AI agents’ outputs are accurate, evidence-based, </w:t>
-            </w:r>
-            <w:r>
-              <w:rPr>
-                <w:rFonts w:ascii="Aptos" w:eastAsia="Aptos" w:hAnsi="Aptos" w:cs="Aptos"/>
-              </w:rPr>
-              <w:t>trustworthy,</w:t>
-            </w:r>
-            <w:r>
-              <w:rPr>
-                <w:rFonts w:ascii="Aptos" w:eastAsia="Aptos" w:hAnsi="Aptos" w:cs="Aptos"/>
-              </w:rPr>
-              <w:t xml:space="preserve"> and relevant to its requirements.</w:t>
+              <w:t>Determines if the AI agents’ outputs are accurate, evidence-based, trustworthy, and relevant to its requirements.</w:t>
             </w:r>
           </w:p>
         </w:tc>
@@ -772,19 +812,7 @@
               <w:rPr>
                 <w:rFonts w:ascii="Aptos" w:eastAsia="Aptos" w:hAnsi="Aptos" w:cs="Aptos"/>
               </w:rPr>
-              <w:t xml:space="preserve">Determine where their evidence and claims are sourced from, is it factual? Record factual errors, unsupported claims and irrelevant information, present that information to the agent as inaccurate, to deter from making more misleading or incorrect errors, and </w:t>
-            </w:r>
-            <w:r>
-              <w:rPr>
-                <w:rFonts w:ascii="Aptos" w:eastAsia="Aptos" w:hAnsi="Aptos" w:cs="Aptos"/>
-              </w:rPr>
-              <w:t>monitoring</w:t>
-            </w:r>
-            <w:r>
-              <w:rPr>
-                <w:rFonts w:ascii="Aptos" w:eastAsia="Aptos" w:hAnsi="Aptos" w:cs="Aptos"/>
-              </w:rPr>
-              <w:t xml:space="preserve"> their progress.</w:t>
+              <w:t>Determine where their evidence and claims are sourced from, is it factual? Record factual errors, unsupported claims and irrelevant information, present that information to the agent as inaccurate, to deter from making more misleading or incorrect errors, and monitoring their progress.</w:t>
             </w:r>
           </w:p>
         </w:tc>
@@ -829,19 +857,7 @@
               <w:rPr>
                 <w:rFonts w:ascii="Aptos" w:eastAsia="Aptos" w:hAnsi="Aptos" w:cs="Aptos"/>
               </w:rPr>
-              <w:t xml:space="preserve">Whether or not the AI agents themselves have met their own established KPIs for </w:t>
-            </w:r>
-            <w:r>
-              <w:rPr>
-                <w:rFonts w:ascii="Aptos" w:eastAsia="Aptos" w:hAnsi="Aptos" w:cs="Aptos"/>
-              </w:rPr>
-              <w:t>their</w:t>
-            </w:r>
-            <w:r>
-              <w:rPr>
-                <w:rFonts w:ascii="Aptos" w:eastAsia="Aptos" w:hAnsi="Aptos" w:cs="Aptos"/>
-              </w:rPr>
-              <w:t xml:space="preserve"> respective roles.</w:t>
+              <w:t>Whether or not the AI agents themselves have met their own established KPIs for their respective roles.</w:t>
             </w:r>
           </w:p>
         </w:tc>
@@ -875,19 +891,7 @@
               <w:rPr>
                 <w:rFonts w:ascii="Aptos" w:eastAsia="Aptos" w:hAnsi="Aptos" w:cs="Aptos"/>
               </w:rPr>
-              <w:t xml:space="preserve"> KPIs and record how many targets are achieved.  </w:t>
-            </w:r>
-            <w:r>
-              <w:rPr>
-                <w:rFonts w:ascii="Aptos" w:eastAsia="Aptos" w:hAnsi="Aptos" w:cs="Aptos"/>
-              </w:rPr>
-              <w:t>Their</w:t>
-            </w:r>
-            <w:r>
-              <w:rPr>
-                <w:rFonts w:ascii="Aptos" w:eastAsia="Aptos" w:hAnsi="Aptos" w:cs="Aptos"/>
-              </w:rPr>
-              <w:t xml:space="preserve"> performance can be compared to each other to see which areas require improvement.</w:t>
+              <w:t xml:space="preserve"> KPIs and record how many targets are achieved.  Their performance can be compared to each other to see which areas require improvement.</w:t>
             </w:r>
           </w:p>
         </w:tc>
@@ -940,19 +944,7 @@
               <w:rPr>
                 <w:rFonts w:ascii="Aptos" w:eastAsia="Aptos" w:hAnsi="Aptos" w:cs="Aptos"/>
               </w:rPr>
-              <w:t xml:space="preserve">Check if the improvements made to the AI agents </w:t>
-            </w:r>
-            <w:r>
-              <w:rPr>
-                <w:rFonts w:ascii="Aptos" w:eastAsia="Aptos" w:hAnsi="Aptos" w:cs="Aptos"/>
-              </w:rPr>
-              <w:t>resulted</w:t>
-            </w:r>
-            <w:r>
-              <w:rPr>
-                <w:rFonts w:ascii="Aptos" w:eastAsia="Aptos" w:hAnsi="Aptos" w:cs="Aptos"/>
-              </w:rPr>
-              <w:t xml:space="preserve"> in better performance or outputs</w:t>
+              <w:t>Check if the improvements made to the AI agents resulted in better performance or outputs</w:t>
             </w:r>
           </w:p>
         </w:tc>
@@ -1000,13 +992,7 @@
               <w:rPr>
                 <w:rFonts w:ascii="Aptos" w:eastAsia="Aptos" w:hAnsi="Aptos" w:cs="Aptos"/>
               </w:rPr>
-              <w:t>SEO Metrics</w:t>
-            </w:r>
-            <w:r>
-              <w:rPr>
-                <w:rFonts w:ascii="Aptos" w:eastAsia="Aptos" w:hAnsi="Aptos" w:cs="Aptos"/>
-              </w:rPr>
-              <w:t xml:space="preserve"> and Growth</w:t>
+              <w:t>SEO Metrics and Growth</w:t>
             </w:r>
           </w:p>
         </w:tc>
@@ -1040,21 +1026,36 @@
               <w:rPr>
                 <w:rFonts w:ascii="Aptos" w:eastAsia="Aptos" w:hAnsi="Aptos" w:cs="Aptos"/>
               </w:rPr>
-              <w:t xml:space="preserve"> recommendations and </w:t>
-            </w:r>
+              <w:t xml:space="preserve"> recommendations and contributed to improving </w:t>
+            </w:r>
+            <w:proofErr w:type="spellStart"/>
             <w:proofErr w:type="gramStart"/>
             <w:r>
               <w:rPr>
                 <w:rFonts w:ascii="Aptos" w:eastAsia="Aptos" w:hAnsi="Aptos" w:cs="Aptos"/>
-              </w:rPr>
-              <w:t>contributed</w:t>
+                <w:color w:val="000000" w:themeColor="text1"/>
+              </w:rPr>
+              <w:t>ViriVR</w:t>
+            </w:r>
+            <w:r>
+              <w:rPr>
+                <w:rFonts w:ascii="Aptos" w:eastAsia="Aptos" w:hAnsi="Aptos" w:cs="Aptos"/>
+              </w:rPr>
+              <w:t>‘</w:t>
             </w:r>
             <w:proofErr w:type="gramEnd"/>
             <w:r>
               <w:rPr>
                 <w:rFonts w:ascii="Aptos" w:eastAsia="Aptos" w:hAnsi="Aptos" w:cs="Aptos"/>
               </w:rPr>
-              <w:t xml:space="preserve"> to improving ApsisVR’s domain authority, visibility and increased traffic</w:t>
+              <w:t>s</w:t>
+            </w:r>
+            <w:proofErr w:type="spellEnd"/>
+            <w:r>
+              <w:rPr>
+                <w:rFonts w:ascii="Aptos" w:eastAsia="Aptos" w:hAnsi="Aptos" w:cs="Aptos"/>
+              </w:rPr>
+              <w:t xml:space="preserve"> domain authority, visibility and increased traffic</w:t>
             </w:r>
           </w:p>
         </w:tc>
@@ -1074,57 +1075,35 @@
               <w:rPr>
                 <w:rFonts w:ascii="Aptos" w:eastAsia="Aptos" w:hAnsi="Aptos" w:cs="Aptos"/>
               </w:rPr>
-              <w:t>Using tools such as Google Analytics</w:t>
-            </w:r>
-            <w:r>
-              <w:rPr>
-                <w:rFonts w:ascii="Aptos" w:eastAsia="Aptos" w:hAnsi="Aptos" w:cs="Aptos"/>
-              </w:rPr>
-              <w:t xml:space="preserve"> and Ahrefs to measure metrics before the </w:t>
-            </w:r>
-            <w:r>
-              <w:rPr>
-                <w:rFonts w:ascii="Aptos" w:eastAsia="Aptos" w:hAnsi="Aptos" w:cs="Aptos"/>
-              </w:rPr>
-              <w:t>implementation</w:t>
-            </w:r>
-            <w:r>
-              <w:rPr>
-                <w:rFonts w:ascii="Aptos" w:eastAsia="Aptos" w:hAnsi="Aptos" w:cs="Aptos"/>
-              </w:rPr>
-              <w:t xml:space="preserve"> of the recommendation and after.</w:t>
-            </w:r>
-            <w:r>
-              <w:rPr>
-                <w:rFonts w:ascii="Aptos" w:eastAsia="Aptos" w:hAnsi="Aptos" w:cs="Aptos"/>
-              </w:rPr>
-              <w:t xml:space="preserve"> These tools measure </w:t>
+              <w:t xml:space="preserve">Using tools such as Google Analytics and </w:t>
+            </w:r>
+            <w:proofErr w:type="spellStart"/>
+            <w:r>
+              <w:rPr>
+                <w:rFonts w:ascii="Aptos" w:eastAsia="Aptos" w:hAnsi="Aptos" w:cs="Aptos"/>
+              </w:rPr>
+              <w:t>Ahrefs</w:t>
+            </w:r>
+            <w:proofErr w:type="spellEnd"/>
+            <w:r>
+              <w:rPr>
+                <w:rFonts w:ascii="Aptos" w:eastAsia="Aptos" w:hAnsi="Aptos" w:cs="Aptos"/>
+              </w:rPr>
+              <w:t xml:space="preserve"> to measure metrics before the implementation of the recommendation and after. These tools measure </w:t>
             </w:r>
             <w:proofErr w:type="gramStart"/>
             <w:r>
               <w:rPr>
                 <w:rFonts w:ascii="Aptos" w:eastAsia="Aptos" w:hAnsi="Aptos" w:cs="Aptos"/>
               </w:rPr>
-              <w:t>the</w:t>
-            </w:r>
-            <w:r>
-              <w:rPr>
-                <w:rFonts w:ascii="Aptos" w:eastAsia="Aptos" w:hAnsi="Aptos" w:cs="Aptos"/>
-              </w:rPr>
-              <w:t xml:space="preserve"> businesses</w:t>
+              <w:t>the businesses</w:t>
             </w:r>
             <w:proofErr w:type="gramEnd"/>
             <w:r>
               <w:rPr>
                 <w:rFonts w:ascii="Aptos" w:eastAsia="Aptos" w:hAnsi="Aptos" w:cs="Aptos"/>
               </w:rPr>
-              <w:t>' websites</w:t>
-            </w:r>
-            <w:r>
-              <w:rPr>
-                <w:rFonts w:ascii="Aptos" w:eastAsia="Aptos" w:hAnsi="Aptos" w:cs="Aptos"/>
-              </w:rPr>
-              <w:t xml:space="preserve"> backlinks as well as website authority.</w:t>
+              <w:t>' websites backlinks as well as website authority.</w:t>
             </w:r>
           </w:p>
         </w:tc>
@@ -1196,10 +1175,6 @@
     <w:p>
       <w:pPr>
         <w:spacing w:before="240" w:after="240"/>
-        <w:rPr>
-          <w:rFonts w:ascii="Aptos" w:eastAsia="Aptos" w:hAnsi="Aptos" w:cs="Aptos"/>
-          <w:color w:val="000000" w:themeColor="text1"/>
-        </w:rPr>
       </w:pPr>
       <w:r>
         <w:rPr>
@@ -1207,6 +1182,433 @@
           <w:color w:val="000000" w:themeColor="text1"/>
         </w:rPr>
         <w:t>What skills does this agent need?</w:t>
+      </w:r>
+    </w:p>
+    <w:p>
+      <w:pPr>
+        <w:spacing w:before="240" w:after="240"/>
+      </w:pPr>
+      <w:r>
+        <w:rPr>
+          <w:rFonts w:ascii="Aptos" w:eastAsia="Aptos" w:hAnsi="Aptos" w:cs="Aptos"/>
+          <w:color w:val="000000" w:themeColor="text1"/>
+        </w:rPr>
+        <w:t>New Top 3 Skills (08/09/2026)</w:t>
+      </w:r>
+    </w:p>
+    <w:tbl>
+      <w:tblPr>
+        <w:tblW w:w="0" w:type="auto"/>
+        <w:tblBorders>
+          <w:top w:val="single" w:sz="6" w:space="0" w:color="auto"/>
+          <w:left w:val="single" w:sz="6" w:space="0" w:color="auto"/>
+          <w:bottom w:val="single" w:sz="6" w:space="0" w:color="auto"/>
+          <w:right w:val="single" w:sz="6" w:space="0" w:color="auto"/>
+        </w:tblBorders>
+        <w:tblLook w:val="06A0" w:firstRow="1" w:lastRow="0" w:firstColumn="1" w:lastColumn="0" w:noHBand="1" w:noVBand="1"/>
+      </w:tblPr>
+      <w:tblGrid>
+        <w:gridCol w:w="2794"/>
+        <w:gridCol w:w="6550"/>
+      </w:tblGrid>
+      <w:tr>
+        <w:trPr>
+          <w:trHeight w:val="285"/>
+        </w:trPr>
+        <w:tc>
+          <w:tcPr>
+            <w:tcW w:w="2820" w:type="dxa"/>
+            <w:tcMar>
+              <w:left w:w="105" w:type="dxa"/>
+              <w:right w:w="105" w:type="dxa"/>
+            </w:tcMar>
+          </w:tcPr>
+          <w:p>
+            <w:pPr>
+              <w:spacing w:after="0"/>
+              <w:jc w:val="center"/>
+              <w:rPr>
+                <w:rFonts w:ascii="Aptos" w:eastAsia="Aptos" w:hAnsi="Aptos" w:cs="Aptos"/>
+              </w:rPr>
+            </w:pPr>
+            <w:r>
+              <w:rPr>
+                <w:rFonts w:ascii="Aptos" w:eastAsia="Aptos" w:hAnsi="Aptos" w:cs="Aptos"/>
+                <w:b/>
+                <w:bCs/>
+              </w:rPr>
+              <w:t>Skill</w:t>
+            </w:r>
+          </w:p>
+        </w:tc>
+        <w:tc>
+          <w:tcPr>
+            <w:tcW w:w="6645" w:type="dxa"/>
+            <w:tcMar>
+              <w:left w:w="105" w:type="dxa"/>
+              <w:right w:w="105" w:type="dxa"/>
+            </w:tcMar>
+          </w:tcPr>
+          <w:p>
+            <w:pPr>
+              <w:spacing w:after="0"/>
+              <w:jc w:val="center"/>
+              <w:rPr>
+                <w:rFonts w:ascii="Aptos" w:eastAsia="Aptos" w:hAnsi="Aptos" w:cs="Aptos"/>
+              </w:rPr>
+            </w:pPr>
+            <w:r>
+              <w:rPr>
+                <w:rFonts w:ascii="Aptos" w:eastAsia="Aptos" w:hAnsi="Aptos" w:cs="Aptos"/>
+                <w:b/>
+                <w:bCs/>
+              </w:rPr>
+              <w:t>Why the agent needs it</w:t>
+            </w:r>
+          </w:p>
+        </w:tc>
+      </w:tr>
+      <w:tr>
+        <w:trPr>
+          <w:trHeight w:val="285"/>
+        </w:trPr>
+        <w:tc>
+          <w:tcPr>
+            <w:tcW w:w="2820" w:type="dxa"/>
+            <w:tcMar>
+              <w:left w:w="105" w:type="dxa"/>
+              <w:right w:w="105" w:type="dxa"/>
+            </w:tcMar>
+          </w:tcPr>
+          <w:p>
+            <w:pPr>
+              <w:spacing w:after="0" w:line="278" w:lineRule="auto"/>
+            </w:pPr>
+            <w:r>
+              <w:rPr>
+                <w:rFonts w:ascii="Aptos" w:eastAsia="Aptos" w:hAnsi="Aptos" w:cs="Aptos"/>
+              </w:rPr>
+              <w:t>Brand Stewardship</w:t>
+            </w:r>
+          </w:p>
+        </w:tc>
+        <w:tc>
+          <w:tcPr>
+            <w:tcW w:w="6645" w:type="dxa"/>
+            <w:tcMar>
+              <w:left w:w="105" w:type="dxa"/>
+              <w:right w:w="105" w:type="dxa"/>
+            </w:tcMar>
+          </w:tcPr>
+          <w:p>
+            <w:r>
+              <w:rPr>
+                <w:rFonts w:ascii="Aptos" w:eastAsia="Aptos" w:hAnsi="Aptos" w:cs="Aptos"/>
+              </w:rPr>
+              <w:t xml:space="preserve">This means the Authority Manager AI agent should understand how </w:t>
+            </w:r>
+            <w:proofErr w:type="spellStart"/>
+            <w:r>
+              <w:rPr>
+                <w:rFonts w:ascii="Aptos" w:eastAsia="Aptos" w:hAnsi="Aptos" w:cs="Aptos"/>
+              </w:rPr>
+              <w:t>ViriVR</w:t>
+            </w:r>
+            <w:proofErr w:type="spellEnd"/>
+            <w:r>
+              <w:rPr>
+                <w:rFonts w:ascii="Aptos" w:eastAsia="Aptos" w:hAnsi="Aptos" w:cs="Aptos"/>
+              </w:rPr>
+              <w:t xml:space="preserve"> will present itself to others and determine whether the outputs from its three agents represent the brand in an appropriate, consistent and trustworthy manner. It shouldn't make unverifiable claims and represent </w:t>
+            </w:r>
+            <w:proofErr w:type="spellStart"/>
+            <w:r>
+              <w:rPr>
+                <w:rFonts w:ascii="Aptos" w:eastAsia="Aptos" w:hAnsi="Aptos" w:cs="Aptos"/>
+              </w:rPr>
+              <w:t>ViriVR</w:t>
+            </w:r>
+            <w:proofErr w:type="spellEnd"/>
+            <w:r>
+              <w:rPr>
+                <w:rFonts w:ascii="Aptos" w:eastAsia="Aptos" w:hAnsi="Aptos" w:cs="Aptos"/>
+              </w:rPr>
+              <w:t xml:space="preserve"> in an unprofessional manner that could damage the brand or credibility of the business. Instead, it should make sure the outputs look in a professional that meets </w:t>
+            </w:r>
+            <w:proofErr w:type="spellStart"/>
+            <w:r>
+              <w:rPr>
+                <w:rFonts w:ascii="Aptos" w:eastAsia="Aptos" w:hAnsi="Aptos" w:cs="Aptos"/>
+              </w:rPr>
+              <w:t>ViriVR’s</w:t>
+            </w:r>
+            <w:proofErr w:type="spellEnd"/>
+            <w:r>
+              <w:rPr>
+                <w:rFonts w:ascii="Aptos" w:eastAsia="Aptos" w:hAnsi="Aptos" w:cs="Aptos"/>
+              </w:rPr>
+              <w:t xml:space="preserve"> requirements, expectations and are targets the business’s intended audience</w:t>
+            </w:r>
+          </w:p>
+        </w:tc>
+      </w:tr>
+      <w:tr>
+        <w:trPr>
+          <w:trHeight w:val="285"/>
+        </w:trPr>
+        <w:tc>
+          <w:tcPr>
+            <w:tcW w:w="2820" w:type="dxa"/>
+            <w:tcMar>
+              <w:left w:w="105" w:type="dxa"/>
+              <w:right w:w="105" w:type="dxa"/>
+            </w:tcMar>
+          </w:tcPr>
+          <w:p>
+            <w:pPr>
+              <w:tabs>
+                <w:tab w:val="left" w:pos="0"/>
+                <w:tab w:val="left" w:pos="720"/>
+              </w:tabs>
+              <w:spacing w:line="257" w:lineRule="auto"/>
+              <w:rPr>
+                <w:rFonts w:ascii="Aptos" w:eastAsia="Aptos" w:hAnsi="Aptos" w:cs="Aptos"/>
+                <w:sz w:val="22"/>
+                <w:szCs w:val="22"/>
+              </w:rPr>
+            </w:pPr>
+            <w:r>
+              <w:rPr>
+                <w:rFonts w:ascii="Aptos" w:eastAsia="Aptos" w:hAnsi="Aptos" w:cs="Aptos"/>
+                <w:sz w:val="22"/>
+                <w:szCs w:val="22"/>
+              </w:rPr>
+              <w:t>Quality Assurance and Evaluation</w:t>
+            </w:r>
+          </w:p>
+          <w:p>
+            <w:pPr>
+              <w:spacing w:after="0" w:line="278" w:lineRule="auto"/>
+              <w:rPr>
+                <w:rFonts w:ascii="Aptos" w:eastAsia="Aptos" w:hAnsi="Aptos" w:cs="Aptos"/>
+              </w:rPr>
+            </w:pPr>
+          </w:p>
+        </w:tc>
+        <w:tc>
+          <w:tcPr>
+            <w:tcW w:w="6645" w:type="dxa"/>
+            <w:tcMar>
+              <w:left w:w="105" w:type="dxa"/>
+              <w:right w:w="105" w:type="dxa"/>
+            </w:tcMar>
+          </w:tcPr>
+          <w:p>
+            <w:pPr>
+              <w:spacing w:line="257" w:lineRule="auto"/>
+            </w:pPr>
+            <w:r>
+              <w:rPr>
+                <w:rFonts w:ascii="Aptos" w:eastAsia="Aptos" w:hAnsi="Aptos" w:cs="Aptos"/>
+                <w:sz w:val="22"/>
+                <w:szCs w:val="22"/>
+              </w:rPr>
+              <w:t xml:space="preserve">This one is about ensuring the Authority Manager AI agent should be able capable of reviewing the outputs of its three agents and be able to determine if </w:t>
+            </w:r>
+            <w:proofErr w:type="gramStart"/>
+            <w:r>
+              <w:rPr>
+                <w:rFonts w:ascii="Aptos" w:eastAsia="Aptos" w:hAnsi="Aptos" w:cs="Aptos"/>
+                <w:sz w:val="22"/>
+                <w:szCs w:val="22"/>
+              </w:rPr>
+              <w:t>its</w:t>
+            </w:r>
+            <w:proofErr w:type="gramEnd"/>
+            <w:r>
+              <w:rPr>
+                <w:rFonts w:ascii="Aptos" w:eastAsia="Aptos" w:hAnsi="Aptos" w:cs="Aptos"/>
+                <w:sz w:val="22"/>
+                <w:szCs w:val="22"/>
+              </w:rPr>
+              <w:t xml:space="preserve"> completed, relevant, credible and suitable for </w:t>
+            </w:r>
+            <w:proofErr w:type="spellStart"/>
+            <w:r>
+              <w:rPr>
+                <w:rFonts w:ascii="Aptos" w:eastAsia="Aptos" w:hAnsi="Aptos" w:cs="Aptos"/>
+                <w:sz w:val="22"/>
+                <w:szCs w:val="22"/>
+              </w:rPr>
+              <w:t>ViriVR</w:t>
+            </w:r>
+            <w:proofErr w:type="spellEnd"/>
+            <w:r>
+              <w:rPr>
+                <w:rFonts w:ascii="Aptos" w:eastAsia="Aptos" w:hAnsi="Aptos" w:cs="Aptos"/>
+                <w:sz w:val="22"/>
+                <w:szCs w:val="22"/>
+              </w:rPr>
+              <w:t xml:space="preserve"> to use. It should be able to identify weak, unverifiable or unsourced claims and </w:t>
+            </w:r>
+            <w:proofErr w:type="gramStart"/>
+            <w:r>
+              <w:rPr>
+                <w:rFonts w:ascii="Aptos" w:eastAsia="Aptos" w:hAnsi="Aptos" w:cs="Aptos"/>
+                <w:sz w:val="22"/>
+                <w:szCs w:val="22"/>
+              </w:rPr>
+              <w:t>opinions,</w:t>
+            </w:r>
+            <w:proofErr w:type="gramEnd"/>
+            <w:r>
+              <w:rPr>
+                <w:rFonts w:ascii="Aptos" w:eastAsia="Aptos" w:hAnsi="Aptos" w:cs="Aptos"/>
+                <w:sz w:val="22"/>
+                <w:szCs w:val="22"/>
+              </w:rPr>
+              <w:t xml:space="preserve"> that have weak brand authority, as well as factual inaccuracies and contradictions being displayed or presented as verified facts. Finally, the AI agent would need the capability to evaluate whether outputs meet the standards and requirements of </w:t>
+            </w:r>
+            <w:proofErr w:type="spellStart"/>
+            <w:r>
+              <w:rPr>
+                <w:rFonts w:ascii="Aptos" w:eastAsia="Aptos" w:hAnsi="Aptos" w:cs="Aptos"/>
+                <w:sz w:val="22"/>
+                <w:szCs w:val="22"/>
+              </w:rPr>
+              <w:t>ViriVR</w:t>
+            </w:r>
+            <w:proofErr w:type="spellEnd"/>
+            <w:r>
+              <w:rPr>
+                <w:rFonts w:ascii="Aptos" w:eastAsia="Aptos" w:hAnsi="Aptos" w:cs="Aptos"/>
+                <w:sz w:val="22"/>
+                <w:szCs w:val="22"/>
+              </w:rPr>
+              <w:t>.</w:t>
+            </w:r>
+          </w:p>
+        </w:tc>
+      </w:tr>
+      <w:tr>
+        <w:trPr>
+          <w:trHeight w:val="285"/>
+        </w:trPr>
+        <w:tc>
+          <w:tcPr>
+            <w:tcW w:w="2820" w:type="dxa"/>
+            <w:tcMar>
+              <w:left w:w="105" w:type="dxa"/>
+              <w:right w:w="105" w:type="dxa"/>
+            </w:tcMar>
+          </w:tcPr>
+          <w:p>
+            <w:pPr>
+              <w:spacing w:after="0" w:line="257" w:lineRule="auto"/>
+              <w:rPr>
+                <w:rFonts w:ascii="Aptos" w:eastAsia="Aptos" w:hAnsi="Aptos" w:cs="Aptos"/>
+                <w:sz w:val="22"/>
+                <w:szCs w:val="22"/>
+              </w:rPr>
+            </w:pPr>
+            <w:r>
+              <w:rPr>
+                <w:rFonts w:ascii="Aptos" w:eastAsia="Aptos" w:hAnsi="Aptos" w:cs="Aptos"/>
+                <w:sz w:val="22"/>
+                <w:szCs w:val="22"/>
+              </w:rPr>
+              <w:t>KPI and Performance Analysis</w:t>
+            </w:r>
+          </w:p>
+          <w:p>
+            <w:pPr>
+              <w:spacing w:after="0" w:line="278" w:lineRule="auto"/>
+              <w:rPr>
+                <w:rFonts w:ascii="Aptos" w:eastAsia="Aptos" w:hAnsi="Aptos" w:cs="Aptos"/>
+              </w:rPr>
+            </w:pPr>
+          </w:p>
+        </w:tc>
+        <w:tc>
+          <w:tcPr>
+            <w:tcW w:w="6645" w:type="dxa"/>
+            <w:tcMar>
+              <w:left w:w="105" w:type="dxa"/>
+              <w:right w:w="105" w:type="dxa"/>
+            </w:tcMar>
+          </w:tcPr>
+          <w:p>
+            <w:pPr>
+              <w:spacing w:line="257" w:lineRule="auto"/>
+            </w:pPr>
+            <w:r>
+              <w:rPr>
+                <w:rFonts w:ascii="Aptos" w:eastAsia="Aptos" w:hAnsi="Aptos" w:cs="Aptos"/>
+                <w:sz w:val="22"/>
+                <w:szCs w:val="22"/>
+              </w:rPr>
+              <w:t xml:space="preserve">The Authority Manager AI agent should be able to assess the performance of its three specialist ai agents against their approved individual KPIs. It should be able to compare those results and determine in which areas the AI agents are excelling or performing poorly and whether not any changes or improvements need to be made to produce improved </w:t>
+            </w:r>
+            <w:proofErr w:type="gramStart"/>
+            <w:r>
+              <w:rPr>
+                <w:rFonts w:ascii="Aptos" w:eastAsia="Aptos" w:hAnsi="Aptos" w:cs="Aptos"/>
+                <w:sz w:val="22"/>
+                <w:szCs w:val="22"/>
+              </w:rPr>
+              <w:t>outputs</w:t>
+            </w:r>
+            <w:proofErr w:type="gramEnd"/>
+            <w:r>
+              <w:rPr>
+                <w:rFonts w:ascii="Aptos" w:eastAsia="Aptos" w:hAnsi="Aptos" w:cs="Aptos"/>
+                <w:sz w:val="22"/>
+                <w:szCs w:val="22"/>
+              </w:rPr>
+              <w:t>. This would also all be reported and provided to the human role for further verification and validation.</w:t>
+            </w:r>
+          </w:p>
+        </w:tc>
+      </w:tr>
+    </w:tbl>
+    <w:p>
+      <w:pPr>
+        <w:spacing w:before="240" w:after="240"/>
+        <w:rPr>
+          <w:rFonts w:ascii="Aptos" w:eastAsia="Aptos" w:hAnsi="Aptos" w:cs="Aptos"/>
+          <w:color w:val="000000" w:themeColor="text1"/>
+        </w:rPr>
+      </w:pPr>
+    </w:p>
+    <w:p>
+      <w:pPr>
+        <w:spacing w:before="240" w:after="240"/>
+        <w:rPr>
+          <w:rFonts w:ascii="Aptos" w:eastAsia="Aptos" w:hAnsi="Aptos" w:cs="Aptos"/>
+          <w:color w:val="000000" w:themeColor="text1"/>
+        </w:rPr>
+      </w:pPr>
+    </w:p>
+    <w:p>
+      <w:pPr>
+        <w:spacing w:before="240" w:after="240"/>
+        <w:rPr>
+          <w:rFonts w:ascii="Aptos" w:eastAsia="Aptos" w:hAnsi="Aptos" w:cs="Aptos"/>
+          <w:color w:val="000000" w:themeColor="text1"/>
+        </w:rPr>
+      </w:pPr>
+    </w:p>
+    <w:p>
+      <w:pPr>
+        <w:spacing w:before="240" w:after="240"/>
+      </w:pPr>
+      <w:r>
+        <w:rPr>
+          <w:rFonts w:ascii="Aptos" w:eastAsia="Aptos" w:hAnsi="Aptos" w:cs="Aptos"/>
+          <w:color w:val="000000" w:themeColor="text1"/>
+        </w:rPr>
+        <w:lastRenderedPageBreak/>
+        <w:t>Original Skills – Temporarily stored</w:t>
       </w:r>
     </w:p>
     <w:tbl>
@@ -1332,19 +1734,7 @@
               <w:rPr>
                 <w:rFonts w:ascii="Aptos" w:eastAsia="Aptos" w:hAnsi="Aptos" w:cs="Aptos"/>
               </w:rPr>
-              <w:t xml:space="preserve">. The Authority Manager </w:t>
-            </w:r>
-            <w:r>
-              <w:rPr>
-                <w:rFonts w:ascii="Aptos" w:eastAsia="Aptos" w:hAnsi="Aptos" w:cs="Aptos"/>
-              </w:rPr>
-              <w:t>must</w:t>
-            </w:r>
-            <w:r>
-              <w:rPr>
-                <w:rFonts w:ascii="Aptos" w:eastAsia="Aptos" w:hAnsi="Aptos" w:cs="Aptos"/>
-              </w:rPr>
-              <w:t xml:space="preserve"> assess agent’s </w:t>
+              <w:t xml:space="preserve">. The Authority Manager must assess agent’s </w:t>
             </w:r>
             <w:proofErr w:type="gramStart"/>
             <w:r>
@@ -1403,13 +1793,7 @@
               <w:rPr>
                 <w:rFonts w:ascii="Aptos" w:eastAsia="Aptos" w:hAnsi="Aptos" w:cs="Aptos"/>
               </w:rPr>
-              <w:t>The Authority Manager must have a strong understanding of the concepts on digital and branding authority, this would include how to increase external trust, garner citations and links, traffic referrals from domain authority, brand visibility and enhance outreach. The</w:t>
-            </w:r>
-            <w:r>
-              <w:rPr>
-                <w:rFonts w:ascii="Aptos" w:eastAsia="Aptos" w:hAnsi="Aptos" w:cs="Aptos"/>
-              </w:rPr>
-              <w:t xml:space="preserve">y will determine </w:t>
+              <w:t xml:space="preserve">The Authority Manager must have a strong understanding of the concepts on digital and branding authority, this would include how to increase external trust, garner citations and links, traffic referrals from domain authority, brand visibility and enhance outreach. They will determine </w:t>
             </w:r>
             <w:proofErr w:type="gramStart"/>
             <w:r>
@@ -1423,37 +1807,7 @@
               <w:rPr>
                 <w:rFonts w:ascii="Aptos" w:eastAsia="Aptos" w:hAnsi="Aptos" w:cs="Aptos"/>
               </w:rPr>
-              <w:t xml:space="preserve"> </w:t>
-            </w:r>
-            <w:r>
-              <w:rPr>
-                <w:rFonts w:ascii="Aptos" w:eastAsia="Aptos" w:hAnsi="Aptos" w:cs="Aptos"/>
-              </w:rPr>
-              <w:t>a</w:t>
-            </w:r>
-            <w:r>
-              <w:rPr>
-                <w:rFonts w:ascii="Aptos" w:eastAsia="Aptos" w:hAnsi="Aptos" w:cs="Aptos"/>
-              </w:rPr>
-              <w:t xml:space="preserve"> suggestion or output from the AI </w:t>
-            </w:r>
-            <w:r>
-              <w:rPr>
-                <w:rFonts w:ascii="Aptos" w:eastAsia="Aptos" w:hAnsi="Aptos" w:cs="Aptos"/>
-              </w:rPr>
-              <w:t>agents for</w:t>
-            </w:r>
-            <w:r>
-              <w:rPr>
-                <w:rFonts w:ascii="Aptos" w:eastAsia="Aptos" w:hAnsi="Aptos" w:cs="Aptos"/>
-              </w:rPr>
-              <w:t xml:space="preserve"> </w:t>
-            </w:r>
-            <w:r>
-              <w:rPr>
-                <w:rFonts w:ascii="Aptos" w:eastAsia="Aptos" w:hAnsi="Aptos" w:cs="Aptos"/>
-              </w:rPr>
-              <w:t xml:space="preserve">a valid and effective business proposal or </w:t>
+              <w:t xml:space="preserve"> a suggestion or output from the AI agents for a valid and effective business proposal or </w:t>
             </w:r>
             <w:proofErr w:type="gramStart"/>
             <w:r>
@@ -1512,19 +1866,29 @@
               <w:rPr>
                 <w:rFonts w:ascii="Aptos" w:eastAsia="Aptos" w:hAnsi="Aptos" w:cs="Aptos"/>
               </w:rPr>
-              <w:t xml:space="preserve">The Authority Manager must understand ApsisVR’s strategic goals and wider business and marketing objectives. They must be able to develop and identify appropriate strategies and opportunities that are generated by the AI agents </w:t>
-            </w:r>
-            <w:r>
-              <w:rPr>
-                <w:rFonts w:ascii="Aptos" w:eastAsia="Aptos" w:hAnsi="Aptos" w:cs="Aptos"/>
-              </w:rPr>
-              <w:t>to understand</w:t>
-            </w:r>
-            <w:r>
-              <w:rPr>
-                <w:rFonts w:ascii="Aptos" w:eastAsia="Aptos" w:hAnsi="Aptos" w:cs="Aptos"/>
-              </w:rPr>
-              <w:t xml:space="preserve"> which outputs will improve the </w:t>
+              <w:t xml:space="preserve">The Authority Manager must understand </w:t>
+            </w:r>
+            <w:proofErr w:type="spellStart"/>
+            <w:r>
+              <w:rPr>
+                <w:rFonts w:ascii="Aptos" w:eastAsia="Aptos" w:hAnsi="Aptos" w:cs="Aptos"/>
+                <w:color w:val="000000" w:themeColor="text1"/>
+              </w:rPr>
+              <w:t>ViriVR’s</w:t>
+            </w:r>
+            <w:proofErr w:type="spellEnd"/>
+            <w:r>
+              <w:rPr>
+                <w:rFonts w:ascii="Aptos" w:eastAsia="Aptos" w:hAnsi="Aptos" w:cs="Aptos"/>
+                <w:color w:val="000000" w:themeColor="text1"/>
+              </w:rPr>
+              <w:t xml:space="preserve"> </w:t>
+            </w:r>
+            <w:r>
+              <w:rPr>
+                <w:rFonts w:ascii="Aptos" w:eastAsia="Aptos" w:hAnsi="Aptos" w:cs="Aptos"/>
+              </w:rPr>
+              <w:t xml:space="preserve">strategic goals and wider business and marketing objectives. They must be able to develop and identify appropriate strategies and opportunities that are generated by the AI agents to understand which outputs will improve the </w:t>
             </w:r>
             <w:proofErr w:type="gramStart"/>
             <w:r>
@@ -1659,49 +2023,7 @@
               <w:rPr>
                 <w:rFonts w:ascii="Aptos" w:eastAsia="Aptos" w:hAnsi="Aptos" w:cs="Aptos"/>
               </w:rPr>
-              <w:t xml:space="preserve"> strengths and weaknesses.  </w:t>
-            </w:r>
-            <w:r>
-              <w:rPr>
-                <w:rFonts w:ascii="Aptos" w:eastAsia="Aptos" w:hAnsi="Aptos" w:cs="Aptos"/>
-              </w:rPr>
-              <w:t>It's</w:t>
-            </w:r>
-            <w:r>
-              <w:rPr>
-                <w:rFonts w:ascii="Aptos" w:eastAsia="Aptos" w:hAnsi="Aptos" w:cs="Aptos"/>
-              </w:rPr>
-              <w:t xml:space="preserve"> important </w:t>
-            </w:r>
-            <w:r>
-              <w:rPr>
-                <w:rFonts w:ascii="Aptos" w:eastAsia="Aptos" w:hAnsi="Aptos" w:cs="Aptos"/>
-              </w:rPr>
-              <w:t xml:space="preserve">for the Authority Manager to </w:t>
-            </w:r>
-            <w:r>
-              <w:rPr>
-                <w:rFonts w:ascii="Aptos" w:eastAsia="Aptos" w:hAnsi="Aptos" w:cs="Aptos"/>
-              </w:rPr>
-              <w:t>be able to de</w:t>
-            </w:r>
-            <w:r>
-              <w:rPr>
-                <w:rFonts w:ascii="Aptos" w:eastAsia="Aptos" w:hAnsi="Aptos" w:cs="Aptos"/>
-              </w:rPr>
-              <w:t xml:space="preserve">termine </w:t>
-            </w:r>
-            <w:r>
-              <w:rPr>
-                <w:rFonts w:ascii="Aptos" w:eastAsia="Aptos" w:hAnsi="Aptos" w:cs="Aptos"/>
-              </w:rPr>
-              <w:t>if the outputs</w:t>
-            </w:r>
-            <w:r>
-              <w:rPr>
-                <w:rFonts w:ascii="Aptos" w:eastAsia="Aptos" w:hAnsi="Aptos" w:cs="Aptos"/>
-              </w:rPr>
-              <w:t xml:space="preserve"> </w:t>
+              <w:t xml:space="preserve"> strengths and weaknesses.  It's important for the Authority Manager to be able to determine if the outputs </w:t>
             </w:r>
           </w:p>
         </w:tc>
@@ -1741,7 +2063,6 @@
           <w:sz w:val="28"/>
           <w:szCs w:val="28"/>
         </w:rPr>
-        <w:lastRenderedPageBreak/>
         <w:br w:type="page"/>
       </w:r>
     </w:p>
@@ -1749,9 +2070,6 @@
       <w:pPr>
         <w:pStyle w:val="Heading3"/>
         <w:spacing w:before="281" w:after="281"/>
-        <w:rPr>
-          <w:rFonts w:ascii="Aptos" w:eastAsia="Aptos" w:hAnsi="Aptos" w:cs="Aptos"/>
-        </w:rPr>
       </w:pPr>
       <w:r>
         <w:rPr>
@@ -1766,10 +2084,6 @@
     <w:p>
       <w:pPr>
         <w:spacing w:before="240" w:after="240"/>
-        <w:rPr>
-          <w:rFonts w:ascii="Aptos" w:eastAsia="Aptos" w:hAnsi="Aptos" w:cs="Aptos"/>
-          <w:color w:val="000000" w:themeColor="text1"/>
-        </w:rPr>
       </w:pPr>
       <w:r>
         <w:rPr>
@@ -1782,37 +2096,390 @@
     <w:p>
       <w:pPr>
         <w:spacing w:before="240" w:after="240"/>
-        <w:rPr>
-          <w:rFonts w:ascii="Aptos" w:eastAsia="Aptos" w:hAnsi="Aptos" w:cs="Aptos"/>
-          <w:color w:val="000000" w:themeColor="text1"/>
-        </w:rPr>
-      </w:pPr>
-      <w:r>
-        <w:rPr>
-          <w:rFonts w:ascii="Aptos" w:eastAsia="Aptos" w:hAnsi="Aptos" w:cs="Aptos"/>
-          <w:b/>
-          <w:bCs/>
-          <w:color w:val="000000" w:themeColor="text1"/>
+      </w:pPr>
+      <w:r>
+        <w:rPr>
+          <w:rFonts w:ascii="Aptos" w:eastAsia="Aptos" w:hAnsi="Aptos" w:cs="Aptos"/>
+          <w:b/>
+          <w:bCs/>
+          <w:color w:val="000000" w:themeColor="text1"/>
+        </w:rPr>
+        <w:t>3 New Workflows</w:t>
+      </w:r>
+      <w:r>
+        <w:rPr>
+          <w:rFonts w:ascii="Aptos" w:eastAsia="Aptos" w:hAnsi="Aptos" w:cs="Aptos"/>
+          <w:color w:val="000000" w:themeColor="text1"/>
+        </w:rPr>
+        <w:t xml:space="preserve"> (09/09/2026)</w:t>
+      </w:r>
+    </w:p>
+    <w:p>
+      <w:pPr>
+        <w:spacing w:line="257" w:lineRule="auto"/>
+        <w:rPr>
+          <w:rFonts w:ascii="Aptos" w:eastAsia="Aptos" w:hAnsi="Aptos" w:cs="Aptos"/>
+          <w:b/>
+          <w:bCs/>
+          <w:sz w:val="22"/>
+          <w:szCs w:val="22"/>
+        </w:rPr>
+      </w:pPr>
+      <w:r>
+        <w:rPr>
+          <w:rFonts w:ascii="Aptos" w:eastAsia="Aptos" w:hAnsi="Aptos" w:cs="Aptos"/>
+          <w:b/>
+          <w:bCs/>
+          <w:sz w:val="22"/>
+          <w:szCs w:val="22"/>
+        </w:rPr>
+        <w:t>1. Receiving Input, Validation, Work Allocation and Routing</w:t>
+      </w:r>
+    </w:p>
+    <w:p>
+      <w:pPr>
+        <w:spacing w:line="257" w:lineRule="auto"/>
+      </w:pPr>
+      <w:r>
+        <w:rPr>
+          <w:rFonts w:ascii="Aptos" w:eastAsia="Aptos" w:hAnsi="Aptos" w:cs="Aptos"/>
+          <w:sz w:val="22"/>
+          <w:szCs w:val="22"/>
+        </w:rPr>
+        <w:t>Step 1: Receive the input or work request. This can include a website XML file, new website content page, specialist output or other approved material.</w:t>
+      </w:r>
+    </w:p>
+    <w:p>
+      <w:pPr>
+        <w:spacing w:line="257" w:lineRule="auto"/>
+      </w:pPr>
+      <w:r>
+        <w:rPr>
+          <w:rFonts w:ascii="Aptos" w:eastAsia="Aptos" w:hAnsi="Aptos" w:cs="Aptos"/>
+          <w:sz w:val="22"/>
+          <w:szCs w:val="22"/>
+        </w:rPr>
+        <w:t>Step 2: Check and confirm if the input and requested work belongs within the Authority Manager team’s responsibilities and scope.</w:t>
+      </w:r>
+    </w:p>
+    <w:p>
+      <w:pPr>
+        <w:spacing w:line="257" w:lineRule="auto"/>
+      </w:pPr>
+      <w:r>
+        <w:rPr>
+          <w:rFonts w:ascii="Aptos" w:eastAsia="Aptos" w:hAnsi="Aptos" w:cs="Aptos"/>
+          <w:sz w:val="22"/>
+          <w:szCs w:val="22"/>
+        </w:rPr>
+        <w:t>Step 3: Apply the Definition of Ready and confirm if the required information is available. This would include the objective, target audience, approved inputs and sources, Acceptance Criteria, supporting documentation and any required tools or necessary permissions.</w:t>
+      </w:r>
+    </w:p>
+    <w:p>
+      <w:pPr>
+        <w:spacing w:line="257" w:lineRule="auto"/>
+        <w:rPr>
+          <w:rFonts w:ascii="Aptos" w:eastAsia="Aptos" w:hAnsi="Aptos" w:cs="Aptos"/>
+          <w:sz w:val="22"/>
+          <w:szCs w:val="22"/>
+        </w:rPr>
+      </w:pPr>
+      <w:r>
+        <w:rPr>
+          <w:rFonts w:ascii="Aptos" w:eastAsia="Aptos" w:hAnsi="Aptos" w:cs="Aptos"/>
+          <w:sz w:val="22"/>
+          <w:szCs w:val="22"/>
+        </w:rPr>
+        <w:t xml:space="preserve">Step 4: Verify and identify if there are any conflicts, missing information, unclear requirements or unavailable sources. </w:t>
+      </w:r>
+    </w:p>
+    <w:p>
+      <w:pPr>
+        <w:spacing w:line="257" w:lineRule="auto"/>
+      </w:pPr>
+      <w:r>
+        <w:rPr>
+          <w:rFonts w:ascii="Aptos" w:eastAsia="Aptos" w:hAnsi="Aptos" w:cs="Aptos"/>
+          <w:sz w:val="22"/>
+          <w:szCs w:val="22"/>
+        </w:rPr>
+        <w:t>Step 5: Escalate any unresolved issues or blockers, complications or flags where necessary before the work proceeds.</w:t>
+      </w:r>
+    </w:p>
+    <w:p>
+      <w:pPr>
+        <w:spacing w:line="257" w:lineRule="auto"/>
+        <w:rPr>
+          <w:rFonts w:ascii="Aptos" w:eastAsia="Aptos" w:hAnsi="Aptos" w:cs="Aptos"/>
+          <w:sz w:val="22"/>
+          <w:szCs w:val="22"/>
+        </w:rPr>
+      </w:pPr>
+      <w:r>
+        <w:rPr>
+          <w:rFonts w:ascii="Aptos" w:eastAsia="Aptos" w:hAnsi="Aptos" w:cs="Aptos"/>
+          <w:sz w:val="22"/>
+          <w:szCs w:val="22"/>
+        </w:rPr>
+        <w:t xml:space="preserve">Step 6: Determine how the work should be handled, either by specialist agent or by the Authority </w:t>
+      </w:r>
+      <w:proofErr w:type="gramStart"/>
+      <w:r>
+        <w:rPr>
+          <w:rFonts w:ascii="Aptos" w:eastAsia="Aptos" w:hAnsi="Aptos" w:cs="Aptos"/>
+          <w:sz w:val="22"/>
+          <w:szCs w:val="22"/>
+        </w:rPr>
+        <w:t>Manager</w:t>
+      </w:r>
+      <w:proofErr w:type="gramEnd"/>
+      <w:r>
+        <w:rPr>
+          <w:rFonts w:ascii="Aptos" w:eastAsia="Aptos" w:hAnsi="Aptos" w:cs="Aptos"/>
+          <w:sz w:val="22"/>
+          <w:szCs w:val="22"/>
+        </w:rPr>
+        <w:t xml:space="preserve"> where it may conduct a content audit. </w:t>
+      </w:r>
+    </w:p>
+    <w:p>
+      <w:pPr>
+        <w:spacing w:line="257" w:lineRule="auto"/>
+      </w:pPr>
+      <w:r>
+        <w:rPr>
+          <w:rFonts w:ascii="Aptos" w:eastAsia="Aptos" w:hAnsi="Aptos" w:cs="Aptos"/>
+          <w:sz w:val="22"/>
+          <w:szCs w:val="22"/>
+        </w:rPr>
+        <w:t xml:space="preserve">Step 7: If work requires </w:t>
+      </w:r>
+      <w:proofErr w:type="gramStart"/>
+      <w:r>
+        <w:rPr>
+          <w:rFonts w:ascii="Aptos" w:eastAsia="Aptos" w:hAnsi="Aptos" w:cs="Aptos"/>
+          <w:sz w:val="22"/>
+          <w:szCs w:val="22"/>
+        </w:rPr>
+        <w:t>the specialist</w:t>
+      </w:r>
+      <w:proofErr w:type="gramEnd"/>
+      <w:r>
+        <w:rPr>
+          <w:rFonts w:ascii="Aptos" w:eastAsia="Aptos" w:hAnsi="Aptos" w:cs="Aptos"/>
+          <w:sz w:val="22"/>
+          <w:szCs w:val="22"/>
+        </w:rPr>
+        <w:t xml:space="preserve"> agents, the Authority Manager would prepare the work package with its objective, approved inputs and sources, requirements, Acceptance Criteria, expected output, constraints and any relevant dependencies or supporting documentation.</w:t>
+      </w:r>
+    </w:p>
+    <w:p>
+      <w:pPr>
+        <w:spacing w:line="257" w:lineRule="auto"/>
+      </w:pPr>
+      <w:r>
+        <w:rPr>
+          <w:rFonts w:ascii="Aptos" w:eastAsia="Aptos" w:hAnsi="Aptos" w:cs="Aptos"/>
+          <w:b/>
+          <w:bCs/>
+          <w:sz w:val="22"/>
+          <w:szCs w:val="22"/>
+        </w:rPr>
+        <w:t>Output</w:t>
+      </w:r>
+      <w:r>
+        <w:rPr>
+          <w:rFonts w:ascii="Aptos" w:eastAsia="Aptos" w:hAnsi="Aptos" w:cs="Aptos"/>
+          <w:sz w:val="22"/>
+          <w:szCs w:val="22"/>
+        </w:rPr>
+        <w:t>: Approved Work Package</w:t>
+      </w:r>
+    </w:p>
+    <w:p>
+      <w:pPr>
+        <w:spacing w:line="257" w:lineRule="auto"/>
+      </w:pPr>
+      <w:r>
+        <w:rPr>
+          <w:rFonts w:ascii="Aptos" w:eastAsia="Aptos" w:hAnsi="Aptos" w:cs="Aptos"/>
+          <w:b/>
+          <w:bCs/>
+          <w:sz w:val="22"/>
+          <w:szCs w:val="22"/>
+        </w:rPr>
+        <w:t xml:space="preserve"> </w:t>
+      </w:r>
+    </w:p>
+    <w:p>
+      <w:pPr>
+        <w:spacing w:line="257" w:lineRule="auto"/>
+      </w:pPr>
+      <w:r>
+        <w:rPr>
+          <w:rFonts w:ascii="Aptos" w:eastAsia="Aptos" w:hAnsi="Aptos" w:cs="Aptos"/>
+          <w:b/>
+          <w:bCs/>
+          <w:sz w:val="22"/>
+          <w:szCs w:val="22"/>
+        </w:rPr>
+        <w:t>2</w:t>
+      </w:r>
+      <w:proofErr w:type="gramStart"/>
+      <w:r>
+        <w:rPr>
+          <w:rFonts w:ascii="Aptos" w:eastAsia="Aptos" w:hAnsi="Aptos" w:cs="Aptos"/>
+          <w:b/>
+          <w:bCs/>
+          <w:sz w:val="22"/>
+          <w:szCs w:val="22"/>
+        </w:rPr>
+        <w:t>.  Preliminary</w:t>
+      </w:r>
+      <w:proofErr w:type="gramEnd"/>
+      <w:r>
+        <w:rPr>
+          <w:rFonts w:ascii="Aptos" w:eastAsia="Aptos" w:hAnsi="Aptos" w:cs="Aptos"/>
+          <w:b/>
+          <w:bCs/>
+          <w:sz w:val="22"/>
+          <w:szCs w:val="22"/>
+        </w:rPr>
+        <w:t xml:space="preserve"> Content and Authority Audit, Quality and Brand Review</w:t>
+      </w:r>
+    </w:p>
+    <w:p>
+      <w:pPr>
+        <w:spacing w:line="257" w:lineRule="auto"/>
+      </w:pPr>
+      <w:r>
+        <w:rPr>
+          <w:rFonts w:ascii="Aptos" w:eastAsia="Aptos" w:hAnsi="Aptos" w:cs="Aptos"/>
+          <w:b/>
+          <w:bCs/>
+          <w:sz w:val="22"/>
+          <w:szCs w:val="22"/>
         </w:rPr>
         <w:t>Step 1:</w:t>
       </w:r>
       <w:r>
         <w:rPr>
           <w:rFonts w:ascii="Aptos" w:eastAsia="Aptos" w:hAnsi="Aptos" w:cs="Aptos"/>
-          <w:b/>
-          <w:bCs/>
-          <w:color w:val="000000" w:themeColor="text1"/>
+          <w:sz w:val="22"/>
+          <w:szCs w:val="22"/>
+        </w:rPr>
+        <w:t xml:space="preserve"> Receive completed content. This can include landing pages, website pages, new or revised content pages or any other content that can be identified through a website xml file as well as any other supporting documentation. The Authority Manager should be able to identify exactly what is being audited and what </w:t>
+      </w:r>
+      <w:proofErr w:type="gramStart"/>
+      <w:r>
+        <w:rPr>
+          <w:rFonts w:ascii="Aptos" w:eastAsia="Aptos" w:hAnsi="Aptos" w:cs="Aptos"/>
+          <w:sz w:val="22"/>
+          <w:szCs w:val="22"/>
+        </w:rPr>
+        <w:t>is the purpose of the content</w:t>
+      </w:r>
+      <w:proofErr w:type="gramEnd"/>
+      <w:r>
+        <w:rPr>
+          <w:rFonts w:ascii="Aptos" w:eastAsia="Aptos" w:hAnsi="Aptos" w:cs="Aptos"/>
+          <w:sz w:val="22"/>
+          <w:szCs w:val="22"/>
+        </w:rPr>
+        <w:t>.</w:t>
+      </w:r>
+    </w:p>
+    <w:p>
+      <w:pPr>
+        <w:spacing w:line="257" w:lineRule="auto"/>
+        <w:rPr>
+          <w:rFonts w:ascii="Aptos" w:eastAsia="Aptos" w:hAnsi="Aptos" w:cs="Aptos"/>
+          <w:sz w:val="22"/>
+          <w:szCs w:val="22"/>
+        </w:rPr>
+      </w:pPr>
+      <w:r>
+        <w:rPr>
+          <w:rFonts w:ascii="Aptos" w:eastAsia="Aptos" w:hAnsi="Aptos" w:cs="Aptos"/>
+          <w:b/>
+          <w:bCs/>
+          <w:sz w:val="22"/>
+          <w:szCs w:val="22"/>
+        </w:rPr>
+        <w:t>Step 2:</w:t>
+      </w:r>
+      <w:r>
+        <w:rPr>
+          <w:rFonts w:ascii="Aptos" w:eastAsia="Aptos" w:hAnsi="Aptos" w:cs="Aptos"/>
+          <w:sz w:val="22"/>
+          <w:szCs w:val="22"/>
+        </w:rPr>
+        <w:t xml:space="preserve"> Check the completeness and relevance of the work and confirm if it meets the defined requirements, Definition of Done and Acceptance Criteria. </w:t>
+      </w:r>
+    </w:p>
+    <w:p>
+      <w:pPr>
+        <w:spacing w:line="257" w:lineRule="auto"/>
+      </w:pPr>
+      <w:r>
+        <w:rPr>
+          <w:rFonts w:ascii="Aptos" w:eastAsia="Aptos" w:hAnsi="Aptos" w:cs="Aptos"/>
+          <w:b/>
+          <w:bCs/>
+          <w:sz w:val="22"/>
+          <w:szCs w:val="22"/>
+        </w:rPr>
+        <w:t>Step 3:</w:t>
+      </w:r>
+      <w:r>
+        <w:rPr>
+          <w:rFonts w:ascii="Aptos" w:eastAsia="Aptos" w:hAnsi="Aptos" w:cs="Aptos"/>
+          <w:sz w:val="22"/>
+          <w:szCs w:val="22"/>
         </w:rPr>
         <w:t xml:space="preserve"> </w:t>
       </w:r>
       <w:r>
         <w:rPr>
           <w:rFonts w:ascii="Aptos" w:eastAsia="Aptos" w:hAnsi="Aptos" w:cs="Aptos"/>
-          <w:b/>
-          <w:bCs/>
-          <w:color w:val="000000" w:themeColor="text1"/>
-        </w:rPr>
-        <w:t>Validate the request is ready and within scope</w:t>
+          <w:sz w:val="22"/>
+          <w:szCs w:val="22"/>
+          <w:lang w:val="en-AU"/>
+        </w:rPr>
+        <w:t>Review and validate the evidence, sources and factual claims to ensure they are traceable and supported by approved sources. Identify unsupported, unverifiable or conflicting claims rather than treating them as facts. Where a source-quality or authority measurement framework has been approved, record the relative strength or credibility of the supporting sources according to that framework.</w:t>
+      </w:r>
+    </w:p>
+    <w:p>
+      <w:pPr>
+        <w:spacing w:before="240" w:after="240"/>
+      </w:pPr>
+      <w:r>
+        <w:rPr>
+          <w:rFonts w:ascii="Aptos" w:eastAsia="Aptos" w:hAnsi="Aptos" w:cs="Aptos"/>
+          <w:b/>
+          <w:bCs/>
+          <w:sz w:val="22"/>
+          <w:szCs w:val="22"/>
+        </w:rPr>
+        <w:lastRenderedPageBreak/>
+        <w:t>Step 4:</w:t>
+      </w:r>
+      <w:r>
+        <w:rPr>
+          <w:rFonts w:ascii="Aptos" w:eastAsia="Aptos" w:hAnsi="Aptos" w:cs="Aptos"/>
+          <w:sz w:val="22"/>
+          <w:szCs w:val="22"/>
+        </w:rPr>
+        <w:t xml:space="preserve"> </w:t>
+      </w:r>
+      <w:r>
+        <w:rPr>
+          <w:rFonts w:ascii="Aptos" w:eastAsia="Aptos" w:hAnsi="Aptos" w:cs="Aptos"/>
+          <w:sz w:val="22"/>
+          <w:szCs w:val="22"/>
+          <w:lang w:val="en-AU"/>
+        </w:rPr>
+        <w:t>Review the content against these five quality gates:</w:t>
       </w:r>
       <w:r>
         <w:br/>
@@ -1820,37 +2487,833 @@
       <w:r>
         <w:rPr>
           <w:rFonts w:ascii="Aptos" w:eastAsia="Aptos" w:hAnsi="Aptos" w:cs="Aptos"/>
-          <w:color w:val="000000" w:themeColor="text1"/>
-        </w:rPr>
-        <w:t xml:space="preserve"> →</w:t>
-      </w:r>
-      <w:r>
-        <w:rPr>
-          <w:rFonts w:ascii="Aptos" w:eastAsia="Aptos" w:hAnsi="Aptos" w:cs="Aptos"/>
-          <w:color w:val="000000" w:themeColor="text1"/>
+          <w:sz w:val="22"/>
+          <w:szCs w:val="22"/>
+          <w:lang w:val="en-AU"/>
+        </w:rPr>
+        <w:t xml:space="preserve">Completeness: Does the content contain all required information? </w:t>
+      </w:r>
+      <w:r>
+        <w:br/>
+      </w:r>
+      <w:r>
+        <w:rPr>
+          <w:rFonts w:ascii="Aptos" w:eastAsia="Aptos" w:hAnsi="Aptos" w:cs="Aptos"/>
+          <w:sz w:val="22"/>
+          <w:szCs w:val="22"/>
+          <w:lang w:val="en-AU"/>
+        </w:rPr>
+        <w:t xml:space="preserve">Correctness: Are factual claims accurate and supported by approved evidence? </w:t>
+      </w:r>
+      <w:r>
+        <w:br/>
+      </w:r>
+      <w:r>
+        <w:rPr>
+          <w:rFonts w:ascii="Aptos" w:eastAsia="Aptos" w:hAnsi="Aptos" w:cs="Aptos"/>
+          <w:sz w:val="22"/>
+          <w:szCs w:val="22"/>
+          <w:lang w:val="en-AU"/>
+        </w:rPr>
+        <w:t xml:space="preserve">Relevance: Is the content appropriate for the intended audience and </w:t>
+      </w:r>
+      <w:proofErr w:type="spellStart"/>
+      <w:r>
+        <w:rPr>
+          <w:rFonts w:ascii="Aptos" w:eastAsia="Aptos" w:hAnsi="Aptos" w:cs="Aptos"/>
+          <w:sz w:val="22"/>
+          <w:szCs w:val="22"/>
+          <w:lang w:val="en-AU"/>
+        </w:rPr>
+        <w:t>ViriVR's</w:t>
+      </w:r>
+      <w:proofErr w:type="spellEnd"/>
+      <w:r>
+        <w:rPr>
+          <w:rFonts w:ascii="Aptos" w:eastAsia="Aptos" w:hAnsi="Aptos" w:cs="Aptos"/>
+          <w:sz w:val="22"/>
+          <w:szCs w:val="22"/>
+          <w:lang w:val="en-AU"/>
+        </w:rPr>
+        <w:t xml:space="preserve"> business goals and objectives? </w:t>
+      </w:r>
+      <w:r>
+        <w:br/>
+      </w:r>
+      <w:r>
+        <w:rPr>
+          <w:rFonts w:ascii="Aptos" w:eastAsia="Aptos" w:hAnsi="Aptos" w:cs="Aptos"/>
+          <w:sz w:val="22"/>
+          <w:szCs w:val="22"/>
+          <w:lang w:val="en-AU"/>
+        </w:rPr>
+        <w:t xml:space="preserve">Consistency: </w:t>
+      </w:r>
+      <w:proofErr w:type="gramStart"/>
+      <w:r>
+        <w:rPr>
+          <w:rFonts w:ascii="Aptos" w:eastAsia="Aptos" w:hAnsi="Aptos" w:cs="Aptos"/>
+          <w:sz w:val="22"/>
+          <w:szCs w:val="22"/>
+          <w:lang w:val="en-AU"/>
+        </w:rPr>
+        <w:t>Is</w:t>
+      </w:r>
+      <w:proofErr w:type="gramEnd"/>
+      <w:r>
+        <w:rPr>
+          <w:rFonts w:ascii="Aptos" w:eastAsia="Aptos" w:hAnsi="Aptos" w:cs="Aptos"/>
+          <w:sz w:val="22"/>
+          <w:szCs w:val="22"/>
+          <w:lang w:val="en-AU"/>
+        </w:rPr>
+        <w:t xml:space="preserve"> the information, wording and presentation consistent with approved sources, brand requirements and related website content? </w:t>
+      </w:r>
+      <w:r>
+        <w:br/>
+      </w:r>
+      <w:r>
+        <w:rPr>
+          <w:rFonts w:ascii="Aptos" w:eastAsia="Aptos" w:hAnsi="Aptos" w:cs="Aptos"/>
+          <w:sz w:val="22"/>
+          <w:szCs w:val="22"/>
+          <w:lang w:val="en-AU"/>
+        </w:rPr>
+        <w:t xml:space="preserve">Safety: Does the content avoid misleading, harmful or inappropriate claims, language or presentation that could create risk for </w:t>
+      </w:r>
+      <w:proofErr w:type="spellStart"/>
+      <w:r>
+        <w:rPr>
+          <w:rFonts w:ascii="Aptos" w:eastAsia="Aptos" w:hAnsi="Aptos" w:cs="Aptos"/>
+          <w:sz w:val="22"/>
+          <w:szCs w:val="22"/>
+          <w:lang w:val="en-AU"/>
+        </w:rPr>
+        <w:t>ViriVR</w:t>
+      </w:r>
+      <w:proofErr w:type="spellEnd"/>
+      <w:r>
+        <w:rPr>
+          <w:rFonts w:ascii="Aptos" w:eastAsia="Aptos" w:hAnsi="Aptos" w:cs="Aptos"/>
+          <w:sz w:val="22"/>
+          <w:szCs w:val="22"/>
+          <w:lang w:val="en-AU"/>
+        </w:rPr>
+        <w:t xml:space="preserve">? </w:t>
+      </w:r>
+      <w:r>
+        <w:br/>
+      </w:r>
+      <w:r>
+        <w:rPr>
+          <w:rFonts w:ascii="Aptos" w:eastAsia="Aptos" w:hAnsi="Aptos" w:cs="Aptos"/>
+          <w:sz w:val="22"/>
+          <w:szCs w:val="22"/>
+          <w:lang w:val="en-AU"/>
+        </w:rPr>
+        <w:t>Any issues or failings of these quality gates should be documented.</w:t>
+      </w:r>
+    </w:p>
+    <w:p>
+      <w:pPr>
+        <w:spacing w:line="257" w:lineRule="auto"/>
+      </w:pPr>
+      <w:r>
+        <w:rPr>
+          <w:rFonts w:ascii="Aptos" w:eastAsia="Aptos" w:hAnsi="Aptos" w:cs="Aptos"/>
+          <w:b/>
+          <w:bCs/>
+          <w:sz w:val="22"/>
+          <w:szCs w:val="22"/>
+        </w:rPr>
+        <w:t>Step 5:</w:t>
+      </w:r>
+      <w:r>
+        <w:rPr>
+          <w:rFonts w:ascii="Aptos" w:eastAsia="Aptos" w:hAnsi="Aptos" w:cs="Aptos"/>
+          <w:sz w:val="22"/>
+          <w:szCs w:val="22"/>
+        </w:rPr>
+        <w:t xml:space="preserve"> Identify strengths, weaknesses and issues with the content. </w:t>
+      </w:r>
+      <w:r>
+        <w:br/>
+      </w:r>
+      <w:r>
+        <w:rPr>
+          <w:rFonts w:ascii="Aptos" w:eastAsia="Aptos" w:hAnsi="Aptos" w:cs="Aptos"/>
+          <w:sz w:val="22"/>
+          <w:szCs w:val="22"/>
+          <w:lang w:val="en-AU"/>
+        </w:rPr>
+        <w:t xml:space="preserve">Strengths could include; topic relevance, strong and accurate evidence, useful information, a clear explanation of services, appropriate audience targeting, relevant keyword and topic coverage, content with potential to attract citations or links, and alignment with </w:t>
+      </w:r>
+      <w:proofErr w:type="spellStart"/>
+      <w:r>
+        <w:rPr>
+          <w:rFonts w:ascii="Aptos" w:eastAsia="Aptos" w:hAnsi="Aptos" w:cs="Aptos"/>
+          <w:sz w:val="22"/>
+          <w:szCs w:val="22"/>
+          <w:lang w:val="en-AU"/>
+        </w:rPr>
+        <w:t>ViriVR's</w:t>
+      </w:r>
+      <w:proofErr w:type="spellEnd"/>
+      <w:r>
+        <w:rPr>
+          <w:rFonts w:ascii="Aptos" w:eastAsia="Aptos" w:hAnsi="Aptos" w:cs="Aptos"/>
+          <w:sz w:val="22"/>
+          <w:szCs w:val="22"/>
+          <w:lang w:val="en-AU"/>
+        </w:rPr>
+        <w:t xml:space="preserve"> brand positioning.</w:t>
+      </w:r>
+      <w:r>
+        <w:rPr>
+          <w:rFonts w:ascii="Aptos" w:eastAsia="Aptos" w:hAnsi="Aptos" w:cs="Aptos"/>
+          <w:sz w:val="22"/>
+          <w:szCs w:val="22"/>
         </w:rPr>
         <w:t xml:space="preserve"> </w:t>
       </w:r>
       <w:r>
-        <w:rPr>
-          <w:rFonts w:ascii="Aptos" w:eastAsia="Aptos" w:hAnsi="Aptos" w:cs="Aptos"/>
-          <w:color w:val="000000" w:themeColor="text1"/>
-        </w:rPr>
-        <w:t>The Authority Manager will check whether the request is ready, completed and within the AI agent's scope. If there are missing fields,</w:t>
-      </w:r>
-      <w:r>
-        <w:rPr>
-          <w:rFonts w:ascii="Aptos" w:eastAsia="Aptos" w:hAnsi="Aptos" w:cs="Aptos"/>
-          <w:color w:val="000000" w:themeColor="text1"/>
-        </w:rPr>
-        <w:t xml:space="preserve"> incorrect </w:t>
-      </w:r>
-      <w:r>
-        <w:rPr>
-          <w:rFonts w:ascii="Aptos" w:eastAsia="Aptos" w:hAnsi="Aptos" w:cs="Aptos"/>
-          <w:color w:val="000000" w:themeColor="text1"/>
-        </w:rPr>
-        <w:t xml:space="preserve">information or its outside the AI agents scope the request will be denied or escalated if necessary. </w:t>
+        <w:br/>
+      </w:r>
+      <w:r>
+        <w:rPr>
+          <w:rFonts w:ascii="Aptos" w:eastAsia="Aptos" w:hAnsi="Aptos" w:cs="Aptos"/>
+          <w:sz w:val="22"/>
+          <w:szCs w:val="22"/>
+        </w:rPr>
+        <w:t xml:space="preserve">Weaknesses could include; off topic relevancy or targeting wrong audience, weak or unsupported evidence and claims, inconsistence wording and language, poor structure or presentation, limited authority signals, and misleading the brands representation and goals. </w:t>
+      </w:r>
+    </w:p>
+    <w:p>
+      <w:pPr>
+        <w:spacing w:line="257" w:lineRule="auto"/>
+      </w:pPr>
+      <w:r>
+        <w:rPr>
+          <w:rFonts w:ascii="Aptos" w:eastAsia="Aptos" w:hAnsi="Aptos" w:cs="Aptos"/>
+          <w:b/>
+          <w:bCs/>
+          <w:sz w:val="22"/>
+          <w:szCs w:val="22"/>
+        </w:rPr>
+        <w:t xml:space="preserve">Step 6: </w:t>
+      </w:r>
+      <w:r>
+        <w:rPr>
+          <w:rFonts w:ascii="Aptos" w:eastAsia="Aptos" w:hAnsi="Aptos" w:cs="Aptos"/>
+          <w:sz w:val="22"/>
+          <w:szCs w:val="22"/>
+          <w:lang w:val="en-AU"/>
+        </w:rPr>
+        <w:t xml:space="preserve">Identify how the content may positively or negatively impact </w:t>
+      </w:r>
+      <w:proofErr w:type="spellStart"/>
+      <w:r>
+        <w:rPr>
+          <w:rFonts w:ascii="Aptos" w:eastAsia="Aptos" w:hAnsi="Aptos" w:cs="Aptos"/>
+          <w:sz w:val="22"/>
+          <w:szCs w:val="22"/>
+          <w:lang w:val="en-AU"/>
+        </w:rPr>
+        <w:t>ViriVR's</w:t>
+      </w:r>
+      <w:proofErr w:type="spellEnd"/>
+      <w:r>
+        <w:rPr>
+          <w:rFonts w:ascii="Aptos" w:eastAsia="Aptos" w:hAnsi="Aptos" w:cs="Aptos"/>
+          <w:sz w:val="22"/>
+          <w:szCs w:val="22"/>
+          <w:lang w:val="en-AU"/>
+        </w:rPr>
+        <w:t xml:space="preserve"> SEO, search visibility, topic relevance, external trust or credibility, citations, links and backlinks and brand authority. It should explain the potential impact without inventing or guaranteeing SEO results that cannot be supported by evidence.</w:t>
+      </w:r>
+    </w:p>
+    <w:p>
+      <w:pPr>
+        <w:spacing w:line="257" w:lineRule="auto"/>
+      </w:pPr>
+      <w:r>
+        <w:rPr>
+          <w:rFonts w:ascii="Aptos" w:eastAsia="Aptos" w:hAnsi="Aptos" w:cs="Aptos"/>
+          <w:b/>
+          <w:bCs/>
+          <w:sz w:val="22"/>
+          <w:szCs w:val="22"/>
+        </w:rPr>
+        <w:t>Step 7:</w:t>
+      </w:r>
+      <w:r>
+        <w:rPr>
+          <w:rFonts w:ascii="Aptos" w:eastAsia="Aptos" w:hAnsi="Aptos" w:cs="Aptos"/>
+          <w:sz w:val="22"/>
+          <w:szCs w:val="22"/>
+        </w:rPr>
+        <w:t xml:space="preserve"> </w:t>
+      </w:r>
+      <w:r>
+        <w:rPr>
+          <w:rFonts w:ascii="Aptos" w:eastAsia="Aptos" w:hAnsi="Aptos" w:cs="Aptos"/>
+          <w:sz w:val="22"/>
+          <w:szCs w:val="22"/>
+          <w:lang w:val="en-AU"/>
+        </w:rPr>
+        <w:t xml:space="preserve">Check whether the content represents </w:t>
+      </w:r>
+      <w:proofErr w:type="spellStart"/>
+      <w:r>
+        <w:rPr>
+          <w:rFonts w:ascii="Aptos" w:eastAsia="Aptos" w:hAnsi="Aptos" w:cs="Aptos"/>
+          <w:sz w:val="22"/>
+          <w:szCs w:val="22"/>
+          <w:lang w:val="en-AU"/>
+        </w:rPr>
+        <w:t>ViriVR's</w:t>
+      </w:r>
+      <w:proofErr w:type="spellEnd"/>
+      <w:r>
+        <w:rPr>
+          <w:rFonts w:ascii="Aptos" w:eastAsia="Aptos" w:hAnsi="Aptos" w:cs="Aptos"/>
+          <w:sz w:val="22"/>
+          <w:szCs w:val="22"/>
+          <w:lang w:val="en-AU"/>
+        </w:rPr>
+        <w:t xml:space="preserve"> brand accurately, appropriately and professionally in accordance with approved brand guidelines and business requirements. This includes checking whether the content correctly describes </w:t>
+      </w:r>
+      <w:proofErr w:type="spellStart"/>
+      <w:r>
+        <w:rPr>
+          <w:rFonts w:ascii="Aptos" w:eastAsia="Aptos" w:hAnsi="Aptos" w:cs="Aptos"/>
+          <w:sz w:val="22"/>
+          <w:szCs w:val="22"/>
+          <w:lang w:val="en-AU"/>
+        </w:rPr>
+        <w:t>ViriVR</w:t>
+      </w:r>
+      <w:proofErr w:type="spellEnd"/>
+      <w:r>
+        <w:rPr>
+          <w:rFonts w:ascii="Aptos" w:eastAsia="Aptos" w:hAnsi="Aptos" w:cs="Aptos"/>
+          <w:sz w:val="22"/>
+          <w:szCs w:val="22"/>
+          <w:lang w:val="en-AU"/>
+        </w:rPr>
+        <w:t xml:space="preserve"> and its services, targets the appropriate audiences, avoids misleading or unverifiable claims or assumptions, and does not use wording, messaging or visuals that could damage the trust, credibility or reputation of the business.</w:t>
+      </w:r>
+      <w:r>
+        <w:rPr>
+          <w:rFonts w:ascii="Aptos" w:eastAsia="Aptos" w:hAnsi="Aptos" w:cs="Aptos"/>
+          <w:sz w:val="22"/>
+          <w:szCs w:val="22"/>
+        </w:rPr>
+        <w:t xml:space="preserve"> </w:t>
+      </w:r>
+    </w:p>
+    <w:p>
+      <w:pPr>
+        <w:spacing w:line="257" w:lineRule="auto"/>
+        <w:rPr>
+          <w:rFonts w:ascii="Aptos" w:eastAsia="Aptos" w:hAnsi="Aptos" w:cs="Aptos"/>
+          <w:sz w:val="22"/>
+          <w:szCs w:val="22"/>
+        </w:rPr>
+      </w:pPr>
+      <w:r>
+        <w:rPr>
+          <w:rFonts w:ascii="Aptos" w:eastAsia="Aptos" w:hAnsi="Aptos" w:cs="Aptos"/>
+          <w:b/>
+          <w:bCs/>
+          <w:sz w:val="22"/>
+          <w:szCs w:val="22"/>
+        </w:rPr>
+        <w:t>Step 8:</w:t>
+      </w:r>
+      <w:r>
+        <w:rPr>
+          <w:rFonts w:ascii="Aptos" w:eastAsia="Aptos" w:hAnsi="Aptos" w:cs="Aptos"/>
+          <w:sz w:val="22"/>
+          <w:szCs w:val="22"/>
+        </w:rPr>
+        <w:t xml:space="preserve"> Identify any of the findings from this audit that could require further work or analysis from one or more of the specialist agents. Until the specialist agents are operational, these findings should be marked as requiring specialist review rather than </w:t>
+      </w:r>
+      <w:proofErr w:type="gramStart"/>
+      <w:r>
+        <w:rPr>
+          <w:rFonts w:ascii="Aptos" w:eastAsia="Aptos" w:hAnsi="Aptos" w:cs="Aptos"/>
+          <w:sz w:val="22"/>
+          <w:szCs w:val="22"/>
+        </w:rPr>
+        <w:t>see</w:t>
+      </w:r>
+      <w:proofErr w:type="gramEnd"/>
+      <w:r>
+        <w:rPr>
+          <w:rFonts w:ascii="Aptos" w:eastAsia="Aptos" w:hAnsi="Aptos" w:cs="Aptos"/>
+          <w:sz w:val="22"/>
+          <w:szCs w:val="22"/>
+        </w:rPr>
+        <w:t xml:space="preserve"> as a completed specialist analysis. The findings may be flagged for future review by the specialist ai agents, which cover the following:</w:t>
+      </w:r>
+      <w:r>
+        <w:br/>
+      </w:r>
+      <w:r>
+        <w:rPr>
+          <w:rFonts w:ascii="Aptos" w:eastAsia="Aptos" w:hAnsi="Aptos" w:cs="Aptos"/>
+          <w:b/>
+          <w:bCs/>
+          <w:sz w:val="22"/>
+          <w:szCs w:val="22"/>
+        </w:rPr>
+        <w:t>Digital PR Specialist required:</w:t>
+      </w:r>
+      <w:r>
+        <w:rPr>
+          <w:rFonts w:ascii="Aptos" w:eastAsia="Aptos" w:hAnsi="Aptos" w:cs="Aptos"/>
+          <w:sz w:val="22"/>
+          <w:szCs w:val="22"/>
+        </w:rPr>
+        <w:t xml:space="preserve"> PR opportunities, external coverage, visibility and outreach</w:t>
+      </w:r>
+      <w:r>
+        <w:br/>
+      </w:r>
+      <w:r>
+        <w:rPr>
+          <w:rFonts w:ascii="Aptos" w:eastAsia="Aptos" w:hAnsi="Aptos" w:cs="Aptos"/>
+          <w:b/>
+          <w:bCs/>
+          <w:sz w:val="22"/>
+          <w:szCs w:val="22"/>
+        </w:rPr>
+        <w:t xml:space="preserve">Backlink Auditor required: </w:t>
+      </w:r>
+      <w:r>
+        <w:rPr>
+          <w:rFonts w:ascii="Aptos" w:eastAsia="Aptos" w:hAnsi="Aptos" w:cs="Aptos"/>
+          <w:sz w:val="22"/>
+          <w:szCs w:val="22"/>
+        </w:rPr>
+        <w:t>Quality of links and backlinks, link opportunities and referring domains</w:t>
+      </w:r>
+      <w:r>
+        <w:br/>
+      </w:r>
+      <w:r>
+        <w:rPr>
+          <w:rFonts w:ascii="Aptos" w:eastAsia="Aptos" w:hAnsi="Aptos" w:cs="Aptos"/>
+          <w:b/>
+          <w:bCs/>
+          <w:sz w:val="22"/>
+          <w:szCs w:val="22"/>
+        </w:rPr>
+        <w:t>Brand Authority Builder required:</w:t>
+      </w:r>
+      <w:r>
+        <w:rPr>
+          <w:rFonts w:ascii="Aptos" w:eastAsia="Aptos" w:hAnsi="Aptos" w:cs="Aptos"/>
+          <w:sz w:val="22"/>
+          <w:szCs w:val="22"/>
+        </w:rPr>
+        <w:t xml:space="preserve"> authority gaps, citations, trust signals and brand-presence opportunities</w:t>
+      </w:r>
+    </w:p>
+    <w:p>
+      <w:pPr>
+        <w:spacing w:line="257" w:lineRule="auto"/>
+      </w:pPr>
+      <w:r>
+        <w:rPr>
+          <w:rFonts w:ascii="Aptos" w:eastAsia="Aptos" w:hAnsi="Aptos" w:cs="Aptos"/>
+          <w:b/>
+          <w:bCs/>
+          <w:sz w:val="22"/>
+          <w:szCs w:val="22"/>
+        </w:rPr>
+        <w:t>Step 9:</w:t>
+      </w:r>
+      <w:r>
+        <w:rPr>
+          <w:rFonts w:ascii="Aptos" w:eastAsia="Aptos" w:hAnsi="Aptos" w:cs="Aptos"/>
+          <w:sz w:val="22"/>
+          <w:szCs w:val="22"/>
+        </w:rPr>
+        <w:t xml:space="preserve"> Separate and clearly identify; evidence, assumptions, recommendations, unresolved questions and findings that required future specialist review. Sort and </w:t>
+      </w:r>
+      <w:proofErr w:type="spellStart"/>
+      <w:r>
+        <w:rPr>
+          <w:rFonts w:ascii="Aptos" w:eastAsia="Aptos" w:hAnsi="Aptos" w:cs="Aptos"/>
+          <w:sz w:val="22"/>
+          <w:szCs w:val="22"/>
+        </w:rPr>
+        <w:t>priorotise</w:t>
+      </w:r>
+      <w:proofErr w:type="spellEnd"/>
+      <w:r>
+        <w:rPr>
+          <w:rFonts w:ascii="Aptos" w:eastAsia="Aptos" w:hAnsi="Aptos" w:cs="Aptos"/>
+          <w:sz w:val="22"/>
+          <w:szCs w:val="22"/>
+        </w:rPr>
+        <w:t xml:space="preserve"> these findings based on their potential impact, the severity, brand risk and relevance to </w:t>
+      </w:r>
+      <w:proofErr w:type="spellStart"/>
+      <w:r>
+        <w:rPr>
+          <w:rFonts w:ascii="Aptos" w:eastAsia="Aptos" w:hAnsi="Aptos" w:cs="Aptos"/>
+          <w:sz w:val="22"/>
+          <w:szCs w:val="22"/>
+        </w:rPr>
+        <w:t>ViriVR</w:t>
+      </w:r>
+      <w:proofErr w:type="spellEnd"/>
+      <w:r>
+        <w:rPr>
+          <w:rFonts w:ascii="Aptos" w:eastAsia="Aptos" w:hAnsi="Aptos" w:cs="Aptos"/>
+          <w:sz w:val="22"/>
+          <w:szCs w:val="22"/>
+        </w:rPr>
+        <w:t xml:space="preserve">. </w:t>
+      </w:r>
+    </w:p>
+    <w:p>
+      <w:pPr>
+        <w:spacing w:line="257" w:lineRule="auto"/>
+      </w:pPr>
+      <w:r>
+        <w:rPr>
+          <w:rFonts w:ascii="Aptos" w:eastAsia="Aptos" w:hAnsi="Aptos" w:cs="Aptos"/>
+          <w:b/>
+          <w:bCs/>
+          <w:sz w:val="22"/>
+          <w:szCs w:val="22"/>
+        </w:rPr>
+        <w:lastRenderedPageBreak/>
+        <w:t>Step 10:</w:t>
+      </w:r>
+      <w:r>
+        <w:rPr>
+          <w:rFonts w:ascii="Aptos" w:eastAsia="Aptos" w:hAnsi="Aptos" w:cs="Aptos"/>
+          <w:sz w:val="22"/>
+          <w:szCs w:val="22"/>
+        </w:rPr>
+        <w:t xml:space="preserve"> Document the findings that include; issues, strengths, weaknesses, risks, opportunities, SEO and authority observations, brand concerns, quality gate failures, unresolved questions and future specialist review flags.</w:t>
+      </w:r>
+    </w:p>
+    <w:p>
+      <w:pPr>
+        <w:spacing w:line="257" w:lineRule="auto"/>
+      </w:pPr>
+      <w:r>
+        <w:rPr>
+          <w:rFonts w:ascii="Aptos" w:eastAsia="Aptos" w:hAnsi="Aptos" w:cs="Aptos"/>
+          <w:b/>
+          <w:bCs/>
+          <w:sz w:val="22"/>
+          <w:szCs w:val="22"/>
+        </w:rPr>
+        <w:t>Output</w:t>
+      </w:r>
+      <w:r>
+        <w:rPr>
+          <w:rFonts w:ascii="Aptos" w:eastAsia="Aptos" w:hAnsi="Aptos" w:cs="Aptos"/>
+          <w:sz w:val="22"/>
+          <w:szCs w:val="22"/>
+        </w:rPr>
+        <w:t xml:space="preserve">: Preliminary Content and Authority Audit Report which contains audit scope, quality gate results, strengths, weaknesses, issues, risks, opportunities, SEO and authority observations, brand findings, evidence and source findings, recommendations, unresolved issues, specialist review flags and escalation flags. </w:t>
+      </w:r>
+    </w:p>
+    <w:p>
+      <w:pPr>
+        <w:spacing w:line="257" w:lineRule="auto"/>
+      </w:pPr>
+      <w:r>
+        <w:rPr>
+          <w:rFonts w:ascii="Aptos" w:eastAsia="Aptos" w:hAnsi="Aptos" w:cs="Aptos"/>
+          <w:sz w:val="22"/>
+          <w:szCs w:val="22"/>
+        </w:rPr>
+        <w:t xml:space="preserve"> </w:t>
+      </w:r>
+    </w:p>
+    <w:p>
+      <w:pPr>
+        <w:spacing w:line="257" w:lineRule="auto"/>
+      </w:pPr>
+      <w:r>
+        <w:rPr>
+          <w:rFonts w:ascii="Aptos" w:eastAsia="Aptos" w:hAnsi="Aptos" w:cs="Aptos"/>
+          <w:b/>
+          <w:bCs/>
+          <w:sz w:val="22"/>
+          <w:szCs w:val="22"/>
+        </w:rPr>
+        <w:t>3. Authority Review, Decision and Escalation</w:t>
+      </w:r>
+    </w:p>
+    <w:p>
+      <w:pPr>
+        <w:spacing w:line="257" w:lineRule="auto"/>
+      </w:pPr>
+      <w:r>
+        <w:rPr>
+          <w:rFonts w:ascii="Aptos" w:eastAsia="Aptos" w:hAnsi="Aptos" w:cs="Aptos"/>
+          <w:b/>
+          <w:bCs/>
+          <w:sz w:val="22"/>
+          <w:szCs w:val="22"/>
+        </w:rPr>
+        <w:t>Step 1:</w:t>
+      </w:r>
+      <w:r>
+        <w:rPr>
+          <w:rFonts w:ascii="Aptos" w:eastAsia="Aptos" w:hAnsi="Aptos" w:cs="Aptos"/>
+          <w:sz w:val="22"/>
+          <w:szCs w:val="22"/>
+        </w:rPr>
+        <w:t xml:space="preserve"> Receive and consolidate all reviewed documentation, outputs, and relevant findings from the three specialist agents.</w:t>
+      </w:r>
+    </w:p>
+    <w:p>
+      <w:pPr>
+        <w:spacing w:line="257" w:lineRule="auto"/>
+      </w:pPr>
+      <w:r>
+        <w:rPr>
+          <w:rFonts w:ascii="Aptos" w:eastAsia="Aptos" w:hAnsi="Aptos" w:cs="Aptos"/>
+          <w:b/>
+          <w:bCs/>
+          <w:sz w:val="22"/>
+          <w:szCs w:val="22"/>
+        </w:rPr>
+        <w:t>Step 2:</w:t>
+      </w:r>
+      <w:r>
+        <w:rPr>
+          <w:rFonts w:ascii="Aptos" w:eastAsia="Aptos" w:hAnsi="Aptos" w:cs="Aptos"/>
+          <w:sz w:val="22"/>
+          <w:szCs w:val="22"/>
+        </w:rPr>
+        <w:t xml:space="preserve"> Identify conflicts, duplicate recommendations, unresolved issues, risks, complications, and dependencies between the specialist agents.</w:t>
+      </w:r>
+    </w:p>
+    <w:p>
+      <w:pPr>
+        <w:spacing w:line="257" w:lineRule="auto"/>
+      </w:pPr>
+      <w:r>
+        <w:rPr>
+          <w:rFonts w:ascii="Aptos" w:eastAsia="Aptos" w:hAnsi="Aptos" w:cs="Aptos"/>
+          <w:b/>
+          <w:bCs/>
+          <w:sz w:val="22"/>
+          <w:szCs w:val="22"/>
+        </w:rPr>
+        <w:t>Step 3:</w:t>
+      </w:r>
+      <w:r>
+        <w:rPr>
+          <w:rFonts w:ascii="Aptos" w:eastAsia="Aptos" w:hAnsi="Aptos" w:cs="Aptos"/>
+          <w:sz w:val="22"/>
+          <w:szCs w:val="22"/>
+        </w:rPr>
+        <w:t xml:space="preserve"> </w:t>
+      </w:r>
+      <w:proofErr w:type="spellStart"/>
+      <w:r>
+        <w:rPr>
+          <w:rFonts w:ascii="Aptos" w:eastAsia="Aptos" w:hAnsi="Aptos" w:cs="Aptos"/>
+          <w:sz w:val="22"/>
+          <w:szCs w:val="22"/>
+        </w:rPr>
+        <w:t>Organise</w:t>
+      </w:r>
+      <w:proofErr w:type="spellEnd"/>
+      <w:r>
+        <w:rPr>
+          <w:rFonts w:ascii="Aptos" w:eastAsia="Aptos" w:hAnsi="Aptos" w:cs="Aptos"/>
+          <w:sz w:val="22"/>
+          <w:szCs w:val="22"/>
+        </w:rPr>
+        <w:t xml:space="preserve"> and </w:t>
+      </w:r>
+      <w:proofErr w:type="spellStart"/>
+      <w:r>
+        <w:rPr>
+          <w:rFonts w:ascii="Aptos" w:eastAsia="Aptos" w:hAnsi="Aptos" w:cs="Aptos"/>
+          <w:sz w:val="22"/>
+          <w:szCs w:val="22"/>
+        </w:rPr>
+        <w:t>categorise</w:t>
+      </w:r>
+      <w:proofErr w:type="spellEnd"/>
+      <w:r>
+        <w:rPr>
+          <w:rFonts w:ascii="Aptos" w:eastAsia="Aptos" w:hAnsi="Aptos" w:cs="Aptos"/>
+          <w:sz w:val="22"/>
+          <w:szCs w:val="22"/>
+        </w:rPr>
+        <w:t xml:space="preserve"> the findings based on their relevance, potential business impact, authority impact and brand risk to </w:t>
+      </w:r>
+      <w:proofErr w:type="spellStart"/>
+      <w:r>
+        <w:rPr>
+          <w:rFonts w:ascii="Aptos" w:eastAsia="Aptos" w:hAnsi="Aptos" w:cs="Aptos"/>
+          <w:sz w:val="22"/>
+          <w:szCs w:val="22"/>
+        </w:rPr>
+        <w:t>ViriVR</w:t>
+      </w:r>
+      <w:proofErr w:type="spellEnd"/>
+      <w:r>
+        <w:rPr>
+          <w:rFonts w:ascii="Aptos" w:eastAsia="Aptos" w:hAnsi="Aptos" w:cs="Aptos"/>
+          <w:sz w:val="22"/>
+          <w:szCs w:val="22"/>
+        </w:rPr>
+        <w:t>.</w:t>
+      </w:r>
+    </w:p>
+    <w:p>
+      <w:pPr>
+        <w:spacing w:line="257" w:lineRule="auto"/>
+      </w:pPr>
+      <w:r>
+        <w:rPr>
+          <w:rFonts w:ascii="Aptos" w:eastAsia="Aptos" w:hAnsi="Aptos" w:cs="Aptos"/>
+          <w:b/>
+          <w:bCs/>
+          <w:sz w:val="22"/>
+          <w:szCs w:val="22"/>
+        </w:rPr>
+        <w:t>Step 4:</w:t>
+      </w:r>
+      <w:r>
+        <w:rPr>
+          <w:rFonts w:ascii="Aptos" w:eastAsia="Aptos" w:hAnsi="Aptos" w:cs="Aptos"/>
+          <w:sz w:val="22"/>
+          <w:szCs w:val="22"/>
+        </w:rPr>
+        <w:t xml:space="preserve"> Determine what action should be taken for each finding or issue and identify the requirements needed to remedy or progress the work.</w:t>
+      </w:r>
+    </w:p>
+    <w:p>
+      <w:pPr>
+        <w:spacing w:line="257" w:lineRule="auto"/>
+      </w:pPr>
+      <w:r>
+        <w:rPr>
+          <w:rFonts w:ascii="Aptos" w:eastAsia="Aptos" w:hAnsi="Aptos" w:cs="Aptos"/>
+          <w:b/>
+          <w:bCs/>
+          <w:sz w:val="22"/>
+          <w:szCs w:val="22"/>
+        </w:rPr>
+        <w:t>Step 5:</w:t>
+      </w:r>
+      <w:r>
+        <w:rPr>
+          <w:rFonts w:ascii="Aptos" w:eastAsia="Aptos" w:hAnsi="Aptos" w:cs="Aptos"/>
+          <w:sz w:val="22"/>
+          <w:szCs w:val="22"/>
+        </w:rPr>
+        <w:t xml:space="preserve"> Determine whether the matter is a routine deliverable that can be progressed within the Authority Manager AI Agent’s approved authority, or whether it requires human review and approval.</w:t>
+      </w:r>
+    </w:p>
+    <w:p>
+      <w:pPr>
+        <w:spacing w:line="257" w:lineRule="auto"/>
+      </w:pPr>
+      <w:r>
+        <w:rPr>
+          <w:rFonts w:ascii="Aptos" w:eastAsia="Aptos" w:hAnsi="Aptos" w:cs="Aptos"/>
+          <w:b/>
+          <w:bCs/>
+          <w:sz w:val="22"/>
+          <w:szCs w:val="22"/>
+        </w:rPr>
+        <w:t>Step 6:</w:t>
+      </w:r>
+      <w:r>
+        <w:rPr>
+          <w:rFonts w:ascii="Aptos" w:eastAsia="Aptos" w:hAnsi="Aptos" w:cs="Aptos"/>
+          <w:sz w:val="22"/>
+          <w:szCs w:val="22"/>
+        </w:rPr>
+        <w:t xml:space="preserve"> Where human approval is required, prepare and escalate the issue to the Human Authority Manager. This should outline the issue, supporting evidence, potential impact or risk, recommendation, and the decision that is required.</w:t>
+      </w:r>
+    </w:p>
+    <w:p>
+      <w:pPr>
+        <w:spacing w:line="257" w:lineRule="auto"/>
+      </w:pPr>
+      <w:r>
+        <w:rPr>
+          <w:rFonts w:ascii="Aptos" w:eastAsia="Aptos" w:hAnsi="Aptos" w:cs="Aptos"/>
+          <w:b/>
+          <w:bCs/>
+          <w:sz w:val="22"/>
+          <w:szCs w:val="22"/>
+        </w:rPr>
+        <w:t>Step 7:</w:t>
+      </w:r>
+      <w:r>
+        <w:rPr>
+          <w:rFonts w:ascii="Aptos" w:eastAsia="Aptos" w:hAnsi="Aptos" w:cs="Aptos"/>
+          <w:sz w:val="22"/>
+          <w:szCs w:val="22"/>
+        </w:rPr>
+        <w:t xml:space="preserve"> Record the outcome of any approvals, rejections, escalations, or corrective actions that were taken.</w:t>
+      </w:r>
+    </w:p>
+    <w:p>
+      <w:pPr>
+        <w:spacing w:line="257" w:lineRule="auto"/>
+      </w:pPr>
+      <w:r>
+        <w:rPr>
+          <w:rFonts w:ascii="Aptos" w:eastAsia="Aptos" w:hAnsi="Aptos" w:cs="Aptos"/>
+          <w:b/>
+          <w:bCs/>
+          <w:sz w:val="22"/>
+          <w:szCs w:val="22"/>
+        </w:rPr>
+        <w:t>Step 8:</w:t>
+      </w:r>
+      <w:r>
+        <w:rPr>
+          <w:rFonts w:ascii="Aptos" w:eastAsia="Aptos" w:hAnsi="Aptos" w:cs="Aptos"/>
+          <w:sz w:val="22"/>
+          <w:szCs w:val="22"/>
+        </w:rPr>
+        <w:t xml:space="preserve"> Produce the final report containing the consolidated findings, recommended actions, actions taken, resolved and unresolved issues, escalation type or level, approval status and current risk status.</w:t>
+      </w:r>
+    </w:p>
+    <w:p>
+      <w:pPr>
+        <w:spacing w:line="257" w:lineRule="auto"/>
+      </w:pPr>
+      <w:r>
+        <w:rPr>
+          <w:rFonts w:ascii="Aptos" w:eastAsia="Aptos" w:hAnsi="Aptos" w:cs="Aptos"/>
+          <w:b/>
+          <w:bCs/>
+          <w:sz w:val="22"/>
+          <w:szCs w:val="22"/>
+        </w:rPr>
+        <w:t>Output</w:t>
+      </w:r>
+      <w:r>
+        <w:rPr>
+          <w:rFonts w:ascii="Aptos" w:eastAsia="Aptos" w:hAnsi="Aptos" w:cs="Aptos"/>
+          <w:sz w:val="22"/>
+          <w:szCs w:val="22"/>
+        </w:rPr>
+        <w:t>: Authority Manager Decision and Human Escalation Report</w:t>
       </w:r>
     </w:p>
     <w:p>
@@ -1861,23 +3324,80 @@
           <w:color w:val="000000" w:themeColor="text1"/>
         </w:rPr>
       </w:pPr>
-      <w:r>
-        <w:rPr>
-          <w:rFonts w:ascii="Aptos" w:eastAsia="Aptos" w:hAnsi="Aptos" w:cs="Aptos"/>
-          <w:b/>
-          <w:bCs/>
-          <w:color w:val="000000" w:themeColor="text1"/>
-        </w:rPr>
-        <w:t>Step 2:</w:t>
-      </w:r>
-      <w:r>
-        <w:rPr>
-          <w:rFonts w:ascii="Aptos" w:eastAsia="Aptos" w:hAnsi="Aptos" w:cs="Aptos"/>
-          <w:b/>
-          <w:bCs/>
-          <w:color w:val="000000" w:themeColor="text1"/>
-        </w:rPr>
-        <w:t xml:space="preserve"> Load only approved knowledge, data, examples and instructions</w:t>
+    </w:p>
+    <w:p>
+      <w:pPr>
+        <w:keepNext/>
+        <w:keepLines/>
+        <w:rPr>
+          <w:b/>
+          <w:bCs/>
+          <w:sz w:val="28"/>
+          <w:szCs w:val="28"/>
+        </w:rPr>
+      </w:pPr>
+      <w:r>
+        <w:rPr>
+          <w:b/>
+          <w:bCs/>
+          <w:sz w:val="28"/>
+          <w:szCs w:val="28"/>
+        </w:rPr>
+        <w:t>Original Workflow</w:t>
+      </w:r>
+    </w:p>
+    <w:p>
+      <w:pPr>
+        <w:spacing w:before="240" w:after="240"/>
+        <w:rPr>
+          <w:rFonts w:ascii="Aptos" w:eastAsia="Aptos" w:hAnsi="Aptos" w:cs="Aptos"/>
+          <w:color w:val="000000" w:themeColor="text1"/>
+        </w:rPr>
+      </w:pPr>
+      <w:r>
+        <w:rPr>
+          <w:rFonts w:ascii="Aptos" w:eastAsia="Aptos" w:hAnsi="Aptos" w:cs="Aptos"/>
+          <w:b/>
+          <w:bCs/>
+          <w:color w:val="000000" w:themeColor="text1"/>
+        </w:rPr>
+        <w:t>Step 1: Validate the request is ready and within scope</w:t>
+      </w:r>
+      <w:r>
+        <w:br/>
+      </w:r>
+      <w:r>
+        <w:rPr>
+          <w:rFonts w:ascii="Aptos" w:eastAsia="Aptos" w:hAnsi="Aptos" w:cs="Aptos"/>
+          <w:color w:val="000000" w:themeColor="text1"/>
+        </w:rPr>
+        <w:t xml:space="preserve"> → The Authority Manager will check whether the request is ready, completed and within the </w:t>
+      </w:r>
+      <w:r>
+        <w:rPr>
+          <w:rFonts w:ascii="Aptos" w:eastAsia="Aptos" w:hAnsi="Aptos" w:cs="Aptos"/>
+          <w:color w:val="000000" w:themeColor="text1"/>
+        </w:rPr>
+        <w:lastRenderedPageBreak/>
+        <w:t xml:space="preserve">AI agent's scope. If there are missing fields, incorrect information or its outside the AI agents scope the request will be denied or escalated if necessary. </w:t>
+      </w:r>
+    </w:p>
+    <w:p>
+      <w:pPr>
+        <w:spacing w:before="240" w:after="240"/>
+        <w:rPr>
+          <w:rFonts w:ascii="Aptos" w:eastAsia="Aptos" w:hAnsi="Aptos" w:cs="Aptos"/>
+          <w:color w:val="000000" w:themeColor="text1"/>
+        </w:rPr>
+      </w:pPr>
+      <w:r>
+        <w:rPr>
+          <w:rFonts w:ascii="Aptos" w:eastAsia="Aptos" w:hAnsi="Aptos" w:cs="Aptos"/>
+          <w:b/>
+          <w:bCs/>
+          <w:color w:val="000000" w:themeColor="text1"/>
+        </w:rPr>
+        <w:t>Step 2: Load only approved knowledge, data, examples and instructions</w:t>
       </w:r>
       <w:r>
         <w:tab/>
@@ -1890,42 +3410,39 @@
           <w:rFonts w:ascii="Aptos" w:eastAsia="Aptos" w:hAnsi="Aptos" w:cs="Aptos"/>
           <w:color w:val="000000" w:themeColor="text1"/>
         </w:rPr>
-        <w:t xml:space="preserve"> →</w:t>
-      </w:r>
-      <w:r>
-        <w:rPr>
-          <w:rFonts w:ascii="Aptos" w:eastAsia="Aptos" w:hAnsi="Aptos" w:cs="Aptos"/>
-          <w:color w:val="000000" w:themeColor="text1"/>
-        </w:rPr>
-        <w:t xml:space="preserve"> </w:t>
-      </w:r>
-      <w:r>
-        <w:rPr>
-          <w:rFonts w:ascii="Aptos" w:eastAsia="Aptos" w:hAnsi="Aptos" w:cs="Aptos"/>
-          <w:color w:val="000000" w:themeColor="text1"/>
-        </w:rPr>
-        <w:t xml:space="preserve">After validation, only the approved knowledge, data, examples and instructions are to be utilised to perform the task. This will ensure only authorised and correct information which will reduce the </w:t>
-      </w:r>
-      <w:r>
-        <w:rPr>
-          <w:rFonts w:ascii="Aptos" w:eastAsia="Aptos" w:hAnsi="Aptos" w:cs="Aptos"/>
-          <w:color w:val="000000" w:themeColor="text1"/>
-        </w:rPr>
-        <w:t>risk of</w:t>
-      </w:r>
-      <w:r>
-        <w:rPr>
-          <w:rFonts w:ascii="Aptos" w:eastAsia="Aptos" w:hAnsi="Aptos" w:cs="Aptos"/>
-          <w:color w:val="000000" w:themeColor="text1"/>
-        </w:rPr>
-        <w:t xml:space="preserve"> </w:t>
-      </w:r>
-      <w:r>
-        <w:rPr>
-          <w:rFonts w:ascii="Aptos" w:eastAsia="Aptos" w:hAnsi="Aptos" w:cs="Aptos"/>
-          <w:color w:val="000000" w:themeColor="text1"/>
-        </w:rPr>
-        <w:t>causing errors and complications.</w:t>
+        <w:t xml:space="preserve"> → After validation, only the approved knowledge, data, examples and instructions are to be </w:t>
+      </w:r>
+      <w:proofErr w:type="spellStart"/>
+      <w:r>
+        <w:rPr>
+          <w:rFonts w:ascii="Aptos" w:eastAsia="Aptos" w:hAnsi="Aptos" w:cs="Aptos"/>
+          <w:color w:val="000000" w:themeColor="text1"/>
+        </w:rPr>
+        <w:t>utilised</w:t>
+      </w:r>
+      <w:proofErr w:type="spellEnd"/>
+      <w:r>
+        <w:rPr>
+          <w:rFonts w:ascii="Aptos" w:eastAsia="Aptos" w:hAnsi="Aptos" w:cs="Aptos"/>
+          <w:color w:val="000000" w:themeColor="text1"/>
+        </w:rPr>
+        <w:t xml:space="preserve"> to perform the task. This will ensure only </w:t>
+      </w:r>
+      <w:proofErr w:type="spellStart"/>
+      <w:r>
+        <w:rPr>
+          <w:rFonts w:ascii="Aptos" w:eastAsia="Aptos" w:hAnsi="Aptos" w:cs="Aptos"/>
+          <w:color w:val="000000" w:themeColor="text1"/>
+        </w:rPr>
+        <w:t>authorised</w:t>
+      </w:r>
+      <w:proofErr w:type="spellEnd"/>
+      <w:r>
+        <w:rPr>
+          <w:rFonts w:ascii="Aptos" w:eastAsia="Aptos" w:hAnsi="Aptos" w:cs="Aptos"/>
+          <w:color w:val="000000" w:themeColor="text1"/>
+        </w:rPr>
+        <w:t xml:space="preserve"> and correct information which will reduce the risk of causing errors and complications.</w:t>
       </w:r>
     </w:p>
     <w:p>
@@ -1943,16 +3460,7 @@
           <w:bCs/>
           <w:color w:val="000000" w:themeColor="text1"/>
         </w:rPr>
-        <w:t>Step 3:</w:t>
-      </w:r>
-      <w:r>
-        <w:rPr>
-          <w:rFonts w:ascii="Aptos" w:eastAsia="Aptos" w:hAnsi="Aptos" w:cs="Aptos"/>
-          <w:b/>
-          <w:bCs/>
-          <w:color w:val="000000" w:themeColor="text1"/>
-        </w:rPr>
-        <w:t xml:space="preserve"> Perform designated task in a documented sequence</w:t>
+        <w:t>Step 3: Perform designated task in a documented sequence</w:t>
       </w:r>
       <w:r>
         <w:br/>
@@ -1962,49 +3470,7 @@
           <w:rFonts w:ascii="Aptos" w:eastAsia="Aptos" w:hAnsi="Aptos" w:cs="Aptos"/>
           <w:color w:val="000000" w:themeColor="text1"/>
         </w:rPr>
-        <w:t xml:space="preserve"> →</w:t>
-      </w:r>
-      <w:r>
-        <w:rPr>
-          <w:rFonts w:ascii="Aptos" w:eastAsia="Aptos" w:hAnsi="Aptos" w:cs="Aptos"/>
-          <w:color w:val="000000" w:themeColor="text1"/>
-        </w:rPr>
-        <w:t xml:space="preserve"> There will be a clear and structured documented process where the </w:t>
-      </w:r>
-      <w:r>
-        <w:rPr>
-          <w:rFonts w:ascii="Aptos" w:eastAsia="Aptos" w:hAnsi="Aptos" w:cs="Aptos"/>
-          <w:color w:val="000000" w:themeColor="text1"/>
-        </w:rPr>
-        <w:t xml:space="preserve">Authority Manager </w:t>
-      </w:r>
-      <w:r>
-        <w:rPr>
-          <w:rFonts w:ascii="Aptos" w:eastAsia="Aptos" w:hAnsi="Aptos" w:cs="Aptos"/>
-          <w:color w:val="000000" w:themeColor="text1"/>
-        </w:rPr>
-        <w:t xml:space="preserve">will complete its task. It will document its steps in a clear and concise language as well as outline its processes so that </w:t>
-      </w:r>
-      <w:r>
-        <w:rPr>
-          <w:rFonts w:ascii="Aptos" w:eastAsia="Aptos" w:hAnsi="Aptos" w:cs="Aptos"/>
-          <w:color w:val="000000" w:themeColor="text1"/>
-        </w:rPr>
-        <w:t xml:space="preserve">any errors </w:t>
-      </w:r>
-      <w:r>
-        <w:rPr>
-          <w:rFonts w:ascii="Aptos" w:eastAsia="Aptos" w:hAnsi="Aptos" w:cs="Aptos"/>
-          <w:color w:val="000000" w:themeColor="text1"/>
-        </w:rPr>
-        <w:t xml:space="preserve">can </w:t>
-      </w:r>
-      <w:r>
-        <w:rPr>
-          <w:rFonts w:ascii="Aptos" w:eastAsia="Aptos" w:hAnsi="Aptos" w:cs="Aptos"/>
-          <w:color w:val="000000" w:themeColor="text1"/>
-        </w:rPr>
-        <w:t>be quickly understood and rectified.</w:t>
+        <w:t xml:space="preserve"> → There will be a clear and structured documented process where the Authority Manager will complete its task. It will document its steps in a clear and concise language as well as outline its processes so that any errors can be quickly understood and rectified.</w:t>
       </w:r>
     </w:p>
     <w:p>
@@ -2022,16 +3488,7 @@
           <w:bCs/>
           <w:color w:val="000000" w:themeColor="text1"/>
         </w:rPr>
-        <w:t>Step 4:</w:t>
-      </w:r>
-      <w:r>
-        <w:rPr>
-          <w:rFonts w:ascii="Aptos" w:eastAsia="Aptos" w:hAnsi="Aptos" w:cs="Aptos"/>
-          <w:b/>
-          <w:bCs/>
-          <w:color w:val="000000" w:themeColor="text1"/>
-        </w:rPr>
-        <w:t xml:space="preserve"> Separate evidence, assumptions, recommendations and unresolved questions</w:t>
+        <w:t>Step 4: Separate evidence, assumptions, recommendations and unresolved questions</w:t>
       </w:r>
       <w:r>
         <w:br/>
@@ -2041,28 +3498,7 @@
           <w:rFonts w:ascii="Aptos" w:eastAsia="Aptos" w:hAnsi="Aptos" w:cs="Aptos"/>
           <w:color w:val="000000" w:themeColor="text1"/>
         </w:rPr>
-        <w:t xml:space="preserve"> →</w:t>
-      </w:r>
-      <w:r>
-        <w:rPr>
-          <w:rFonts w:ascii="Aptos" w:eastAsia="Aptos" w:hAnsi="Aptos" w:cs="Aptos"/>
-          <w:color w:val="000000" w:themeColor="text1"/>
-        </w:rPr>
-        <w:t xml:space="preserve"> The </w:t>
-      </w:r>
-      <w:r>
-        <w:rPr>
-          <w:rFonts w:ascii="Aptos" w:eastAsia="Aptos" w:hAnsi="Aptos" w:cs="Aptos"/>
-          <w:color w:val="000000" w:themeColor="text1"/>
-        </w:rPr>
-        <w:t>Authority Manager</w:t>
-      </w:r>
-      <w:r>
-        <w:rPr>
-          <w:rFonts w:ascii="Aptos" w:eastAsia="Aptos" w:hAnsi="Aptos" w:cs="Aptos"/>
-          <w:color w:val="000000" w:themeColor="text1"/>
-        </w:rPr>
-        <w:t xml:space="preserve"> will divide its outputs into clearly specified sections therefore making it easier for the Authority Manager to distinguish verified and valid evidence, assumptions and recommendations from the AI agent and unresolved questions that haven’t been address or require more clarity.</w:t>
+        <w:t xml:space="preserve"> → The Authority Manager will divide its outputs into clearly specified sections therefore making it easier for the Authority Manager to distinguish verified and valid evidence, assumptions and recommendations from the AI agent and unresolved questions that haven’t been address or require more clarity.</w:t>
       </w:r>
     </w:p>
     <w:p>
@@ -2076,16 +3512,7 @@
           <w:bCs/>
           <w:color w:val="000000" w:themeColor="text1"/>
         </w:rPr>
-        <w:t xml:space="preserve">Step 5: </w:t>
-      </w:r>
-      <w:r>
-        <w:rPr>
-          <w:rFonts w:ascii="Aptos" w:eastAsia="Aptos" w:hAnsi="Aptos" w:cs="Aptos"/>
-          <w:b/>
-          <w:bCs/>
-          <w:color w:val="000000" w:themeColor="text1"/>
-        </w:rPr>
-        <w:t>Run self-checks against output schema and acceptance criteria</w:t>
+        <w:t>Step 5: Run self-checks against output schema and acceptance criteria</w:t>
       </w:r>
       <w:r>
         <w:br/>
@@ -2095,49 +3522,7 @@
           <w:rFonts w:ascii="Aptos" w:eastAsia="Aptos" w:hAnsi="Aptos" w:cs="Aptos"/>
           <w:color w:val="000000" w:themeColor="text1"/>
         </w:rPr>
-        <w:t>→</w:t>
-      </w:r>
-      <w:r>
-        <w:rPr>
-          <w:rFonts w:ascii="Aptos" w:eastAsia="Aptos" w:hAnsi="Aptos" w:cs="Aptos"/>
-          <w:color w:val="000000" w:themeColor="text1"/>
-        </w:rPr>
-        <w:t xml:space="preserve"> </w:t>
-      </w:r>
-      <w:r>
-        <w:rPr>
-          <w:rFonts w:ascii="Aptos" w:eastAsia="Aptos" w:hAnsi="Aptos" w:cs="Aptos"/>
-          <w:color w:val="000000" w:themeColor="text1"/>
-        </w:rPr>
-        <w:t>Re</w:t>
-      </w:r>
-      <w:r>
-        <w:rPr>
-          <w:rFonts w:ascii="Aptos" w:eastAsia="Aptos" w:hAnsi="Aptos" w:cs="Aptos"/>
-          <w:color w:val="000000" w:themeColor="text1"/>
-        </w:rPr>
-        <w:t xml:space="preserve">view </w:t>
-      </w:r>
-      <w:r>
-        <w:rPr>
-          <w:rFonts w:ascii="Aptos" w:eastAsia="Aptos" w:hAnsi="Aptos" w:cs="Aptos"/>
-          <w:color w:val="000000" w:themeColor="text1"/>
-        </w:rPr>
-        <w:t xml:space="preserve">the </w:t>
-      </w:r>
-      <w:r>
-        <w:rPr>
-          <w:rFonts w:ascii="Aptos" w:eastAsia="Aptos" w:hAnsi="Aptos" w:cs="Aptos"/>
-          <w:color w:val="000000" w:themeColor="text1"/>
-        </w:rPr>
-        <w:t xml:space="preserve">output and check if the response meets all the required fields and whether it has completed the acceptance criteria. Any issues, complications or conflicting information will be escalated </w:t>
-      </w:r>
-      <w:r>
-        <w:rPr>
-          <w:rFonts w:ascii="Aptos" w:eastAsia="Aptos" w:hAnsi="Aptos" w:cs="Aptos"/>
-          <w:color w:val="000000" w:themeColor="text1"/>
-        </w:rPr>
-        <w:t>or improved upon if required.</w:t>
+        <w:t>→ Review the output and check if the response meets all the required fields and whether it has completed the acceptance criteria. Any issues, complications or conflicting information will be escalated or improved upon if required.</w:t>
       </w:r>
     </w:p>
     <w:p>
@@ -2151,16 +3536,7 @@
           <w:bCs/>
           <w:color w:val="000000" w:themeColor="text1"/>
         </w:rPr>
-        <w:t xml:space="preserve">Step 6: </w:t>
-      </w:r>
-      <w:r>
-        <w:rPr>
-          <w:rFonts w:ascii="Aptos" w:eastAsia="Aptos" w:hAnsi="Aptos" w:cs="Aptos"/>
-          <w:b/>
-          <w:bCs/>
-          <w:color w:val="000000" w:themeColor="text1"/>
-        </w:rPr>
-        <w:t>Package the handoff with provenance, version and escalation flags</w:t>
+        <w:t>Step 6: Package the handoff with provenance, version and escalation flags</w:t>
       </w:r>
       <w:r>
         <w:br/>
@@ -2170,28 +3546,23 @@
           <w:rFonts w:ascii="Aptos" w:eastAsia="Aptos" w:hAnsi="Aptos" w:cs="Aptos"/>
           <w:color w:val="000000" w:themeColor="text1"/>
         </w:rPr>
-        <w:t>→</w:t>
-      </w:r>
-      <w:r>
-        <w:rPr>
-          <w:rFonts w:ascii="Aptos" w:eastAsia="Aptos" w:hAnsi="Aptos" w:cs="Aptos"/>
-          <w:color w:val="000000" w:themeColor="text1"/>
-        </w:rPr>
-        <w:t xml:space="preserve"> The output will be handed off to the Authority Manager for review and approval. It will also include a record of the information utilised, </w:t>
-      </w:r>
-      <w:r>
-        <w:rPr>
-          <w:rFonts w:ascii="Aptos" w:eastAsia="Aptos" w:hAnsi="Aptos" w:cs="Aptos"/>
-          <w:color w:val="000000" w:themeColor="text1"/>
-        </w:rPr>
-        <w:t>version of</w:t>
-      </w:r>
-      <w:r>
-        <w:rPr>
-          <w:rFonts w:ascii="Aptos" w:eastAsia="Aptos" w:hAnsi="Aptos" w:cs="Aptos"/>
-          <w:color w:val="000000" w:themeColor="text1"/>
-        </w:rPr>
-        <w:t xml:space="preserve"> information as well as escalation flags that were raised that required the Authority Manager’s approval or attention.</w:t>
+        <w:t xml:space="preserve">→ The output will be handed off to the Authority Manager for review and approval. It will also include a record of the information </w:t>
+      </w:r>
+      <w:proofErr w:type="spellStart"/>
+      <w:r>
+        <w:rPr>
+          <w:rFonts w:ascii="Aptos" w:eastAsia="Aptos" w:hAnsi="Aptos" w:cs="Aptos"/>
+          <w:color w:val="000000" w:themeColor="text1"/>
+        </w:rPr>
+        <w:t>utilised</w:t>
+      </w:r>
+      <w:proofErr w:type="spellEnd"/>
+      <w:r>
+        <w:rPr>
+          <w:rFonts w:ascii="Aptos" w:eastAsia="Aptos" w:hAnsi="Aptos" w:cs="Aptos"/>
+          <w:color w:val="000000" w:themeColor="text1"/>
+        </w:rPr>
+        <w:t>, version of information as well as escalation flags that were raised that required the Authority Manager’s approval or attention.</w:t>
       </w:r>
     </w:p>
     <w:p>
@@ -2199,10 +3570,6 @@
         <w:keepNext/>
         <w:keepLines/>
         <w:spacing w:before="240" w:after="240"/>
-        <w:rPr>
-          <w:rFonts w:ascii="Aptos" w:eastAsia="Aptos" w:hAnsi="Aptos" w:cs="Aptos"/>
-          <w:color w:val="000000" w:themeColor="text1"/>
-        </w:rPr>
       </w:pPr>
       <w:r>
         <w:rPr>
@@ -2212,45 +3579,7 @@
           <w:color w:val="000000" w:themeColor="text1"/>
         </w:rPr>
         <w:lastRenderedPageBreak/>
-        <w:t>Expected Output</w:t>
-      </w:r>
-      <w:proofErr w:type="gramStart"/>
-      <w:r>
-        <w:rPr>
-          <w:rFonts w:ascii="Aptos" w:eastAsia="Aptos" w:hAnsi="Aptos" w:cs="Aptos"/>
-          <w:b/>
-          <w:bCs/>
-          <w:color w:val="000000" w:themeColor="text1"/>
-        </w:rPr>
-        <w:t>:</w:t>
-      </w:r>
-      <w:r>
-        <w:rPr>
-          <w:rFonts w:ascii="Aptos" w:eastAsia="Aptos" w:hAnsi="Aptos" w:cs="Aptos"/>
-          <w:b/>
-          <w:bCs/>
-          <w:color w:val="000000" w:themeColor="text1"/>
-        </w:rPr>
-        <w:t xml:space="preserve"> </w:t>
-      </w:r>
-      <w:r>
-        <w:rPr>
-          <w:rFonts w:ascii="Aptos" w:eastAsia="Aptos" w:hAnsi="Aptos" w:cs="Aptos"/>
-          <w:b/>
-          <w:bCs/>
-          <w:color w:val="000000" w:themeColor="text1"/>
-        </w:rPr>
-        <w:t xml:space="preserve"> A</w:t>
-      </w:r>
-      <w:proofErr w:type="gramEnd"/>
-      <w:r>
-        <w:rPr>
-          <w:rFonts w:ascii="Aptos" w:eastAsia="Aptos" w:hAnsi="Aptos" w:cs="Aptos"/>
-          <w:b/>
-          <w:bCs/>
-          <w:color w:val="000000" w:themeColor="text1"/>
-        </w:rPr>
-        <w:t xml:space="preserve"> recommendation or strategy package from the three AI Agents </w:t>
+        <w:t xml:space="preserve">Expected Output:  A recommendation or strategy package from the three AI Agents </w:t>
       </w:r>
       <w:r>
         <w:br/>
@@ -2260,36 +3589,57 @@
           <w:rFonts w:ascii="Aptos" w:eastAsia="Aptos" w:hAnsi="Aptos" w:cs="Aptos"/>
           <w:color w:val="000000" w:themeColor="text1"/>
         </w:rPr>
-        <w:t xml:space="preserve"> →</w:t>
-      </w:r>
-      <w:r>
-        <w:rPr>
-          <w:rFonts w:ascii="Aptos" w:eastAsia="Aptos" w:hAnsi="Aptos" w:cs="Aptos"/>
-          <w:color w:val="000000" w:themeColor="text1"/>
-        </w:rPr>
-        <w:t xml:space="preserve"> </w:t>
-      </w:r>
-      <w:r>
-        <w:rPr>
-          <w:rFonts w:ascii="Aptos" w:eastAsia="Aptos" w:hAnsi="Aptos" w:cs="Aptos"/>
-          <w:color w:val="000000" w:themeColor="text1"/>
-        </w:rPr>
-        <w:t xml:space="preserve">The three AI Agents will coordinate and provide recommendations, business opportunities or strategies that will strengthen </w:t>
-      </w:r>
-      <w:r>
-        <w:rPr>
-          <w:rFonts w:ascii="Aptos" w:eastAsia="Aptos" w:hAnsi="Aptos" w:cs="Aptos"/>
-          <w:color w:val="000000" w:themeColor="text1"/>
-        </w:rPr>
-        <w:t xml:space="preserve">the </w:t>
-      </w:r>
-      <w:r>
-        <w:rPr>
-          <w:rFonts w:ascii="Aptos" w:eastAsia="Aptos" w:hAnsi="Aptos" w:cs="Aptos"/>
-          <w:color w:val="000000" w:themeColor="text1"/>
-        </w:rPr>
-        <w:t>external trust, citations, links, brand awareness and overall digital and domain authority of ApsisVR.</w:t>
-      </w:r>
+        <w:t xml:space="preserve"> → The three AI Agents will coordinate and provide recommendations, business opportunities or strategies that will strengthen the external trust, citations, links, brand awareness and overall digital and domain authority of </w:t>
+      </w:r>
+      <w:proofErr w:type="spellStart"/>
+      <w:r>
+        <w:rPr>
+          <w:rFonts w:ascii="Aptos" w:eastAsia="Aptos" w:hAnsi="Aptos" w:cs="Aptos"/>
+          <w:color w:val="000000" w:themeColor="text1"/>
+        </w:rPr>
+        <w:t>ViriVR</w:t>
+      </w:r>
+      <w:proofErr w:type="spellEnd"/>
+      <w:r>
+        <w:rPr>
+          <w:rFonts w:ascii="Aptos" w:eastAsia="Aptos" w:hAnsi="Aptos" w:cs="Aptos"/>
+          <w:color w:val="000000" w:themeColor="text1"/>
+        </w:rPr>
+        <w:t>.</w:t>
+      </w:r>
+    </w:p>
+    <w:p>
+      <w:pPr>
+        <w:keepNext/>
+        <w:keepLines/>
+        <w:spacing w:before="240" w:after="240"/>
+        <w:rPr>
+          <w:rFonts w:ascii="Aptos" w:eastAsia="Aptos" w:hAnsi="Aptos" w:cs="Aptos"/>
+          <w:color w:val="000000" w:themeColor="text1"/>
+        </w:rPr>
+      </w:pPr>
+    </w:p>
+    <w:p>
+      <w:pPr>
+        <w:keepNext/>
+        <w:keepLines/>
+        <w:spacing w:before="240" w:after="240"/>
+        <w:rPr>
+          <w:rFonts w:ascii="Aptos" w:eastAsia="Aptos" w:hAnsi="Aptos" w:cs="Aptos"/>
+          <w:color w:val="000000" w:themeColor="text1"/>
+        </w:rPr>
+      </w:pPr>
+    </w:p>
+    <w:p>
+      <w:pPr>
+        <w:keepNext/>
+        <w:keepLines/>
+        <w:spacing w:before="240" w:after="240"/>
+        <w:rPr>
+          <w:rFonts w:ascii="Aptos" w:eastAsia="Aptos" w:hAnsi="Aptos" w:cs="Aptos"/>
+          <w:color w:val="000000" w:themeColor="text1"/>
+        </w:rPr>
+      </w:pPr>
     </w:p>
     <w:p>
       <w:r>
@@ -2448,11 +3798,19 @@
             </w:tcMar>
           </w:tcPr>
           <w:p>
-            <w:r>
-              <w:rPr>
-                <w:rFonts w:ascii="Aptos" w:eastAsia="Aptos" w:hAnsi="Aptos" w:cs="Aptos"/>
-              </w:rPr>
-              <w:t xml:space="preserve">Utilised to create, test, and interact with the three AI agents and their respective outputs. </w:t>
+            <w:proofErr w:type="spellStart"/>
+            <w:r>
+              <w:rPr>
+                <w:rFonts w:ascii="Aptos" w:eastAsia="Aptos" w:hAnsi="Aptos" w:cs="Aptos"/>
+              </w:rPr>
+              <w:t>Utilised</w:t>
+            </w:r>
+            <w:proofErr w:type="spellEnd"/>
+            <w:r>
+              <w:rPr>
+                <w:rFonts w:ascii="Aptos" w:eastAsia="Aptos" w:hAnsi="Aptos" w:cs="Aptos"/>
+              </w:rPr>
+              <w:t xml:space="preserve"> to create, test, and interact with the three AI agents and their respective outputs. </w:t>
             </w:r>
           </w:p>
         </w:tc>
@@ -2496,27 +3854,29 @@
               <w:rPr>
                 <w:rFonts w:ascii="Aptos" w:eastAsia="Aptos" w:hAnsi="Aptos" w:cs="Aptos"/>
               </w:rPr>
-              <w:t xml:space="preserve">Provides metrics on ApsisVR’s website traffic, </w:t>
-            </w:r>
-            <w:r>
-              <w:rPr>
-                <w:rFonts w:ascii="Aptos" w:eastAsia="Aptos" w:hAnsi="Aptos" w:cs="Aptos"/>
-              </w:rPr>
-              <w:t xml:space="preserve">visibility helps determine </w:t>
-            </w:r>
-            <w:proofErr w:type="gramStart"/>
-            <w:r>
-              <w:rPr>
-                <w:rFonts w:ascii="Aptos" w:eastAsia="Aptos" w:hAnsi="Aptos" w:cs="Aptos"/>
-              </w:rPr>
-              <w:t>the success</w:t>
-            </w:r>
-            <w:proofErr w:type="gramEnd"/>
-            <w:r>
-              <w:rPr>
-                <w:rFonts w:ascii="Aptos" w:eastAsia="Aptos" w:hAnsi="Aptos" w:cs="Aptos"/>
-              </w:rPr>
-              <w:t xml:space="preserve"> after implementing </w:t>
+              <w:t xml:space="preserve">Provides metrics on </w:t>
+            </w:r>
+            <w:proofErr w:type="spellStart"/>
+            <w:r>
+              <w:rPr>
+                <w:rFonts w:ascii="Aptos" w:eastAsia="Aptos" w:hAnsi="Aptos" w:cs="Aptos"/>
+                <w:color w:val="000000" w:themeColor="text1"/>
+              </w:rPr>
+              <w:t>ViriVR’s</w:t>
+            </w:r>
+            <w:proofErr w:type="spellEnd"/>
+            <w:r>
+              <w:rPr>
+                <w:rFonts w:ascii="Aptos" w:eastAsia="Aptos" w:hAnsi="Aptos" w:cs="Aptos"/>
+                <w:color w:val="000000" w:themeColor="text1"/>
+              </w:rPr>
+              <w:t xml:space="preserve"> </w:t>
+            </w:r>
+            <w:r>
+              <w:rPr>
+                <w:rFonts w:ascii="Aptos" w:eastAsia="Aptos" w:hAnsi="Aptos" w:cs="Aptos"/>
+              </w:rPr>
+              <w:t xml:space="preserve">website traffic, visibility helps determine the success after implementing </w:t>
             </w:r>
           </w:p>
         </w:tc>
@@ -2555,13 +3915,7 @@
               <w:rPr>
                 <w:rFonts w:ascii="Aptos" w:eastAsia="Aptos" w:hAnsi="Aptos" w:cs="Aptos"/>
               </w:rPr>
-              <w:t>Monitor the businesses search visibility, anal</w:t>
-            </w:r>
-            <w:r>
-              <w:rPr>
-                <w:rFonts w:ascii="Aptos" w:eastAsia="Aptos" w:hAnsi="Aptos" w:cs="Aptos"/>
-              </w:rPr>
-              <w:t>ytics and how Google views the website</w:t>
+              <w:t>Monitor the businesses search visibility, analytics and how Google views the website</w:t>
             </w:r>
           </w:p>
         </w:tc>
@@ -2579,12 +3933,14 @@
             </w:tcMar>
           </w:tcPr>
           <w:p>
+            <w:proofErr w:type="spellStart"/>
             <w:r>
               <w:rPr>
                 <w:rFonts w:ascii="Aptos" w:eastAsia="Aptos" w:hAnsi="Aptos" w:cs="Aptos"/>
               </w:rPr>
               <w:t>Ahrefs</w:t>
             </w:r>
+            <w:proofErr w:type="spellEnd"/>
           </w:p>
         </w:tc>
         <w:tc>
@@ -2600,7 +3956,43 @@
               <w:rPr>
                 <w:rFonts w:ascii="Aptos" w:eastAsia="Aptos" w:hAnsi="Aptos" w:cs="Aptos"/>
               </w:rPr>
-              <w:t>Used to analyse and check ApsisVR’s backlinks and website authority.</w:t>
+              <w:t xml:space="preserve">Used to </w:t>
+            </w:r>
+            <w:proofErr w:type="spellStart"/>
+            <w:r>
+              <w:rPr>
+                <w:rFonts w:ascii="Aptos" w:eastAsia="Aptos" w:hAnsi="Aptos" w:cs="Aptos"/>
+              </w:rPr>
+              <w:t>analyse</w:t>
+            </w:r>
+            <w:proofErr w:type="spellEnd"/>
+            <w:r>
+              <w:rPr>
+                <w:rFonts w:ascii="Aptos" w:eastAsia="Aptos" w:hAnsi="Aptos" w:cs="Aptos"/>
+              </w:rPr>
+              <w:t xml:space="preserve"> and check </w:t>
+            </w:r>
+            <w:proofErr w:type="spellStart"/>
+            <w:r>
+              <w:rPr>
+                <w:rFonts w:ascii="Aptos" w:eastAsia="Aptos" w:hAnsi="Aptos" w:cs="Aptos"/>
+                <w:color w:val="000000" w:themeColor="text1"/>
+              </w:rPr>
+              <w:t>ViriVR’s</w:t>
+            </w:r>
+            <w:proofErr w:type="spellEnd"/>
+            <w:r>
+              <w:rPr>
+                <w:rFonts w:ascii="Aptos" w:eastAsia="Aptos" w:hAnsi="Aptos" w:cs="Aptos"/>
+                <w:color w:val="000000" w:themeColor="text1"/>
+              </w:rPr>
+              <w:t xml:space="preserve"> </w:t>
+            </w:r>
+            <w:r>
+              <w:rPr>
+                <w:rFonts w:ascii="Aptos" w:eastAsia="Aptos" w:hAnsi="Aptos" w:cs="Aptos"/>
+              </w:rPr>
+              <w:t>backlinks and website authority.</w:t>
             </w:r>
           </w:p>
         </w:tc>
@@ -2639,22 +4031,6 @@
       <w:pPr>
         <w:pStyle w:val="Heading3"/>
         <w:spacing w:before="281" w:after="281"/>
-        <w:rPr>
-          <w:rFonts w:ascii="Aptos" w:eastAsia="Aptos" w:hAnsi="Aptos" w:cs="Aptos"/>
-          <w:b/>
-          <w:bCs/>
-        </w:rPr>
-      </w:pPr>
-    </w:p>
-    <w:p>
-      <w:r>
-        <w:br w:type="page"/>
-      </w:r>
-    </w:p>
-    <w:p>
-      <w:pPr>
-        <w:pStyle w:val="Heading3"/>
-        <w:spacing w:before="281" w:after="281"/>
       </w:pPr>
       <w:r>
         <w:rPr>
@@ -2674,12 +4050,6 @@
       <w:r>
         <w:t>*These will most likely be subjected to changes in the future*</w:t>
       </w:r>
-    </w:p>
-    <w:p>
-      <w:pPr>
-        <w:keepNext/>
-        <w:keepLines/>
-      </w:pPr>
     </w:p>
     <w:p>
       <w:pPr>
@@ -2696,8 +4066,6 @@
       </w:r>
       <w:r>
         <w:br/>
-      </w:r>
-      <w:r>
         <w:t xml:space="preserve">1. The agent must not create or invent research, facts, evidence, KPI results or any information that hasn’t been verified by approved sources or </w:t>
       </w:r>
       <w:proofErr w:type="spellStart"/>
@@ -2832,22 +4200,40 @@
     </w:p>
     <w:p>
       <w:pPr>
+        <w:keepNext/>
+        <w:keepLines/>
+      </w:pPr>
+    </w:p>
+    <w:p>
+      <w:pPr>
+        <w:keepNext/>
+        <w:keepLines/>
+      </w:pPr>
+    </w:p>
+    <w:p>
+      <w:pPr>
+        <w:keepNext/>
+        <w:keepLines/>
+      </w:pPr>
+    </w:p>
+    <w:p>
+      <w:pPr>
+        <w:keepNext/>
+        <w:keepLines/>
+      </w:pPr>
+    </w:p>
+    <w:p>
+      <w:r>
+        <w:lastRenderedPageBreak/>
+        <w:br w:type="page"/>
+      </w:r>
+    </w:p>
+    <w:p>
+      <w:pPr>
         <w:pStyle w:val="Heading3"/>
         <w:spacing w:before="281" w:after="281"/>
         <w:rPr>
           <w:rFonts w:ascii="Aptos" w:eastAsia="Aptos" w:hAnsi="Aptos" w:cs="Aptos"/>
-          <w:b/>
-          <w:bCs/>
-        </w:rPr>
-      </w:pPr>
-    </w:p>
-    <w:p/>
-    <w:p>
-      <w:pPr>
-        <w:pStyle w:val="Heading3"/>
-        <w:spacing w:before="281" w:after="281"/>
-        <w:rPr>
-          <w:rFonts w:ascii="Aptos" w:eastAsia="Aptos" w:hAnsi="Aptos" w:cs="Aptos"/>
         </w:rPr>
       </w:pPr>
       <w:r>
@@ -2857,15 +4243,7 @@
           <w:bCs/>
         </w:rPr>
         <w:lastRenderedPageBreak/>
-        <w:t>8</w:t>
-      </w:r>
-      <w:r>
-        <w:rPr>
-          <w:rFonts w:ascii="Aptos" w:eastAsia="Aptos" w:hAnsi="Aptos" w:cs="Aptos"/>
-          <w:b/>
-          <w:bCs/>
-        </w:rPr>
-        <w:t>. Research / Sources</w:t>
+        <w:t>8. Research / Sources</w:t>
       </w:r>
     </w:p>
     <w:p>
@@ -2904,15 +4282,9 @@
           <w:rFonts w:ascii="Aptos" w:eastAsia="Aptos" w:hAnsi="Aptos" w:cs="Aptos"/>
           <w:color w:val="000000" w:themeColor="text1"/>
         </w:rPr>
-        <w:t>Source:</w:t>
-      </w:r>
-      <w:r>
-        <w:rPr>
-          <w:rFonts w:ascii="Aptos" w:eastAsia="Aptos" w:hAnsi="Aptos" w:cs="Aptos"/>
-          <w:color w:val="000000" w:themeColor="text1"/>
-        </w:rPr>
-        <w:t xml:space="preserve"> </w:t>
-      </w:r>
+        <w:t xml:space="preserve">Source: </w:t>
+      </w:r>
+      <w:proofErr w:type="spellStart"/>
       <w:r>
         <w:rPr>
           <w:rFonts w:ascii="Aptos" w:eastAsia="Aptos" w:hAnsi="Aptos" w:cs="Aptos"/>
@@ -2920,33 +4292,13 @@
         </w:rPr>
         <w:t>Ratnarajah</w:t>
       </w:r>
-      <w:r>
-        <w:rPr>
-          <w:rFonts w:ascii="Aptos" w:eastAsia="Aptos" w:hAnsi="Aptos" w:cs="Aptos"/>
-          <w:color w:val="000000" w:themeColor="text1"/>
-        </w:rPr>
-        <w:t>, A (</w:t>
-      </w:r>
-      <w:r>
-        <w:rPr>
-          <w:rFonts w:ascii="Aptos" w:eastAsia="Aptos" w:hAnsi="Aptos" w:cs="Aptos"/>
-          <w:color w:val="000000" w:themeColor="text1"/>
-        </w:rPr>
-        <w:t>2026</w:t>
-      </w:r>
-      <w:r>
-        <w:rPr>
-          <w:rFonts w:ascii="Aptos" w:eastAsia="Aptos" w:hAnsi="Aptos" w:cs="Aptos"/>
-          <w:color w:val="000000" w:themeColor="text1"/>
-        </w:rPr>
-        <w:t>)</w:t>
-      </w:r>
-      <w:r>
-        <w:rPr>
-          <w:rFonts w:ascii="Aptos" w:eastAsia="Aptos" w:hAnsi="Aptos" w:cs="Aptos"/>
-          <w:color w:val="000000" w:themeColor="text1"/>
-        </w:rPr>
-        <w:t xml:space="preserve"> </w:t>
+      <w:proofErr w:type="spellEnd"/>
+      <w:r>
+        <w:rPr>
+          <w:rFonts w:ascii="Aptos" w:eastAsia="Aptos" w:hAnsi="Aptos" w:cs="Aptos"/>
+          <w:color w:val="000000" w:themeColor="text1"/>
+        </w:rPr>
+        <w:t xml:space="preserve">, A (2026) </w:t>
       </w:r>
       <w:r>
         <w:rPr>
@@ -2955,131 +4307,23 @@
           <w:iCs/>
           <w:color w:val="000000" w:themeColor="text1"/>
         </w:rPr>
-        <w:t>Digital</w:t>
-      </w:r>
-      <w:r>
-        <w:rPr>
-          <w:rFonts w:ascii="Aptos" w:eastAsia="Aptos" w:hAnsi="Aptos" w:cs="Aptos"/>
-          <w:i/>
-          <w:iCs/>
-          <w:color w:val="000000" w:themeColor="text1"/>
-        </w:rPr>
-        <w:t xml:space="preserve"> </w:t>
-      </w:r>
-      <w:r>
-        <w:rPr>
-          <w:rFonts w:ascii="Aptos" w:eastAsia="Aptos" w:hAnsi="Aptos" w:cs="Aptos"/>
-          <w:i/>
-          <w:iCs/>
-          <w:color w:val="000000" w:themeColor="text1"/>
-        </w:rPr>
-        <w:t>Marketing</w:t>
-      </w:r>
-      <w:r>
-        <w:rPr>
-          <w:rFonts w:ascii="Aptos" w:eastAsia="Aptos" w:hAnsi="Aptos" w:cs="Aptos"/>
-          <w:i/>
-          <w:iCs/>
-          <w:color w:val="000000" w:themeColor="text1"/>
-        </w:rPr>
-        <w:t xml:space="preserve"> </w:t>
-      </w:r>
-      <w:r>
-        <w:rPr>
-          <w:rFonts w:ascii="Aptos" w:eastAsia="Aptos" w:hAnsi="Aptos" w:cs="Aptos"/>
-          <w:i/>
-          <w:iCs/>
-          <w:color w:val="000000" w:themeColor="text1"/>
-        </w:rPr>
-        <w:t>Centre</w:t>
-      </w:r>
-      <w:r>
-        <w:rPr>
-          <w:rFonts w:ascii="Aptos" w:eastAsia="Aptos" w:hAnsi="Aptos" w:cs="Aptos"/>
-          <w:i/>
-          <w:iCs/>
-          <w:color w:val="000000" w:themeColor="text1"/>
-        </w:rPr>
-        <w:t xml:space="preserve"> </w:t>
-      </w:r>
-      <w:r>
-        <w:rPr>
-          <w:rFonts w:ascii="Aptos" w:eastAsia="Aptos" w:hAnsi="Aptos" w:cs="Aptos"/>
-          <w:i/>
-          <w:iCs/>
-          <w:color w:val="000000" w:themeColor="text1"/>
-        </w:rPr>
-        <w:t>of</w:t>
-      </w:r>
-      <w:r>
-        <w:rPr>
-          <w:rFonts w:ascii="Aptos" w:eastAsia="Aptos" w:hAnsi="Aptos" w:cs="Aptos"/>
-          <w:i/>
-          <w:iCs/>
-          <w:color w:val="000000" w:themeColor="text1"/>
-        </w:rPr>
-        <w:t xml:space="preserve"> </w:t>
-      </w:r>
-      <w:r>
-        <w:rPr>
-          <w:rFonts w:ascii="Aptos" w:eastAsia="Aptos" w:hAnsi="Aptos" w:cs="Aptos"/>
-          <w:i/>
-          <w:iCs/>
-          <w:color w:val="000000" w:themeColor="text1"/>
-        </w:rPr>
-        <w:t>Excellence</w:t>
-      </w:r>
-      <w:r>
-        <w:rPr>
-          <w:rFonts w:ascii="Aptos" w:eastAsia="Aptos" w:hAnsi="Aptos" w:cs="Aptos"/>
-          <w:i/>
-          <w:iCs/>
-          <w:color w:val="000000" w:themeColor="text1"/>
-        </w:rPr>
-        <w:t xml:space="preserve"> </w:t>
-      </w:r>
-      <w:r>
-        <w:rPr>
-          <w:rFonts w:ascii="Aptos" w:eastAsia="Aptos" w:hAnsi="Aptos" w:cs="Aptos"/>
-          <w:i/>
-          <w:iCs/>
-          <w:color w:val="000000" w:themeColor="text1"/>
-        </w:rPr>
-        <w:t>Graduate</w:t>
-      </w:r>
-      <w:r>
-        <w:rPr>
-          <w:rFonts w:ascii="Aptos" w:eastAsia="Aptos" w:hAnsi="Aptos" w:cs="Aptos"/>
-          <w:i/>
-          <w:iCs/>
-          <w:color w:val="000000" w:themeColor="text1"/>
-        </w:rPr>
-        <w:t xml:space="preserve"> </w:t>
-      </w:r>
-      <w:r>
-        <w:rPr>
-          <w:rFonts w:ascii="Aptos" w:eastAsia="Aptos" w:hAnsi="Aptos" w:cs="Aptos"/>
-          <w:i/>
-          <w:iCs/>
-          <w:color w:val="000000" w:themeColor="text1"/>
-        </w:rPr>
-        <w:t>Handbook</w:t>
-      </w:r>
-      <w:r>
-        <w:rPr>
-          <w:rFonts w:ascii="Aptos" w:eastAsia="Aptos" w:hAnsi="Aptos" w:cs="Aptos"/>
-          <w:i/>
-          <w:iCs/>
-          <w:color w:val="000000" w:themeColor="text1"/>
-        </w:rPr>
-        <w:t xml:space="preserve">. </w:t>
-      </w:r>
-      <w:r>
-        <w:rPr>
-          <w:rFonts w:ascii="Aptos" w:eastAsia="Aptos" w:hAnsi="Aptos" w:cs="Aptos"/>
-          <w:color w:val="000000" w:themeColor="text1"/>
-        </w:rPr>
-        <w:t>ApsisVR.</w:t>
+        <w:t xml:space="preserve">Digital Marketing Centre of Excellence Graduate Handbook. </w:t>
+      </w:r>
+      <w:proofErr w:type="spellStart"/>
+      <w:r>
+        <w:rPr>
+          <w:rFonts w:ascii="Aptos" w:eastAsia="Aptos" w:hAnsi="Aptos" w:cs="Aptos"/>
+          <w:color w:val="000000" w:themeColor="text1"/>
+        </w:rPr>
+        <w:t>ViriVR</w:t>
+      </w:r>
+      <w:proofErr w:type="spellEnd"/>
+      <w:r>
+        <w:rPr>
+          <w:rFonts w:ascii="Aptos" w:eastAsia="Aptos" w:hAnsi="Aptos" w:cs="Aptos"/>
+          <w:color w:val="000000" w:themeColor="text1"/>
+        </w:rPr>
+        <w:t>.</w:t>
       </w:r>
     </w:p>
     <w:p>
@@ -3100,14 +4344,7 @@
           <w:rFonts w:ascii="Aptos" w:eastAsia="Aptos" w:hAnsi="Aptos" w:cs="Aptos"/>
           <w:color w:val="000000" w:themeColor="text1"/>
         </w:rPr>
-        <w:t>Source:</w:t>
-      </w:r>
-      <w:r>
-        <w:rPr>
-          <w:rFonts w:ascii="Aptos" w:eastAsia="Aptos" w:hAnsi="Aptos" w:cs="Aptos"/>
-          <w:color w:val="000000" w:themeColor="text1"/>
-        </w:rPr>
-        <w:t xml:space="preserve"> </w:t>
+        <w:t xml:space="preserve">Source: </w:t>
       </w:r>
       <w:hyperlink r:id="rId8">
         <w:r>
@@ -3155,6 +4392,10 @@
           <w:numId w:val="3"/>
         </w:numPr>
         <w:spacing w:after="0"/>
+        <w:rPr>
+          <w:rFonts w:ascii="Aptos" w:eastAsia="Aptos" w:hAnsi="Aptos" w:cs="Aptos"/>
+          <w:color w:val="000000" w:themeColor="text1"/>
+        </w:rPr>
       </w:pPr>
       <w:r>
         <w:rPr>
@@ -3181,6 +4422,92 @@
     </w:p>
     <w:p>
       <w:pPr>
+        <w:pStyle w:val="ListParagraph"/>
+        <w:numPr>
+          <w:ilvl w:val="0"/>
+          <w:numId w:val="3"/>
+        </w:numPr>
+        <w:spacing w:after="0"/>
+        <w:rPr>
+          <w:rFonts w:ascii="Aptos" w:eastAsia="Aptos" w:hAnsi="Aptos" w:cs="Aptos"/>
+          <w:color w:val="000000" w:themeColor="text1"/>
+        </w:rPr>
+      </w:pPr>
+      <w:hyperlink r:id="rId11">
+        <w:r>
+          <w:rPr>
+            <w:rStyle w:val="Hyperlink"/>
+          </w:rPr>
+          <w:t>https://www.kopp-online-marketing.com/digital-authority-management</w:t>
+        </w:r>
+      </w:hyperlink>
+    </w:p>
+    <w:p>
+      <w:pPr>
+        <w:pStyle w:val="ListParagraph"/>
+        <w:numPr>
+          <w:ilvl w:val="0"/>
+          <w:numId w:val="3"/>
+        </w:numPr>
+        <w:spacing w:after="0"/>
+      </w:pPr>
+      <w:r>
+        <w:rPr>
+          <w:rFonts w:ascii="Calibri" w:eastAsia="Calibri" w:hAnsi="Calibri" w:cs="Calibri"/>
+        </w:rPr>
+        <w:t xml:space="preserve">Schuhmann, A. (2026). </w:t>
+      </w:r>
+      <w:r>
+        <w:rPr>
+          <w:rFonts w:ascii="Calibri" w:eastAsia="Calibri" w:hAnsi="Calibri" w:cs="Calibri"/>
+          <w:i/>
+          <w:iCs/>
+        </w:rPr>
+        <w:t>AI agent workflows: a complete guide for developers</w:t>
+      </w:r>
+      <w:r>
+        <w:rPr>
+          <w:rFonts w:ascii="Calibri" w:eastAsia="Calibri" w:hAnsi="Calibri" w:cs="Calibri"/>
+        </w:rPr>
+        <w:t xml:space="preserve">. [online] Mastra.ai. Available at: </w:t>
+      </w:r>
+      <w:hyperlink r:id="rId12">
+        <w:r>
+          <w:rPr>
+            <w:rStyle w:val="Hyperlink"/>
+          </w:rPr>
+          <w:t>https://mastra.ai/articles/ai-agent-workflows</w:t>
+        </w:r>
+      </w:hyperlink>
+      <w:r>
+        <w:rPr>
+          <w:rFonts w:ascii="Calibri" w:eastAsia="Calibri" w:hAnsi="Calibri" w:cs="Calibri"/>
+        </w:rPr>
+        <w:t xml:space="preserve"> [Accessed 8 Sept. 2026].</w:t>
+      </w:r>
+    </w:p>
+    <w:p>
+      <w:pPr>
+        <w:pStyle w:val="ListParagraph"/>
+        <w:spacing w:after="0"/>
+        <w:rPr>
+          <w:rFonts w:ascii="Aptos" w:eastAsia="Aptos" w:hAnsi="Aptos" w:cs="Aptos"/>
+          <w:color w:val="000000" w:themeColor="text1"/>
+        </w:rPr>
+      </w:pPr>
+    </w:p>
+    <w:p>
+      <w:pPr>
+        <w:pStyle w:val="ListParagraph"/>
+        <w:spacing w:after="0"/>
+        <w:rPr>
+          <w:rFonts w:ascii="Aptos" w:eastAsia="Aptos" w:hAnsi="Aptos" w:cs="Aptos"/>
+          <w:color w:val="000000" w:themeColor="text1"/>
+        </w:rPr>
+      </w:pPr>
+    </w:p>
+    <w:p>
+      <w:pPr>
         <w:rPr>
           <w:rFonts w:ascii="Aptos" w:eastAsia="Aptos" w:hAnsi="Aptos" w:cs="Aptos"/>
           <w:color w:val="000000" w:themeColor="text1"/>
@@ -3239,15 +4566,7 @@
           <w:bCs/>
         </w:rPr>
         <w:lastRenderedPageBreak/>
-        <w:t>9</w:t>
-      </w:r>
-      <w:r>
-        <w:rPr>
-          <w:rFonts w:ascii="Aptos" w:eastAsia="Aptos" w:hAnsi="Aptos" w:cs="Aptos"/>
-          <w:b/>
-          <w:bCs/>
-        </w:rPr>
-        <w:t>. Questions / Assumptions</w:t>
+        <w:t>9. Questions / Assumptions</w:t>
       </w:r>
     </w:p>
     <w:p>
@@ -3347,54 +4666,23 @@
         </w:rPr>
       </w:pPr>
     </w:p>
-    <w:p>
-      <w:pPr>
-        <w:rPr>
-          <w:rFonts w:ascii="Aptos" w:eastAsia="Aptos" w:hAnsi="Aptos" w:cs="Aptos"/>
-          <w:color w:val="000000" w:themeColor="text1"/>
-        </w:rPr>
-      </w:pPr>
-    </w:p>
-    <w:p>
-      <w:pPr>
-        <w:rPr>
-          <w:rFonts w:ascii="Aptos" w:eastAsia="Aptos" w:hAnsi="Aptos" w:cs="Aptos"/>
-          <w:color w:val="000000" w:themeColor="text1"/>
-        </w:rPr>
-      </w:pPr>
-    </w:p>
-    <w:p>
-      <w:pPr>
-        <w:rPr>
-          <w:rFonts w:ascii="Aptos" w:eastAsia="Aptos" w:hAnsi="Aptos" w:cs="Aptos"/>
-          <w:color w:val="000000" w:themeColor="text1"/>
-        </w:rPr>
-      </w:pPr>
-    </w:p>
-    <w:p>
-      <w:pPr>
-        <w:rPr>
-          <w:rFonts w:ascii="Aptos" w:eastAsia="Aptos" w:hAnsi="Aptos" w:cs="Aptos"/>
-          <w:color w:val="000000" w:themeColor="text1"/>
-        </w:rPr>
-      </w:pPr>
-    </w:p>
-    <w:p>
-      <w:pPr>
-        <w:rPr>
-          <w:rFonts w:ascii="Aptos" w:eastAsia="Aptos" w:hAnsi="Aptos" w:cs="Aptos"/>
-          <w:color w:val="000000" w:themeColor="text1"/>
-        </w:rPr>
-      </w:pPr>
-    </w:p>
-    <w:p>
-      <w:pPr>
-        <w:rPr>
-          <w:rFonts w:ascii="Aptos" w:eastAsia="Aptos" w:hAnsi="Aptos" w:cs="Aptos"/>
-          <w:color w:val="000000" w:themeColor="text1"/>
-        </w:rPr>
-      </w:pPr>
-    </w:p>
+    <w:p/>
+    <w:p/>
+    <w:p/>
+    <w:p/>
+    <w:p/>
+    <w:p/>
+    <w:p/>
+    <w:p/>
+    <w:p/>
+    <w:p/>
+    <w:p/>
+    <w:p/>
+    <w:p/>
+    <w:p/>
+    <w:p/>
+    <w:p/>
+    <w:p/>
     <w:p>
       <w:pPr>
         <w:pStyle w:val="Heading3"/>
@@ -3414,8 +4702,16 @@
       <w:pPr>
         <w:keepNext/>
         <w:keepLines/>
-      </w:pPr>
-      <w:r>
+        <w:rPr>
+          <w:b/>
+          <w:bCs/>
+        </w:rPr>
+      </w:pPr>
+      <w:r>
+        <w:rPr>
+          <w:b/>
+          <w:bCs/>
+        </w:rPr>
         <w:t>Updated on 30/8/2026</w:t>
       </w:r>
     </w:p>
@@ -3453,9 +4749,6 @@
       <w:r>
         <w:t>3. Changed questions and assumptions for Ajith (Page 9)</w:t>
       </w:r>
-      <w:r>
-        <w:br/>
-      </w:r>
     </w:p>
     <w:p>
       <w:pPr>
@@ -3479,15 +4772,14 @@
         <w:keepLines/>
       </w:pPr>
       <w:r>
-        <w:t xml:space="preserve">- </w:t>
-      </w:r>
-      <w:proofErr w:type="gramStart"/>
-      <w:r>
-        <w:t>All of</w:t>
-      </w:r>
-      <w:proofErr w:type="gramEnd"/>
-      <w:r>
-        <w:t xml:space="preserve"> the ones listed in the questions and assumptions for the client, Ajith.</w:t>
+        <w:rPr>
+          <w:b/>
+          <w:bCs/>
+        </w:rPr>
+        <w:t>-</w:t>
+      </w:r>
+      <w:r>
+        <w:t>Threshold for escalation, what would minor, major or critical be defined as?</w:t>
       </w:r>
     </w:p>
     <w:p>
@@ -3495,43 +4787,103 @@
         <w:keepNext/>
         <w:keepLines/>
       </w:pPr>
-      <w:r>
-        <w:t xml:space="preserve">- Create a distinction between </w:t>
-      </w:r>
-      <w:r>
-        <w:rPr>
-          <w:b/>
-          <w:bCs/>
-        </w:rPr>
-        <w:t xml:space="preserve">operational correction </w:t>
-      </w:r>
-      <w:r>
-        <w:t xml:space="preserve">and </w:t>
-      </w:r>
-      <w:r>
-        <w:rPr>
-          <w:b/>
-          <w:bCs/>
-        </w:rPr>
-        <w:t>material workflow change</w:t>
-      </w:r>
     </w:p>
     <w:p>
       <w:pPr>
         <w:keepNext/>
         <w:keepLines/>
-      </w:pPr>
-      <w:r>
-        <w:rPr>
-          <w:b/>
-          <w:bCs/>
-        </w:rPr>
-        <w:t>-</w:t>
-      </w:r>
-      <w:r>
-        <w:t>Threshold for escalation, what would minor, major or critical be defined as?</w:t>
-      </w:r>
-    </w:p>
+        <w:rPr>
+          <w:b/>
+          <w:bCs/>
+        </w:rPr>
+      </w:pPr>
+      <w:r>
+        <w:rPr>
+          <w:b/>
+          <w:bCs/>
+        </w:rPr>
+        <w:t>Update on 9/9/2026</w:t>
+      </w:r>
+    </w:p>
+    <w:p>
+      <w:pPr>
+        <w:pStyle w:val="ListParagraph"/>
+        <w:keepNext/>
+        <w:keepLines/>
+        <w:numPr>
+          <w:ilvl w:val="0"/>
+          <w:numId w:val="5"/>
+        </w:numPr>
+      </w:pPr>
+      <w:r>
+        <w:t>Added top 3 skills</w:t>
+      </w:r>
+    </w:p>
+    <w:p>
+      <w:pPr>
+        <w:pStyle w:val="ListParagraph"/>
+        <w:keepNext/>
+        <w:keepLines/>
+        <w:numPr>
+          <w:ilvl w:val="0"/>
+          <w:numId w:val="5"/>
+        </w:numPr>
+      </w:pPr>
+      <w:r>
+        <w:t>Added top 3 workflows</w:t>
+      </w:r>
+    </w:p>
+    <w:p>
+      <w:pPr>
+        <w:pStyle w:val="ListParagraph"/>
+        <w:keepNext/>
+        <w:keepLines/>
+        <w:numPr>
+          <w:ilvl w:val="0"/>
+          <w:numId w:val="5"/>
+        </w:numPr>
+      </w:pPr>
+      <w:r>
+        <w:t>Authority Manager Inputs and Outputs</w:t>
+      </w:r>
+    </w:p>
+    <w:p>
+      <w:pPr>
+        <w:pStyle w:val="ListParagraph"/>
+        <w:keepNext/>
+        <w:keepLines/>
+        <w:numPr>
+          <w:ilvl w:val="0"/>
+          <w:numId w:val="5"/>
+        </w:numPr>
+      </w:pPr>
+      <w:r>
+        <w:t>Preliminary t</w:t>
+      </w:r>
+      <w:r>
+        <w:t>esting and revision of skills and workflows</w:t>
+      </w:r>
+    </w:p>
+    <w:p>
+      <w:pPr>
+        <w:keepNext/>
+        <w:keepLines/>
+      </w:pPr>
+    </w:p>
+    <w:p>
+      <w:pPr>
+        <w:keepNext/>
+        <w:keepLines/>
+        <w:rPr>
+          <w:b/>
+          <w:bCs/>
+        </w:rPr>
+      </w:pPr>
+    </w:p>
+    <w:p/>
+    <w:p/>
+    <w:p/>
+    <w:p/>
     <w:p/>
     <w:sectPr>
       <w:pgSz w:w="12240" w:h="15840"/>
@@ -3671,6 +5023,92 @@
     </w:lvl>
   </w:abstractNum>
   <w:abstractNum w:abstractNumId="1" w15:restartNumberingAfterBreak="0">
+    <w:nsid w:val="2659836D"/>
+    <w:multiLevelType w:val="hybridMultilevel"/>
+    <w:tmpl w:val="068C8990"/>
+    <w:lvl w:ilvl="0" w:tplc="BEB83DE4">
+      <w:start w:val="1"/>
+      <w:numFmt w:val="decimal"/>
+      <w:lvlText w:val="%1."/>
+      <w:lvlJc w:val="left"/>
+      <w:pPr>
+        <w:ind w:left="720" w:hanging="360"/>
+      </w:pPr>
+    </w:lvl>
+    <w:lvl w:ilvl="1" w:tplc="BE1CF108">
+      <w:start w:val="1"/>
+      <w:numFmt w:val="lowerLetter"/>
+      <w:lvlText w:val="%2."/>
+      <w:lvlJc w:val="left"/>
+      <w:pPr>
+        <w:ind w:left="1440" w:hanging="360"/>
+      </w:pPr>
+    </w:lvl>
+    <w:lvl w:ilvl="2" w:tplc="429E1968">
+      <w:start w:val="1"/>
+      <w:numFmt w:val="lowerRoman"/>
+      <w:lvlText w:val="%3."/>
+      <w:lvlJc w:val="right"/>
+      <w:pPr>
+        <w:ind w:left="2160" w:hanging="180"/>
+      </w:pPr>
+    </w:lvl>
+    <w:lvl w:ilvl="3" w:tplc="ECCC16F2">
+      <w:start w:val="1"/>
+      <w:numFmt w:val="decimal"/>
+      <w:lvlText w:val="%4."/>
+      <w:lvlJc w:val="left"/>
+      <w:pPr>
+        <w:ind w:left="2880" w:hanging="360"/>
+      </w:pPr>
+    </w:lvl>
+    <w:lvl w:ilvl="4" w:tplc="8E943074">
+      <w:start w:val="1"/>
+      <w:numFmt w:val="lowerLetter"/>
+      <w:lvlText w:val="%5."/>
+      <w:lvlJc w:val="left"/>
+      <w:pPr>
+        <w:ind w:left="3600" w:hanging="360"/>
+      </w:pPr>
+    </w:lvl>
+    <w:lvl w:ilvl="5" w:tplc="2B909C5A">
+      <w:start w:val="1"/>
+      <w:numFmt w:val="lowerRoman"/>
+      <w:lvlText w:val="%6."/>
+      <w:lvlJc w:val="right"/>
+      <w:pPr>
+        <w:ind w:left="4320" w:hanging="180"/>
+      </w:pPr>
+    </w:lvl>
+    <w:lvl w:ilvl="6" w:tplc="97BA3AE8">
+      <w:start w:val="1"/>
+      <w:numFmt w:val="decimal"/>
+      <w:lvlText w:val="%7."/>
+      <w:lvlJc w:val="left"/>
+      <w:pPr>
+        <w:ind w:left="5040" w:hanging="360"/>
+      </w:pPr>
+    </w:lvl>
+    <w:lvl w:ilvl="7" w:tplc="4EBE3232">
+      <w:start w:val="1"/>
+      <w:numFmt w:val="lowerLetter"/>
+      <w:lvlText w:val="%8."/>
+      <w:lvlJc w:val="left"/>
+      <w:pPr>
+        <w:ind w:left="5760" w:hanging="360"/>
+      </w:pPr>
+    </w:lvl>
+    <w:lvl w:ilvl="8" w:tplc="2A94B95C">
+      <w:start w:val="1"/>
+      <w:numFmt w:val="lowerRoman"/>
+      <w:lvlText w:val="%9."/>
+      <w:lvlJc w:val="right"/>
+      <w:pPr>
+        <w:ind w:left="6480" w:hanging="180"/>
+      </w:pPr>
+    </w:lvl>
+  </w:abstractNum>
+  <w:abstractNum w:abstractNumId="2" w15:restartNumberingAfterBreak="0">
     <w:nsid w:val="2CCABB48"/>
     <w:multiLevelType w:val="hybridMultilevel"/>
     <w:tmpl w:val="71487766"/>
@@ -3783,7 +5221,7 @@
       </w:rPr>
     </w:lvl>
   </w:abstractNum>
-  <w:abstractNum w:abstractNumId="2" w15:restartNumberingAfterBreak="0">
+  <w:abstractNum w:abstractNumId="3" w15:restartNumberingAfterBreak="0">
     <w:nsid w:val="65EBFF9A"/>
     <w:multiLevelType w:val="hybridMultilevel"/>
     <w:tmpl w:val="3834A832"/>
@@ -3896,7 +5334,7 @@
       </w:rPr>
     </w:lvl>
   </w:abstractNum>
-  <w:abstractNum w:abstractNumId="3" w15:restartNumberingAfterBreak="0">
+  <w:abstractNum w:abstractNumId="4" w15:restartNumberingAfterBreak="0">
     <w:nsid w:val="70EBAC33"/>
     <w:multiLevelType w:val="hybridMultilevel"/>
     <w:tmpl w:val="307A0354"/>
@@ -4010,16 +5448,19 @@
     </w:lvl>
   </w:abstractNum>
   <w:num w:numId="1" w16cid:durableId="387992325">
-    <w:abstractNumId w:val="1"/>
+    <w:abstractNumId w:val="2"/>
   </w:num>
   <w:num w:numId="2" w16cid:durableId="1987390204">
-    <w:abstractNumId w:val="2"/>
+    <w:abstractNumId w:val="3"/>
   </w:num>
   <w:num w:numId="3" w16cid:durableId="947082334">
-    <w:abstractNumId w:val="3"/>
+    <w:abstractNumId w:val="4"/>
   </w:num>
   <w:num w:numId="4" w16cid:durableId="1145971357">
     <w:abstractNumId w:val="0"/>
+  </w:num>
+  <w:num w:numId="5" w16cid:durableId="659650871">
+    <w:abstractNumId w:val="1"/>
   </w:num>
 </w:numbering>
 </file>
@@ -4427,6 +5868,7 @@
     <w:name w:val="heading 1"/>
     <w:basedOn w:val="Normal"/>
     <w:next w:val="Normal"/>
+    <w:link w:val="Heading1Char"/>
     <w:uiPriority w:val="9"/>
     <w:qFormat/>
     <w:rsid w:val="61B9A987"/>
@@ -4447,6 +5889,7 @@
     <w:name w:val="heading 2"/>
     <w:basedOn w:val="Normal"/>
     <w:next w:val="Normal"/>
+    <w:link w:val="Heading2Char"/>
     <w:uiPriority w:val="9"/>
     <w:unhideWhenUsed/>
     <w:qFormat/>
@@ -4468,6 +5911,7 @@
     <w:name w:val="heading 3"/>
     <w:basedOn w:val="Normal"/>
     <w:next w:val="Normal"/>
+    <w:link w:val="Heading3Char"/>
     <w:uiPriority w:val="9"/>
     <w:unhideWhenUsed/>
     <w:qFormat/>
@@ -4551,6 +5995,45 @@
     <w:rPr>
       <w:color w:val="467886"/>
       <w:u w:val="single"/>
+    </w:rPr>
+  </w:style>
+  <w:style w:type="character" w:customStyle="1" w:styleId="Heading1Char">
+    <w:name w:val="Heading 1 Char"/>
+    <w:basedOn w:val="DefaultParagraphFont"/>
+    <w:link w:val="Heading1"/>
+    <w:uiPriority w:val="9"/>
+    <w:rsid w:val="009119D6"/>
+    <w:rPr>
+      <w:rFonts w:asciiTheme="majorHAnsi" w:eastAsiaTheme="majorEastAsia" w:hAnsiTheme="majorHAnsi" w:cstheme="majorBidi"/>
+      <w:color w:val="0F4761" w:themeColor="accent1" w:themeShade="BF"/>
+      <w:sz w:val="40"/>
+      <w:szCs w:val="40"/>
+    </w:rPr>
+  </w:style>
+  <w:style w:type="character" w:customStyle="1" w:styleId="Heading2Char">
+    <w:name w:val="Heading 2 Char"/>
+    <w:basedOn w:val="DefaultParagraphFont"/>
+    <w:link w:val="Heading2"/>
+    <w:uiPriority w:val="9"/>
+    <w:rsid w:val="009119D6"/>
+    <w:rPr>
+      <w:rFonts w:asciiTheme="majorHAnsi" w:eastAsiaTheme="majorEastAsia" w:hAnsiTheme="majorHAnsi" w:cstheme="majorBidi"/>
+      <w:color w:val="0F4761" w:themeColor="accent1" w:themeShade="BF"/>
+      <w:sz w:val="32"/>
+      <w:szCs w:val="32"/>
+    </w:rPr>
+  </w:style>
+  <w:style w:type="character" w:customStyle="1" w:styleId="Heading3Char">
+    <w:name w:val="Heading 3 Char"/>
+    <w:basedOn w:val="DefaultParagraphFont"/>
+    <w:link w:val="Heading3"/>
+    <w:uiPriority w:val="9"/>
+    <w:rsid w:val="009119D6"/>
+    <w:rPr>
+      <w:rFonts w:eastAsiaTheme="majorEastAsia" w:cstheme="majorBidi"/>
+      <w:color w:val="0F4761" w:themeColor="accent1" w:themeShade="BF"/>
+      <w:sz w:val="28"/>
+      <w:szCs w:val="28"/>
     </w:rPr>
   </w:style>
 </w:styles>
@@ -4818,18 +6301,18 @@
 </file>
 
 <file path=customXml/item1.xml><?xml version="1.0" encoding="utf-8"?>
-<p:properties xmlns:p="http://schemas.microsoft.com/office/2006/metadata/properties" xmlns:xsi="http://www.w3.org/2001/XMLSchema-instance" xmlns:pc="http://schemas.microsoft.com/office/infopath/2007/PartnerControls">
-  <documentManagement/>
-</p:properties>
-</file>
-
-<file path=customXml/item2.xml><?xml version="1.0" encoding="utf-8"?>
 <?mso-contentType ?>
 <FormTemplates xmlns="http://schemas.microsoft.com/sharepoint/v3/contenttype/forms">
   <Display>DocumentLibraryForm</Display>
   <Edit>DocumentLibraryForm</Edit>
   <New>DocumentLibraryForm</New>
 </FormTemplates>
+</file>
+
+<file path=customXml/item2.xml><?xml version="1.0" encoding="utf-8"?>
+<p:properties xmlns:p="http://schemas.microsoft.com/office/2006/metadata/properties" xmlns:xsi="http://www.w3.org/2001/XMLSchema-instance" xmlns:pc="http://schemas.microsoft.com/office/infopath/2007/PartnerControls">
+  <documentManagement/>
+</p:properties>
 </file>
 
 <file path=customXml/item3.xml><?xml version="1.0" encoding="utf-8"?>
@@ -4995,18 +6478,18 @@
 </file>
 
 <file path=customXml/itemProps1.xml><?xml version="1.0" encoding="utf-8"?>
-<ds:datastoreItem xmlns:ds="http://schemas.openxmlformats.org/officeDocument/2006/customXml" ds:itemID="{C2BDD9E7-F7A9-435B-BDC0-31F82AEEBD6D}">
+<ds:datastoreItem xmlns:ds="http://schemas.openxmlformats.org/officeDocument/2006/customXml" ds:itemID="{AEFB4E47-FC17-4A16-B0E3-32CC31B513A4}">
   <ds:schemaRefs>
-    <ds:schemaRef ds:uri="http://schemas.microsoft.com/office/2006/metadata/properties"/>
-    <ds:schemaRef ds:uri="http://schemas.microsoft.com/office/infopath/2007/PartnerControls"/>
+    <ds:schemaRef ds:uri="http://schemas.microsoft.com/sharepoint/v3/contenttype/forms"/>
   </ds:schemaRefs>
 </ds:datastoreItem>
 </file>
 
 <file path=customXml/itemProps2.xml><?xml version="1.0" encoding="utf-8"?>
-<ds:datastoreItem xmlns:ds="http://schemas.openxmlformats.org/officeDocument/2006/customXml" ds:itemID="{AEFB4E47-FC17-4A16-B0E3-32CC31B513A4}">
+<ds:datastoreItem xmlns:ds="http://schemas.openxmlformats.org/officeDocument/2006/customXml" ds:itemID="{C2BDD9E7-F7A9-435B-BDC0-31F82AEEBD6D}">
   <ds:schemaRefs>
-    <ds:schemaRef ds:uri="http://schemas.microsoft.com/sharepoint/v3/contenttype/forms"/>
+    <ds:schemaRef ds:uri="http://schemas.microsoft.com/office/2006/metadata/properties"/>
+    <ds:schemaRef ds:uri="http://schemas.microsoft.com/office/infopath/2007/PartnerControls"/>
   </ds:schemaRefs>
 </ds:datastoreItem>
 </file>

</xml_diff>